<commit_message>
m-à-j du fichier présentation
</commit_message>
<xml_diff>
--- a/Projet_TAHIENDRAZA Ravilimita  Zidane/Présentation Word.docx
+++ b/Projet_TAHIENDRAZA Ravilimita  Zidane/Présentation Word.docx
@@ -1,10 +1,2564 @@
 
 <file path=word/document.xml><?xml version="1.0" encoding="utf-8"?>
-<w:document xmlns:wpc="http://schemas.microsoft.com/office/word/2010/wordprocessingCanvas" xmlns:cx="http://schemas.microsoft.com/office/drawing/2014/chartex" xmlns:mc="http://schemas.openxmlformats.org/markup-compatibility/2006" xmlns:o="urn:schemas-microsoft-com:office:office" xmlns:r="http://schemas.openxmlformats.org/officeDocument/2006/relationships" xmlns:m="http://schemas.openxmlformats.org/officeDocument/2006/math" xmlns:v="urn:schemas-microsoft-com:vml" xmlns:wp14="http://schemas.microsoft.com/office/word/2010/wordprocessingDrawing" xmlns:wp="http://schemas.openxmlformats.org/drawingml/2006/wordprocessingDrawing" xmlns:w10="urn:schemas-microsoft-com:office:word" xmlns:w="http://schemas.openxmlformats.org/wordprocessingml/2006/main" xmlns:w14="http://schemas.microsoft.com/office/word/2010/wordml" xmlns:w15="http://schemas.microsoft.com/office/word/2012/wordml" xmlns:w16se="http://schemas.microsoft.com/office/word/2015/wordml/symex" xmlns:wpg="http://schemas.microsoft.com/office/word/2010/wordprocessingGroup" xmlns:wpi="http://schemas.microsoft.com/office/word/2010/wordprocessingInk" xmlns:wne="http://schemas.microsoft.com/office/word/2006/wordml" xmlns:wps="http://schemas.microsoft.com/office/word/2010/wordprocessingShape" mc:Ignorable="w14 w15 w16se wp14">
+<w:document xmlns:wpc="http://schemas.microsoft.com/office/word/2010/wordprocessingCanvas" xmlns:cx="http://schemas.microsoft.com/office/drawing/2014/chartex" xmlns:cx1="http://schemas.microsoft.com/office/drawing/2015/9/8/chartex" xmlns:cx2="http://schemas.microsoft.com/office/drawing/2015/10/21/chartex" xmlns:cx3="http://schemas.microsoft.com/office/drawing/2016/5/9/chartex" xmlns:cx4="http://schemas.microsoft.com/office/drawing/2016/5/10/chartex" xmlns:cx5="http://schemas.microsoft.com/office/drawing/2016/5/11/chartex" xmlns:cx6="http://schemas.microsoft.com/office/drawing/2016/5/12/chartex" xmlns:cx7="http://schemas.microsoft.com/office/drawing/2016/5/13/chartex" xmlns:cx8="http://schemas.microsoft.com/office/drawing/2016/5/14/chartex" xmlns:mc="http://schemas.openxmlformats.org/markup-compatibility/2006" xmlns:aink="http://schemas.microsoft.com/office/drawing/2016/ink" xmlns:am3d="http://schemas.microsoft.com/office/drawing/2017/model3d" xmlns:o="urn:schemas-microsoft-com:office:office" xmlns:r="http://schemas.openxmlformats.org/officeDocument/2006/relationships" xmlns:m="http://schemas.openxmlformats.org/officeDocument/2006/math" xmlns:v="urn:schemas-microsoft-com:vml" xmlns:wp14="http://schemas.microsoft.com/office/word/2010/wordprocessingDrawing" xmlns:wp="http://schemas.openxmlformats.org/drawingml/2006/wordprocessingDrawing" xmlns:w10="urn:schemas-microsoft-com:office:word" xmlns:w="http://schemas.openxmlformats.org/wordprocessingml/2006/main" xmlns:w14="http://schemas.microsoft.com/office/word/2010/wordml" xmlns:w15="http://schemas.microsoft.com/office/word/2012/wordml" xmlns:w16cid="http://schemas.microsoft.com/office/word/2016/wordml/cid" xmlns:w16se="http://schemas.microsoft.com/office/word/2015/wordml/symex" xmlns:wpg="http://schemas.microsoft.com/office/word/2010/wordprocessingGroup" xmlns:wpi="http://schemas.microsoft.com/office/word/2010/wordprocessingInk" xmlns:wne="http://schemas.microsoft.com/office/word/2006/wordml" xmlns:wps="http://schemas.microsoft.com/office/word/2010/wordprocessingShape" mc:Ignorable="w14 w15 w16se w16cid wp14">
   <w:body>
     <w:p>
+      <w:pPr>
+        <w:tabs>
+          <w:tab w:val="left" w:pos="1220"/>
+        </w:tabs>
+        <w:spacing w:after="150" w:line="240" w:lineRule="auto"/>
+        <w:ind w:right="288"/>
+      </w:pPr>
+      <w:r>
+        <w:rPr>
+          <w:b/>
+          <w:noProof/>
+        </w:rPr>
+        <w:drawing>
+          <wp:anchor distT="0" distB="0" distL="114300" distR="114300" simplePos="0" relativeHeight="251660288" behindDoc="1" locked="0" layoutInCell="1" allowOverlap="0" wp14:anchorId="48DE3409" wp14:editId="0F7F11F1">
+            <wp:simplePos x="0" y="0"/>
+            <wp:positionH relativeFrom="column">
+              <wp:posOffset>4508938</wp:posOffset>
+            </wp:positionH>
+            <wp:positionV relativeFrom="paragraph">
+              <wp:posOffset>173990</wp:posOffset>
+            </wp:positionV>
+            <wp:extent cx="1041400" cy="419100"/>
+            <wp:effectExtent l="0" t="0" r="6350" b="0"/>
+            <wp:wrapNone/>
+            <wp:docPr id="85" name="Picture 85"/>
+            <wp:cNvGraphicFramePr/>
+            <a:graphic xmlns:a="http://schemas.openxmlformats.org/drawingml/2006/main">
+              <a:graphicData uri="http://schemas.openxmlformats.org/drawingml/2006/picture">
+                <pic:pic xmlns:pic="http://schemas.openxmlformats.org/drawingml/2006/picture">
+                  <pic:nvPicPr>
+                    <pic:cNvPr id="85" name="Picture 85"/>
+                    <pic:cNvPicPr/>
+                  </pic:nvPicPr>
+                  <pic:blipFill>
+                    <a:blip r:embed="rId4"/>
+                    <a:stretch>
+                      <a:fillRect/>
+                    </a:stretch>
+                  </pic:blipFill>
+                  <pic:spPr>
+                    <a:xfrm>
+                      <a:off x="0" y="0"/>
+                      <a:ext cx="1041400" cy="419100"/>
+                    </a:xfrm>
+                    <a:prstGeom prst="rect">
+                      <a:avLst/>
+                    </a:prstGeom>
+                  </pic:spPr>
+                </pic:pic>
+              </a:graphicData>
+            </a:graphic>
+          </wp:anchor>
+        </w:drawing>
+      </w:r>
+      <w:r>
+        <w:rPr>
+          <w:b/>
+          <w:noProof/>
+        </w:rPr>
+        <w:drawing>
+          <wp:anchor distT="0" distB="0" distL="114300" distR="114300" simplePos="0" relativeHeight="251659264" behindDoc="1" locked="0" layoutInCell="1" allowOverlap="0" wp14:anchorId="18E007C5" wp14:editId="6596D367">
+            <wp:simplePos x="0" y="0"/>
+            <wp:positionH relativeFrom="column">
+              <wp:posOffset>89177</wp:posOffset>
+            </wp:positionH>
+            <wp:positionV relativeFrom="paragraph">
+              <wp:posOffset>228273</wp:posOffset>
+            </wp:positionV>
+            <wp:extent cx="779780" cy="487680"/>
+            <wp:effectExtent l="0" t="0" r="1270" b="7620"/>
+            <wp:wrapNone/>
+            <wp:docPr id="83" name="Picture 83"/>
+            <wp:cNvGraphicFramePr/>
+            <a:graphic xmlns:a="http://schemas.openxmlformats.org/drawingml/2006/main">
+              <a:graphicData uri="http://schemas.openxmlformats.org/drawingml/2006/picture">
+                <pic:pic xmlns:pic="http://schemas.openxmlformats.org/drawingml/2006/picture">
+                  <pic:nvPicPr>
+                    <pic:cNvPr id="83" name="Picture 83"/>
+                    <pic:cNvPicPr/>
+                  </pic:nvPicPr>
+                  <pic:blipFill>
+                    <a:blip r:embed="rId5"/>
+                    <a:stretch>
+                      <a:fillRect/>
+                    </a:stretch>
+                  </pic:blipFill>
+                  <pic:spPr>
+                    <a:xfrm>
+                      <a:off x="0" y="0"/>
+                      <a:ext cx="779780" cy="487680"/>
+                    </a:xfrm>
+                    <a:prstGeom prst="rect">
+                      <a:avLst/>
+                    </a:prstGeom>
+                  </pic:spPr>
+                </pic:pic>
+              </a:graphicData>
+            </a:graphic>
+          </wp:anchor>
+        </w:drawing>
+      </w:r>
+    </w:p>
+    <w:p>
+      <w:pPr>
+        <w:spacing w:line="240" w:lineRule="auto"/>
+        <w:jc w:val="center"/>
+        <w:rPr>
+          <w:b/>
+          <w:lang w:val="fr-FR"/>
+        </w:rPr>
+      </w:pPr>
+      <w:r>
+        <w:rPr>
+          <w:b/>
+          <w:lang w:val="fr-FR"/>
+        </w:rPr>
+        <w:t>REPOBLIKAN’I MADAGASIKARA</w:t>
+      </w:r>
+    </w:p>
+    <w:p>
+      <w:pPr>
+        <w:spacing w:line="240" w:lineRule="auto"/>
+        <w:jc w:val="center"/>
+        <w:rPr>
+          <w:b/>
+          <w:i/>
+          <w:sz w:val="20"/>
+          <w:lang w:val="fr-FR"/>
+        </w:rPr>
+      </w:pPr>
+      <w:proofErr w:type="spellStart"/>
+      <w:r>
+        <w:rPr>
+          <w:b/>
+          <w:i/>
+          <w:sz w:val="20"/>
+          <w:lang w:val="fr-FR"/>
+        </w:rPr>
+        <w:t>Fitiavana-Tanindrazana-Fandrosoana</w:t>
+      </w:r>
+      <w:proofErr w:type="spellEnd"/>
+      <w:r>
+        <w:rPr>
+          <w:b/>
+          <w:i/>
+          <w:sz w:val="20"/>
+          <w:lang w:val="fr-FR"/>
+        </w:rPr>
+        <w:t xml:space="preserve">                                                                                            </w:t>
+      </w:r>
+    </w:p>
+    <w:p>
+      <w:pPr>
+        <w:tabs>
+          <w:tab w:val="right" w:pos="9496"/>
+        </w:tabs>
+        <w:spacing w:line="240" w:lineRule="auto"/>
+        <w:ind w:right="-15"/>
+        <w:jc w:val="center"/>
+        <w:rPr>
+          <w:b/>
+          <w:color w:val="0909E9"/>
+          <w:sz w:val="23"/>
+          <w:vertAlign w:val="superscript"/>
+          <w:lang w:val="fr-FR"/>
+        </w:rPr>
+      </w:pPr>
+      <w:r>
+        <w:rPr>
+          <w:rFonts w:ascii="Calibri" w:eastAsia="Calibri" w:hAnsi="Calibri" w:cs="Calibri"/>
+          <w:noProof/>
+        </w:rPr>
+        <mc:AlternateContent>
+          <mc:Choice Requires="wpg">
+            <w:drawing>
+              <wp:anchor distT="0" distB="0" distL="114300" distR="114300" simplePos="0" relativeHeight="251661312" behindDoc="1" locked="0" layoutInCell="1" allowOverlap="1" wp14:anchorId="6638F127" wp14:editId="31886419">
+                <wp:simplePos x="0" y="0"/>
+                <wp:positionH relativeFrom="column">
+                  <wp:posOffset>2127530</wp:posOffset>
+                </wp:positionH>
+                <wp:positionV relativeFrom="paragraph">
+                  <wp:posOffset>187694</wp:posOffset>
+                </wp:positionV>
+                <wp:extent cx="1505585" cy="8890"/>
+                <wp:effectExtent l="0" t="0" r="18415" b="10160"/>
+                <wp:wrapNone/>
+                <wp:docPr id="5443" name="Group 5443"/>
+                <wp:cNvGraphicFramePr/>
+                <a:graphic xmlns:a="http://schemas.openxmlformats.org/drawingml/2006/main">
+                  <a:graphicData uri="http://schemas.microsoft.com/office/word/2010/wordprocessingGroup">
+                    <wpg:wgp>
+                      <wpg:cNvGrpSpPr/>
+                      <wpg:grpSpPr>
+                        <a:xfrm>
+                          <a:off x="0" y="0"/>
+                          <a:ext cx="1505585" cy="8890"/>
+                          <a:chOff x="0" y="0"/>
+                          <a:chExt cx="1505585" cy="9017"/>
+                        </a:xfrm>
+                      </wpg:grpSpPr>
+                      <wps:wsp>
+                        <wps:cNvPr id="17" name="Shape 17"/>
+                        <wps:cNvSpPr/>
+                        <wps:spPr>
+                          <a:xfrm>
+                            <a:off x="0" y="0"/>
+                            <a:ext cx="1505585" cy="0"/>
+                          </a:xfrm>
+                          <a:custGeom>
+                            <a:avLst/>
+                            <a:gdLst/>
+                            <a:ahLst/>
+                            <a:cxnLst/>
+                            <a:rect l="0" t="0" r="0" b="0"/>
+                            <a:pathLst>
+                              <a:path w="1505585">
+                                <a:moveTo>
+                                  <a:pt x="0" y="0"/>
+                                </a:moveTo>
+                                <a:lnTo>
+                                  <a:pt x="1505585" y="0"/>
+                                </a:lnTo>
+                              </a:path>
+                            </a:pathLst>
+                          </a:custGeom>
+                          <a:ln w="9017" cap="flat">
+                            <a:round/>
+                          </a:ln>
+                        </wps:spPr>
+                        <wps:style>
+                          <a:lnRef idx="1">
+                            <a:srgbClr val="000000"/>
+                          </a:lnRef>
+                          <a:fillRef idx="0">
+                            <a:srgbClr val="000000">
+                              <a:alpha val="0"/>
+                            </a:srgbClr>
+                          </a:fillRef>
+                          <a:effectRef idx="0">
+                            <a:scrgbClr r="0" g="0" b="0"/>
+                          </a:effectRef>
+                          <a:fontRef idx="none"/>
+                        </wps:style>
+                        <wps:bodyPr/>
+                      </wps:wsp>
+                    </wpg:wgp>
+                  </a:graphicData>
+                </a:graphic>
+              </wp:anchor>
+            </w:drawing>
+          </mc:Choice>
+          <mc:Fallback>
+            <w:pict>
+              <v:group w14:anchorId="35E055DD" id="Group 5443" o:spid="_x0000_s1026" style="position:absolute;margin-left:167.5pt;margin-top:14.8pt;width:118.55pt;height:.7pt;z-index:-251655168" coordsize="15055,90" o:gfxdata="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">
+                <v:shape id="Shape 17" o:spid="_x0000_s1027" style="position:absolute;width:15055;height:0;visibility:visible;mso-wrap-style:square;v-text-anchor:top" coordsize="1505585,0" o:gfxdata="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" path="m,l1505585,e" filled="f" strokeweight=".71pt">
+                  <v:path arrowok="t" textboxrect="0,0,1505585,0"/>
+                </v:shape>
+              </v:group>
+            </w:pict>
+          </mc:Fallback>
+        </mc:AlternateContent>
+      </w:r>
+      <w:r>
+        <w:rPr>
+          <w:b/>
+          <w:color w:val="0909E9"/>
+          <w:sz w:val="23"/>
+          <w:vertAlign w:val="superscript"/>
+          <w:lang w:val="fr-FR"/>
+        </w:rPr>
+        <w:t xml:space="preserve">Université de </w:t>
+      </w:r>
+      <w:r>
+        <w:rPr>
+          <w:b/>
+          <w:color w:val="0909E9"/>
+          <w:vertAlign w:val="superscript"/>
+          <w:lang w:val="fr-FR"/>
+        </w:rPr>
+        <w:t>Mahajanga</w:t>
+      </w:r>
+      <w:r>
+        <w:rPr>
+          <w:b/>
+          <w:color w:val="0909E9"/>
+          <w:vertAlign w:val="superscript"/>
+          <w:lang w:val="fr-FR"/>
+        </w:rPr>
+        <w:t xml:space="preserve">                                                                                                                            </w:t>
+      </w:r>
+      <w:r>
+        <w:rPr>
+          <w:b/>
+          <w:color w:val="0909E9"/>
+          <w:vertAlign w:val="superscript"/>
+          <w:lang w:val="fr-FR"/>
+        </w:rPr>
+        <w:t xml:space="preserve">                                         </w:t>
+      </w:r>
+      <w:r>
+        <w:rPr>
+          <w:b/>
+          <w:color w:val="0909E9"/>
+          <w:vertAlign w:val="superscript"/>
+          <w:lang w:val="fr-FR"/>
+        </w:rPr>
+        <w:t xml:space="preserve">       </w:t>
+      </w:r>
+      <w:r>
+        <w:rPr>
+          <w:b/>
+          <w:vertAlign w:val="superscript"/>
+          <w:lang w:val="fr-FR"/>
+        </w:rPr>
+        <w:t>Honnêteté – Discipline – Excellence</w:t>
+      </w:r>
+      <w:r>
+        <w:rPr>
+          <w:b/>
+          <w:color w:val="0909E9"/>
+          <w:sz w:val="23"/>
+          <w:vertAlign w:val="superscript"/>
+          <w:lang w:val="fr-FR"/>
+        </w:rPr>
+        <w:tab/>
+        <w:t xml:space="preserve">         </w:t>
+      </w:r>
+    </w:p>
+    <w:p>
+      <w:pPr>
+        <w:spacing w:line="240" w:lineRule="auto"/>
+        <w:jc w:val="center"/>
+        <w:rPr>
+          <w:b/>
+          <w:lang w:val="fr-FR"/>
+        </w:rPr>
+      </w:pPr>
+      <w:r>
+        <w:rPr>
+          <w:b/>
+          <w:lang w:val="fr-FR"/>
+        </w:rPr>
+        <w:t xml:space="preserve">MINISTERE DE L’ENSEIGNEMENT SUPERIEUR ET DE LA </w:t>
+      </w:r>
+    </w:p>
+    <w:p>
+      <w:pPr>
+        <w:spacing w:line="240" w:lineRule="auto"/>
+        <w:jc w:val="center"/>
+        <w:rPr>
+          <w:lang w:val="fr-FR"/>
+        </w:rPr>
+      </w:pPr>
+      <w:r>
+        <w:rPr>
+          <w:b/>
+          <w:lang w:val="fr-FR"/>
+        </w:rPr>
+        <w:t>RECHERCHE SCIENTIFIQUE</w:t>
+      </w:r>
+    </w:p>
+    <w:p>
+      <w:pPr>
+        <w:spacing w:line="240" w:lineRule="auto"/>
+        <w:jc w:val="center"/>
+        <w:rPr>
+          <w:b/>
+          <w:lang w:val="fr-FR"/>
+        </w:rPr>
+      </w:pPr>
+      <w:r>
+        <w:rPr>
+          <w:rFonts w:ascii="Calibri" w:eastAsia="Calibri" w:hAnsi="Calibri" w:cs="Calibri"/>
+          <w:noProof/>
+        </w:rPr>
+        <mc:AlternateContent>
+          <mc:Choice Requires="wpg">
+            <w:drawing>
+              <wp:anchor distT="0" distB="0" distL="114300" distR="114300" simplePos="0" relativeHeight="251662336" behindDoc="1" locked="0" layoutInCell="1" allowOverlap="1" wp14:anchorId="5874E162" wp14:editId="16F73F53">
+                <wp:simplePos x="0" y="0"/>
+                <wp:positionH relativeFrom="column">
+                  <wp:posOffset>2278719</wp:posOffset>
+                </wp:positionH>
+                <wp:positionV relativeFrom="paragraph">
+                  <wp:posOffset>151765</wp:posOffset>
+                </wp:positionV>
+                <wp:extent cx="1290320" cy="9030"/>
+                <wp:effectExtent l="0" t="0" r="24130" b="10160"/>
+                <wp:wrapNone/>
+                <wp:docPr id="5444" name="Group 5444"/>
+                <wp:cNvGraphicFramePr/>
+                <a:graphic xmlns:a="http://schemas.openxmlformats.org/drawingml/2006/main">
+                  <a:graphicData uri="http://schemas.microsoft.com/office/word/2010/wordprocessingGroup">
+                    <wpg:wgp>
+                      <wpg:cNvGrpSpPr/>
+                      <wpg:grpSpPr>
+                        <a:xfrm>
+                          <a:off x="0" y="0"/>
+                          <a:ext cx="1290320" cy="9030"/>
+                          <a:chOff x="0" y="0"/>
+                          <a:chExt cx="1290320" cy="9030"/>
+                        </a:xfrm>
+                      </wpg:grpSpPr>
+                      <wps:wsp>
+                        <wps:cNvPr id="18" name="Shape 18"/>
+                        <wps:cNvSpPr/>
+                        <wps:spPr>
+                          <a:xfrm>
+                            <a:off x="0" y="0"/>
+                            <a:ext cx="1290320" cy="0"/>
+                          </a:xfrm>
+                          <a:custGeom>
+                            <a:avLst/>
+                            <a:gdLst/>
+                            <a:ahLst/>
+                            <a:cxnLst/>
+                            <a:rect l="0" t="0" r="0" b="0"/>
+                            <a:pathLst>
+                              <a:path w="1290320">
+                                <a:moveTo>
+                                  <a:pt x="0" y="0"/>
+                                </a:moveTo>
+                                <a:lnTo>
+                                  <a:pt x="1290320" y="0"/>
+                                </a:lnTo>
+                              </a:path>
+                            </a:pathLst>
+                          </a:custGeom>
+                          <a:ln w="9030" cap="flat">
+                            <a:round/>
+                          </a:ln>
+                        </wps:spPr>
+                        <wps:style>
+                          <a:lnRef idx="1">
+                            <a:srgbClr val="000000"/>
+                          </a:lnRef>
+                          <a:fillRef idx="0">
+                            <a:srgbClr val="000000">
+                              <a:alpha val="0"/>
+                            </a:srgbClr>
+                          </a:fillRef>
+                          <a:effectRef idx="0">
+                            <a:scrgbClr r="0" g="0" b="0"/>
+                          </a:effectRef>
+                          <a:fontRef idx="none"/>
+                        </wps:style>
+                        <wps:bodyPr/>
+                      </wps:wsp>
+                    </wpg:wgp>
+                  </a:graphicData>
+                </a:graphic>
+              </wp:anchor>
+            </w:drawing>
+          </mc:Choice>
+          <mc:Fallback>
+            <w:pict>
+              <v:group w14:anchorId="5191C743" id="Group 5444" o:spid="_x0000_s1026" style="position:absolute;margin-left:179.45pt;margin-top:11.95pt;width:101.6pt;height:.7pt;z-index:-251654144" coordsize="12903,90" o:gfxdata="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">
+                <v:shape id="Shape 18" o:spid="_x0000_s1027" style="position:absolute;width:12903;height:0;visibility:visible;mso-wrap-style:square;v-text-anchor:top" coordsize="1290320,0" o:gfxdata="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" path="m,l1290320,e" filled="f" strokeweight=".25083mm">
+                  <v:path arrowok="t" textboxrect="0,0,1290320,0"/>
+                </v:shape>
+              </v:group>
+            </w:pict>
+          </mc:Fallback>
+        </mc:AlternateContent>
+      </w:r>
+    </w:p>
+    <w:p>
+      <w:pPr>
+        <w:spacing w:line="240" w:lineRule="auto"/>
+        <w:jc w:val="center"/>
+        <w:rPr>
+          <w:lang w:val="fr-FR"/>
+        </w:rPr>
+      </w:pPr>
+      <w:r>
+        <w:rPr>
+          <w:b/>
+          <w:lang w:val="fr-FR"/>
+        </w:rPr>
+        <w:t>UNIVERSITE DE MAHAJANGA</w:t>
+      </w:r>
+    </w:p>
+    <w:p>
+      <w:pPr>
+        <w:spacing w:line="240" w:lineRule="auto"/>
+        <w:jc w:val="center"/>
+        <w:rPr>
+          <w:lang w:val="fr-FR"/>
+        </w:rPr>
+      </w:pPr>
+      <w:r>
+        <w:rPr>
+          <w:rFonts w:ascii="Calibri" w:eastAsia="Calibri" w:hAnsi="Calibri" w:cs="Calibri"/>
+          <w:noProof/>
+        </w:rPr>
+        <mc:AlternateContent>
+          <mc:Choice Requires="wpg">
+            <w:drawing>
+              <wp:anchor distT="0" distB="0" distL="114300" distR="114300" simplePos="0" relativeHeight="251663360" behindDoc="1" locked="0" layoutInCell="1" allowOverlap="1" wp14:anchorId="26451B03" wp14:editId="4429FCFC">
+                <wp:simplePos x="0" y="0"/>
+                <wp:positionH relativeFrom="column">
+                  <wp:posOffset>2452356</wp:posOffset>
+                </wp:positionH>
+                <wp:positionV relativeFrom="paragraph">
+                  <wp:posOffset>84322</wp:posOffset>
+                </wp:positionV>
+                <wp:extent cx="1003300" cy="9030"/>
+                <wp:effectExtent l="0" t="0" r="25400" b="10160"/>
+                <wp:wrapNone/>
+                <wp:docPr id="5445" name="Group 5445"/>
+                <wp:cNvGraphicFramePr/>
+                <a:graphic xmlns:a="http://schemas.openxmlformats.org/drawingml/2006/main">
+                  <a:graphicData uri="http://schemas.microsoft.com/office/word/2010/wordprocessingGroup">
+                    <wpg:wgp>
+                      <wpg:cNvGrpSpPr/>
+                      <wpg:grpSpPr>
+                        <a:xfrm>
+                          <a:off x="0" y="0"/>
+                          <a:ext cx="1003300" cy="9030"/>
+                          <a:chOff x="0" y="0"/>
+                          <a:chExt cx="1003300" cy="9030"/>
+                        </a:xfrm>
+                      </wpg:grpSpPr>
+                      <wps:wsp>
+                        <wps:cNvPr id="19" name="Shape 19"/>
+                        <wps:cNvSpPr/>
+                        <wps:spPr>
+                          <a:xfrm>
+                            <a:off x="0" y="0"/>
+                            <a:ext cx="1003300" cy="0"/>
+                          </a:xfrm>
+                          <a:custGeom>
+                            <a:avLst/>
+                            <a:gdLst/>
+                            <a:ahLst/>
+                            <a:cxnLst/>
+                            <a:rect l="0" t="0" r="0" b="0"/>
+                            <a:pathLst>
+                              <a:path w="1003300">
+                                <a:moveTo>
+                                  <a:pt x="0" y="0"/>
+                                </a:moveTo>
+                                <a:lnTo>
+                                  <a:pt x="1003300" y="0"/>
+                                </a:lnTo>
+                              </a:path>
+                            </a:pathLst>
+                          </a:custGeom>
+                          <a:ln w="9030" cap="flat">
+                            <a:round/>
+                          </a:ln>
+                        </wps:spPr>
+                        <wps:style>
+                          <a:lnRef idx="1">
+                            <a:srgbClr val="000000"/>
+                          </a:lnRef>
+                          <a:fillRef idx="0">
+                            <a:srgbClr val="000000">
+                              <a:alpha val="0"/>
+                            </a:srgbClr>
+                          </a:fillRef>
+                          <a:effectRef idx="0">
+                            <a:scrgbClr r="0" g="0" b="0"/>
+                          </a:effectRef>
+                          <a:fontRef idx="none"/>
+                        </wps:style>
+                        <wps:bodyPr/>
+                      </wps:wsp>
+                    </wpg:wgp>
+                  </a:graphicData>
+                </a:graphic>
+              </wp:anchor>
+            </w:drawing>
+          </mc:Choice>
+          <mc:Fallback>
+            <w:pict>
+              <v:group w14:anchorId="1F352631" id="Group 5445" o:spid="_x0000_s1026" style="position:absolute;margin-left:193.1pt;margin-top:6.65pt;width:79pt;height:.7pt;z-index:-251653120" coordsize="10033,90" o:gfxdata="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">
+                <v:shape id="Shape 19" o:spid="_x0000_s1027" style="position:absolute;width:10033;height:0;visibility:visible;mso-wrap-style:square;v-text-anchor:top" coordsize="1003300,0" o:gfxdata="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" path="m,l1003300,e" filled="f" strokeweight=".25083mm">
+                  <v:path arrowok="t" textboxrect="0,0,1003300,0"/>
+                </v:shape>
+              </v:group>
+            </w:pict>
+          </mc:Fallback>
+        </mc:AlternateContent>
+      </w:r>
+    </w:p>
+    <w:p>
+      <w:pPr>
+        <w:spacing w:line="240" w:lineRule="auto"/>
+        <w:jc w:val="center"/>
+        <w:rPr>
+          <w:lang w:val="fr-FR"/>
+        </w:rPr>
+      </w:pPr>
+      <w:r>
+        <w:rPr>
+          <w:b/>
+          <w:color w:val="FF0000"/>
+          <w:lang w:val="fr-FR"/>
+        </w:rPr>
+        <w:t>I</w:t>
+      </w:r>
+      <w:r>
+        <w:rPr>
+          <w:b/>
+          <w:lang w:val="fr-FR"/>
+        </w:rPr>
+        <w:t xml:space="preserve">NSTITUT </w:t>
+      </w:r>
+      <w:r>
+        <w:rPr>
+          <w:b/>
+          <w:color w:val="FF0000"/>
+          <w:lang w:val="fr-FR"/>
+        </w:rPr>
+        <w:t>S</w:t>
+      </w:r>
+      <w:r>
+        <w:rPr>
+          <w:b/>
+          <w:lang w:val="fr-FR"/>
+        </w:rPr>
+        <w:t xml:space="preserve">UPERIEUR DES </w:t>
+      </w:r>
+      <w:r>
+        <w:rPr>
+          <w:b/>
+          <w:color w:val="FF0000"/>
+          <w:lang w:val="fr-FR"/>
+        </w:rPr>
+        <w:t>S</w:t>
+      </w:r>
+      <w:r>
+        <w:rPr>
+          <w:b/>
+          <w:lang w:val="fr-FR"/>
+        </w:rPr>
+        <w:t xml:space="preserve">CIENCES ET </w:t>
+      </w:r>
+      <w:r>
+        <w:rPr>
+          <w:b/>
+          <w:color w:val="FF0000"/>
+          <w:lang w:val="fr-FR"/>
+        </w:rPr>
+        <w:t>T</w:t>
+      </w:r>
+      <w:r>
+        <w:rPr>
+          <w:b/>
+          <w:lang w:val="fr-FR"/>
+        </w:rPr>
+        <w:t xml:space="preserve">ECHNOLOGIES DE </w:t>
+      </w:r>
+      <w:r>
+        <w:rPr>
+          <w:b/>
+          <w:color w:val="FF0000"/>
+          <w:lang w:val="fr-FR"/>
+        </w:rPr>
+        <w:t>M</w:t>
+      </w:r>
+      <w:r>
+        <w:rPr>
+          <w:b/>
+          <w:lang w:val="fr-FR"/>
+        </w:rPr>
+        <w:t>AHAJANGA</w:t>
+      </w:r>
+    </w:p>
+    <w:p>
+      <w:pPr>
+        <w:spacing w:line="240" w:lineRule="auto"/>
+        <w:jc w:val="center"/>
+        <w:rPr>
+          <w:lang w:val="fr-FR"/>
+        </w:rPr>
+      </w:pPr>
+      <w:r>
+        <w:rPr>
+          <w:b/>
+          <w:lang w:val="fr-FR"/>
+        </w:rPr>
+        <w:t>(ISSTM)</w:t>
+      </w:r>
+    </w:p>
+    <w:p>
+      <w:pPr>
+        <w:spacing w:line="240" w:lineRule="auto"/>
+        <w:jc w:val="center"/>
+        <w:rPr>
+          <w:lang w:val="fr-FR"/>
+        </w:rPr>
+      </w:pPr>
+      <w:r>
+        <w:rPr>
+          <w:rFonts w:ascii="Calibri" w:eastAsia="Calibri" w:hAnsi="Calibri" w:cs="Calibri"/>
+          <w:noProof/>
+        </w:rPr>
+        <mc:AlternateContent>
+          <mc:Choice Requires="wpg">
+            <w:drawing>
+              <wp:anchor distT="0" distB="0" distL="114300" distR="114300" simplePos="0" relativeHeight="251664384" behindDoc="1" locked="0" layoutInCell="1" allowOverlap="1" wp14:anchorId="19DB208C" wp14:editId="067C5BE7">
+                <wp:simplePos x="0" y="0"/>
+                <wp:positionH relativeFrom="column">
+                  <wp:posOffset>2482997</wp:posOffset>
+                </wp:positionH>
+                <wp:positionV relativeFrom="paragraph">
+                  <wp:posOffset>43697</wp:posOffset>
+                </wp:positionV>
+                <wp:extent cx="932180" cy="9030"/>
+                <wp:effectExtent l="0" t="0" r="20320" b="10160"/>
+                <wp:wrapNone/>
+                <wp:docPr id="5446" name="Group 5446"/>
+                <wp:cNvGraphicFramePr/>
+                <a:graphic xmlns:a="http://schemas.openxmlformats.org/drawingml/2006/main">
+                  <a:graphicData uri="http://schemas.microsoft.com/office/word/2010/wordprocessingGroup">
+                    <wpg:wgp>
+                      <wpg:cNvGrpSpPr/>
+                      <wpg:grpSpPr>
+                        <a:xfrm>
+                          <a:off x="0" y="0"/>
+                          <a:ext cx="932180" cy="9030"/>
+                          <a:chOff x="0" y="0"/>
+                          <a:chExt cx="932180" cy="9030"/>
+                        </a:xfrm>
+                      </wpg:grpSpPr>
+                      <wps:wsp>
+                        <wps:cNvPr id="20" name="Shape 20"/>
+                        <wps:cNvSpPr/>
+                        <wps:spPr>
+                          <a:xfrm>
+                            <a:off x="0" y="0"/>
+                            <a:ext cx="932180" cy="0"/>
+                          </a:xfrm>
+                          <a:custGeom>
+                            <a:avLst/>
+                            <a:gdLst/>
+                            <a:ahLst/>
+                            <a:cxnLst/>
+                            <a:rect l="0" t="0" r="0" b="0"/>
+                            <a:pathLst>
+                              <a:path w="932180">
+                                <a:moveTo>
+                                  <a:pt x="0" y="0"/>
+                                </a:moveTo>
+                                <a:lnTo>
+                                  <a:pt x="932180" y="0"/>
+                                </a:lnTo>
+                              </a:path>
+                            </a:pathLst>
+                          </a:custGeom>
+                          <a:ln w="9030" cap="flat">
+                            <a:round/>
+                          </a:ln>
+                        </wps:spPr>
+                        <wps:style>
+                          <a:lnRef idx="1">
+                            <a:srgbClr val="000000"/>
+                          </a:lnRef>
+                          <a:fillRef idx="0">
+                            <a:srgbClr val="000000">
+                              <a:alpha val="0"/>
+                            </a:srgbClr>
+                          </a:fillRef>
+                          <a:effectRef idx="0">
+                            <a:scrgbClr r="0" g="0" b="0"/>
+                          </a:effectRef>
+                          <a:fontRef idx="none"/>
+                        </wps:style>
+                        <wps:bodyPr/>
+                      </wps:wsp>
+                    </wpg:wgp>
+                  </a:graphicData>
+                </a:graphic>
+              </wp:anchor>
+            </w:drawing>
+          </mc:Choice>
+          <mc:Fallback>
+            <w:pict>
+              <v:group w14:anchorId="5E9E1FF8" id="Group 5446" o:spid="_x0000_s1026" style="position:absolute;margin-left:195.5pt;margin-top:3.45pt;width:73.4pt;height:.7pt;z-index:-251652096" coordsize="9321,90" o:gfxdata="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">
+                <v:shape id="Shape 20" o:spid="_x0000_s1027" style="position:absolute;width:9321;height:0;visibility:visible;mso-wrap-style:square;v-text-anchor:top" coordsize="932180,0" o:gfxdata="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" path="m,l932180,e" filled="f" strokeweight=".25083mm">
+                  <v:path arrowok="t" textboxrect="0,0,932180,0"/>
+                </v:shape>
+              </v:group>
+            </w:pict>
+          </mc:Fallback>
+        </mc:AlternateContent>
+      </w:r>
+    </w:p>
+    <w:p>
+      <w:pPr>
+        <w:spacing w:line="240" w:lineRule="auto"/>
+        <w:jc w:val="center"/>
+        <w:rPr>
+          <w:lang w:val="fr-FR"/>
+        </w:rPr>
+      </w:pPr>
+      <w:r>
+        <w:rPr>
+          <w:b/>
+          <w:lang w:val="fr-FR"/>
+        </w:rPr>
+        <w:t>Mention : Sciences et Techniques du Numérique et Physiques Appliquées</w:t>
+      </w:r>
+    </w:p>
+    <w:p>
+      <w:pPr>
+        <w:spacing w:line="240" w:lineRule="auto"/>
+        <w:jc w:val="center"/>
+        <w:rPr>
+          <w:b/>
+          <w:sz w:val="19"/>
+          <w:lang w:val="fr-FR"/>
+        </w:rPr>
+      </w:pPr>
+      <w:r>
+        <w:rPr>
+          <w:b/>
+          <w:lang w:val="fr-FR"/>
+        </w:rPr>
+        <w:t xml:space="preserve">Parcours : Génie </w:t>
+      </w:r>
+      <w:r>
+        <w:rPr>
+          <w:b/>
+          <w:lang w:val="fr-FR"/>
+        </w:rPr>
+        <w:t>Informatique</w:t>
+      </w:r>
+    </w:p>
+    <w:p>
+      <w:pPr>
+        <w:spacing w:line="240" w:lineRule="auto"/>
+        <w:jc w:val="center"/>
+        <w:rPr>
+          <w:i/>
+          <w:lang w:val="fr-FR"/>
+        </w:rPr>
+      </w:pPr>
+      <w:r>
+        <w:rPr>
+          <w:rFonts w:ascii="Calibri" w:eastAsia="Calibri" w:hAnsi="Calibri" w:cs="Calibri"/>
+          <w:noProof/>
+        </w:rPr>
+        <mc:AlternateContent>
+          <mc:Choice Requires="wpg">
+            <w:drawing>
+              <wp:anchor distT="0" distB="0" distL="114300" distR="114300" simplePos="0" relativeHeight="251665408" behindDoc="1" locked="0" layoutInCell="1" allowOverlap="1" wp14:anchorId="6BDE5381" wp14:editId="4B366A9B">
+                <wp:simplePos x="0" y="0"/>
+                <wp:positionH relativeFrom="column">
+                  <wp:posOffset>2448461</wp:posOffset>
+                </wp:positionH>
+                <wp:positionV relativeFrom="paragraph">
+                  <wp:posOffset>154232</wp:posOffset>
+                </wp:positionV>
+                <wp:extent cx="859790" cy="9030"/>
+                <wp:effectExtent l="0" t="0" r="16510" b="10160"/>
+                <wp:wrapNone/>
+                <wp:docPr id="5447" name="Group 5447"/>
+                <wp:cNvGraphicFramePr/>
+                <a:graphic xmlns:a="http://schemas.openxmlformats.org/drawingml/2006/main">
+                  <a:graphicData uri="http://schemas.microsoft.com/office/word/2010/wordprocessingGroup">
+                    <wpg:wgp>
+                      <wpg:cNvGrpSpPr/>
+                      <wpg:grpSpPr>
+                        <a:xfrm>
+                          <a:off x="0" y="0"/>
+                          <a:ext cx="859790" cy="9030"/>
+                          <a:chOff x="0" y="0"/>
+                          <a:chExt cx="859790" cy="9030"/>
+                        </a:xfrm>
+                      </wpg:grpSpPr>
+                      <wps:wsp>
+                        <wps:cNvPr id="21" name="Shape 21"/>
+                        <wps:cNvSpPr/>
+                        <wps:spPr>
+                          <a:xfrm>
+                            <a:off x="0" y="0"/>
+                            <a:ext cx="859790" cy="0"/>
+                          </a:xfrm>
+                          <a:custGeom>
+                            <a:avLst/>
+                            <a:gdLst/>
+                            <a:ahLst/>
+                            <a:cxnLst/>
+                            <a:rect l="0" t="0" r="0" b="0"/>
+                            <a:pathLst>
+                              <a:path w="859790">
+                                <a:moveTo>
+                                  <a:pt x="0" y="0"/>
+                                </a:moveTo>
+                                <a:lnTo>
+                                  <a:pt x="859790" y="0"/>
+                                </a:lnTo>
+                              </a:path>
+                            </a:pathLst>
+                          </a:custGeom>
+                          <a:ln w="9030" cap="flat">
+                            <a:round/>
+                          </a:ln>
+                        </wps:spPr>
+                        <wps:style>
+                          <a:lnRef idx="1">
+                            <a:srgbClr val="000000"/>
+                          </a:lnRef>
+                          <a:fillRef idx="0">
+                            <a:srgbClr val="000000">
+                              <a:alpha val="0"/>
+                            </a:srgbClr>
+                          </a:fillRef>
+                          <a:effectRef idx="0">
+                            <a:scrgbClr r="0" g="0" b="0"/>
+                          </a:effectRef>
+                          <a:fontRef idx="none"/>
+                        </wps:style>
+                        <wps:bodyPr/>
+                      </wps:wsp>
+                    </wpg:wgp>
+                  </a:graphicData>
+                </a:graphic>
+              </wp:anchor>
+            </w:drawing>
+          </mc:Choice>
+          <mc:Fallback>
+            <w:pict>
+              <v:group w14:anchorId="627955E1" id="Group 5447" o:spid="_x0000_s1026" style="position:absolute;margin-left:192.8pt;margin-top:12.15pt;width:67.7pt;height:.7pt;z-index:-251651072" coordsize="8597,90" o:gfxdata="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">
+                <v:shape id="Shape 21" o:spid="_x0000_s1027" style="position:absolute;width:8597;height:0;visibility:visible;mso-wrap-style:square;v-text-anchor:top" coordsize="859790,0" o:gfxdata="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" path="m,l859790,e" filled="f" strokeweight=".25083mm">
+                  <v:path arrowok="t" textboxrect="0,0,859790,0"/>
+                </v:shape>
+              </v:group>
+            </w:pict>
+          </mc:Fallback>
+        </mc:AlternateContent>
+      </w:r>
+      <w:r>
+        <w:rPr>
+          <w:i/>
+          <w:lang w:val="fr-FR"/>
+        </w:rPr>
+        <w:t xml:space="preserve"> </w:t>
+      </w:r>
+    </w:p>
+    <w:p>
+      <w:pPr>
+        <w:spacing w:line="240" w:lineRule="auto"/>
+        <w:rPr>
+          <w:b/>
+          <w:sz w:val="28"/>
+          <w:szCs w:val="28"/>
+          <w:lang w:val="fr-FR"/>
+        </w:rPr>
+      </w:pPr>
+      <w:r>
+        <w:rPr>
+          <w:rFonts w:ascii="Calibri" w:eastAsia="Calibri" w:hAnsi="Calibri" w:cs="Calibri"/>
+          <w:noProof/>
+        </w:rPr>
+        <mc:AlternateContent>
+          <mc:Choice Requires="wpg">
+            <w:drawing>
+              <wp:anchor distT="0" distB="0" distL="114300" distR="114300" simplePos="0" relativeHeight="251666432" behindDoc="1" locked="0" layoutInCell="1" allowOverlap="1" wp14:anchorId="01A4A822" wp14:editId="24D2E271">
+                <wp:simplePos x="0" y="0"/>
+                <wp:positionH relativeFrom="column">
+                  <wp:posOffset>2449978</wp:posOffset>
+                </wp:positionH>
+                <wp:positionV relativeFrom="paragraph">
+                  <wp:posOffset>292933</wp:posOffset>
+                </wp:positionV>
+                <wp:extent cx="859790" cy="9030"/>
+                <wp:effectExtent l="0" t="0" r="16510" b="10160"/>
+                <wp:wrapNone/>
+                <wp:docPr id="5448" name="Group 5448"/>
+                <wp:cNvGraphicFramePr/>
+                <a:graphic xmlns:a="http://schemas.openxmlformats.org/drawingml/2006/main">
+                  <a:graphicData uri="http://schemas.microsoft.com/office/word/2010/wordprocessingGroup">
+                    <wpg:wgp>
+                      <wpg:cNvGrpSpPr/>
+                      <wpg:grpSpPr>
+                        <a:xfrm>
+                          <a:off x="0" y="0"/>
+                          <a:ext cx="859790" cy="9030"/>
+                          <a:chOff x="0" y="0"/>
+                          <a:chExt cx="859790" cy="9030"/>
+                        </a:xfrm>
+                      </wpg:grpSpPr>
+                      <wps:wsp>
+                        <wps:cNvPr id="22" name="Shape 22"/>
+                        <wps:cNvSpPr/>
+                        <wps:spPr>
+                          <a:xfrm>
+                            <a:off x="0" y="0"/>
+                            <a:ext cx="859790" cy="0"/>
+                          </a:xfrm>
+                          <a:custGeom>
+                            <a:avLst/>
+                            <a:gdLst/>
+                            <a:ahLst/>
+                            <a:cxnLst/>
+                            <a:rect l="0" t="0" r="0" b="0"/>
+                            <a:pathLst>
+                              <a:path w="859790">
+                                <a:moveTo>
+                                  <a:pt x="0" y="0"/>
+                                </a:moveTo>
+                                <a:lnTo>
+                                  <a:pt x="859790" y="0"/>
+                                </a:lnTo>
+                              </a:path>
+                            </a:pathLst>
+                          </a:custGeom>
+                          <a:ln w="9030" cap="flat">
+                            <a:round/>
+                          </a:ln>
+                        </wps:spPr>
+                        <wps:style>
+                          <a:lnRef idx="1">
+                            <a:srgbClr val="000000"/>
+                          </a:lnRef>
+                          <a:fillRef idx="0">
+                            <a:srgbClr val="000000">
+                              <a:alpha val="0"/>
+                            </a:srgbClr>
+                          </a:fillRef>
+                          <a:effectRef idx="0">
+                            <a:scrgbClr r="0" g="0" b="0"/>
+                          </a:effectRef>
+                          <a:fontRef idx="none"/>
+                        </wps:style>
+                        <wps:bodyPr/>
+                      </wps:wsp>
+                    </wpg:wgp>
+                  </a:graphicData>
+                </a:graphic>
+              </wp:anchor>
+            </w:drawing>
+          </mc:Choice>
+          <mc:Fallback>
+            <w:pict>
+              <v:group w14:anchorId="4083B99D" id="Group 5448" o:spid="_x0000_s1026" style="position:absolute;margin-left:192.9pt;margin-top:23.05pt;width:67.7pt;height:.7pt;z-index:-251650048" coordsize="8597,90" o:gfxdata="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">
+                <v:shape id="Shape 22" o:spid="_x0000_s1027" style="position:absolute;width:8597;height:0;visibility:visible;mso-wrap-style:square;v-text-anchor:top" coordsize="859790,0" o:gfxdata="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" path="m,l859790,e" filled="f" strokeweight=".25083mm">
+                  <v:path arrowok="t" textboxrect="0,0,859790,0"/>
+                </v:shape>
+              </v:group>
+            </w:pict>
+          </mc:Fallback>
+        </mc:AlternateContent>
+      </w:r>
+      <w:r>
+        <w:rPr>
+          <w:b/>
+          <w:i/>
+          <w:sz w:val="28"/>
+          <w:szCs w:val="28"/>
+          <w:lang w:val="fr-FR"/>
+        </w:rPr>
+        <w:t xml:space="preserve">                                                                  </w:t>
+      </w:r>
+      <w:r>
+        <w:rPr>
+          <w:b/>
+          <w:i/>
+          <w:sz w:val="28"/>
+          <w:szCs w:val="28"/>
+          <w:lang w:val="fr-FR"/>
+        </w:rPr>
+        <w:t xml:space="preserve">Projet </w:t>
+      </w:r>
+    </w:p>
+    <w:p>
+      <w:pPr>
+        <w:spacing w:line="240" w:lineRule="auto"/>
+        <w:jc w:val="center"/>
+        <w:rPr>
+          <w:lang w:val="fr-FR"/>
+        </w:rPr>
+      </w:pPr>
+    </w:p>
+    <w:p>
+      <w:pPr>
+        <w:spacing w:line="240" w:lineRule="auto"/>
+        <w:jc w:val="center"/>
+        <w:rPr>
+          <w:lang w:val="fr-FR"/>
+        </w:rPr>
+      </w:pPr>
+      <w:r>
+        <w:rPr>
+          <w:rFonts w:ascii="Calibri" w:eastAsia="Calibri" w:hAnsi="Calibri" w:cs="Calibri"/>
+          <w:noProof/>
+        </w:rPr>
+        <mc:AlternateContent>
+          <mc:Choice Requires="wps">
+            <w:drawing>
+              <wp:anchor distT="0" distB="0" distL="114300" distR="114300" simplePos="0" relativeHeight="251667456" behindDoc="1" locked="0" layoutInCell="1" allowOverlap="1" wp14:anchorId="4945C478" wp14:editId="6128FAEE">
+                <wp:simplePos x="0" y="0"/>
+                <wp:positionH relativeFrom="column">
+                  <wp:posOffset>1005205</wp:posOffset>
+                </wp:positionH>
+                <wp:positionV relativeFrom="paragraph">
+                  <wp:posOffset>71120</wp:posOffset>
+                </wp:positionV>
+                <wp:extent cx="4019550" cy="1257300"/>
+                <wp:effectExtent l="0" t="0" r="19050" b="19050"/>
+                <wp:wrapNone/>
+                <wp:docPr id="3" name="Rectangle à coins arrondis 3"/>
+                <wp:cNvGraphicFramePr/>
+                <a:graphic xmlns:a="http://schemas.openxmlformats.org/drawingml/2006/main">
+                  <a:graphicData uri="http://schemas.microsoft.com/office/word/2010/wordprocessingShape">
+                    <wps:wsp>
+                      <wps:cNvSpPr/>
+                      <wps:spPr>
+                        <a:xfrm>
+                          <a:off x="0" y="0"/>
+                          <a:ext cx="4019550" cy="1257300"/>
+                        </a:xfrm>
+                        <a:prstGeom prst="roundRect">
+                          <a:avLst/>
+                        </a:prstGeom>
+                        <a:noFill/>
+                        <a:ln>
+                          <a:solidFill>
+                            <a:schemeClr val="accent1">
+                              <a:lumMod val="75000"/>
+                            </a:schemeClr>
+                          </a:solidFill>
+                        </a:ln>
+                      </wps:spPr>
+                      <wps:style>
+                        <a:lnRef idx="2">
+                          <a:schemeClr val="accent1">
+                            <a:shade val="50000"/>
+                          </a:schemeClr>
+                        </a:lnRef>
+                        <a:fillRef idx="1">
+                          <a:schemeClr val="accent1"/>
+                        </a:fillRef>
+                        <a:effectRef idx="0">
+                          <a:schemeClr val="accent1"/>
+                        </a:effectRef>
+                        <a:fontRef idx="minor">
+                          <a:schemeClr val="lt1"/>
+                        </a:fontRef>
+                      </wps:style>
+                      <wps:bodyPr rot="0" spcFirstLastPara="0" vertOverflow="overflow" horzOverflow="overflow" vert="horz" wrap="square" lIns="91440" tIns="45720" rIns="91440" bIns="45720" numCol="1" spcCol="0" rtlCol="0" fromWordArt="0" anchor="ctr" anchorCtr="0" forceAA="0" compatLnSpc="1">
+                        <a:prstTxWarp prst="textNoShape">
+                          <a:avLst/>
+                        </a:prstTxWarp>
+                        <a:noAutofit/>
+                      </wps:bodyPr>
+                    </wps:wsp>
+                  </a:graphicData>
+                </a:graphic>
+                <wp14:sizeRelH relativeFrom="margin">
+                  <wp14:pctWidth>0</wp14:pctWidth>
+                </wp14:sizeRelH>
+                <wp14:sizeRelV relativeFrom="margin">
+                  <wp14:pctHeight>0</wp14:pctHeight>
+                </wp14:sizeRelV>
+              </wp:anchor>
+            </w:drawing>
+          </mc:Choice>
+          <mc:Fallback>
+            <w:pict>
+              <v:roundrect w14:anchorId="578645CD" id="Rectangle à coins arrondis 3" o:spid="_x0000_s1026" style="position:absolute;margin-left:79.15pt;margin-top:5.6pt;width:316.5pt;height:99pt;z-index:-251649024;visibility:visible;mso-wrap-style:square;mso-width-percent:0;mso-height-percent:0;mso-wrap-distance-left:9pt;mso-wrap-distance-top:0;mso-wrap-distance-right:9pt;mso-wrap-distance-bottom:0;mso-position-horizontal:absolute;mso-position-horizontal-relative:text;mso-position-vertical:absolute;mso-position-vertical-relative:text;mso-width-percent:0;mso-height-percent:0;mso-width-relative:margin;mso-height-relative:margin;v-text-anchor:middle" arcsize="10923f" o:gfxdata="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" filled="f" strokecolor="#2e74b5 [2404]" strokeweight="1pt">
+                <v:stroke joinstyle="miter"/>
+              </v:roundrect>
+            </w:pict>
+          </mc:Fallback>
+        </mc:AlternateContent>
+      </w:r>
+    </w:p>
+    <w:p>
+      <w:pPr>
+        <w:spacing w:line="240" w:lineRule="auto"/>
+        <w:jc w:val="center"/>
+        <w:rPr>
+          <w:b/>
+          <w:color w:val="0070C0"/>
+          <w:sz w:val="32"/>
+          <w:szCs w:val="32"/>
+          <w:lang w:val="fr-FR"/>
+        </w:rPr>
+      </w:pPr>
+      <w:r>
+        <w:rPr>
+          <w:b/>
+          <w:color w:val="0070C0"/>
+          <w:sz w:val="32"/>
+          <w:szCs w:val="32"/>
+          <w:lang w:val="fr-FR"/>
+        </w:rPr>
+        <w:t xml:space="preserve"> </w:t>
+      </w:r>
+      <w:r>
+        <w:rPr>
+          <w:b/>
+          <w:color w:val="0070C0"/>
+          <w:sz w:val="32"/>
+          <w:szCs w:val="32"/>
+          <w:lang w:val="fr-FR"/>
+        </w:rPr>
+        <w:t xml:space="preserve">« </w:t>
+      </w:r>
+      <w:r>
+        <w:rPr>
+          <w:b/>
+          <w:color w:val="0070C0"/>
+          <w:sz w:val="32"/>
+          <w:szCs w:val="32"/>
+          <w:lang w:val="fr-FR"/>
+        </w:rPr>
+        <w:t xml:space="preserve">GESTION ET SUIVI DES PROJETS </w:t>
+      </w:r>
+    </w:p>
+    <w:p>
+      <w:pPr>
+        <w:spacing w:line="240" w:lineRule="auto"/>
+        <w:jc w:val="center"/>
+        <w:rPr>
+          <w:b/>
+          <w:color w:val="0070C0"/>
+          <w:sz w:val="32"/>
+          <w:szCs w:val="32"/>
+          <w:lang w:val="fr-FR"/>
+        </w:rPr>
+      </w:pPr>
+      <w:r>
+        <w:rPr>
+          <w:b/>
+          <w:color w:val="0070C0"/>
+          <w:sz w:val="32"/>
+          <w:szCs w:val="32"/>
+          <w:lang w:val="fr-FR"/>
+        </w:rPr>
+        <w:t xml:space="preserve">DE </w:t>
+      </w:r>
+    </w:p>
+    <w:p>
+      <w:pPr>
+        <w:spacing w:line="240" w:lineRule="auto"/>
+        <w:jc w:val="center"/>
+        <w:rPr>
+          <w:b/>
+          <w:color w:val="0070C0"/>
+          <w:sz w:val="32"/>
+          <w:szCs w:val="32"/>
+          <w:lang w:val="fr-FR"/>
+        </w:rPr>
+      </w:pPr>
+      <w:r>
+        <w:rPr>
+          <w:b/>
+          <w:color w:val="0070C0"/>
+          <w:sz w:val="32"/>
+          <w:szCs w:val="32"/>
+          <w:lang w:val="fr-FR"/>
+        </w:rPr>
+        <w:t xml:space="preserve">  L’ENTREPRISE</w:t>
+      </w:r>
+      <w:r>
+        <w:rPr>
+          <w:b/>
+          <w:color w:val="0070C0"/>
+          <w:sz w:val="32"/>
+          <w:szCs w:val="32"/>
+          <w:lang w:val="fr-FR"/>
+        </w:rPr>
+        <w:t> »</w:t>
+      </w:r>
+    </w:p>
+    <w:p>
+      <w:pPr>
+        <w:spacing w:line="240" w:lineRule="auto"/>
+        <w:jc w:val="center"/>
+        <w:rPr>
+          <w:b/>
+          <w:color w:val="0070C0"/>
+          <w:sz w:val="32"/>
+          <w:szCs w:val="32"/>
+          <w:lang w:val="fr-FR"/>
+        </w:rPr>
+      </w:pPr>
+    </w:p>
+    <w:p>
+      <w:pPr>
+        <w:spacing w:line="240" w:lineRule="auto"/>
+        <w:ind w:left="10" w:right="55" w:hanging="10"/>
+        <w:jc w:val="center"/>
+        <w:rPr>
+          <w:lang w:val="fr-FR"/>
+        </w:rPr>
+      </w:pPr>
+      <w:r>
+        <w:rPr>
+          <w:u w:val="single" w:color="000000"/>
+          <w:lang w:val="fr-FR"/>
+        </w:rPr>
+        <w:t>Présenté par</w:t>
+      </w:r>
+      <w:r>
+        <w:rPr>
+          <w:lang w:val="fr-FR"/>
+        </w:rPr>
+        <w:t xml:space="preserve"> : </w:t>
+      </w:r>
+    </w:p>
+    <w:p>
+      <w:pPr>
+        <w:spacing w:line="240" w:lineRule="auto"/>
+        <w:ind w:left="10" w:right="55" w:hanging="10"/>
+        <w:jc w:val="center"/>
+        <w:rPr>
+          <w:lang w:val="fr-FR"/>
+        </w:rPr>
+      </w:pPr>
+    </w:p>
+    <w:p>
+      <w:pPr>
+        <w:spacing w:line="240" w:lineRule="auto"/>
+        <w:jc w:val="center"/>
+        <w:rPr>
+          <w:b/>
+          <w:sz w:val="24"/>
+          <w:szCs w:val="24"/>
+          <w:lang w:val="fr-FR"/>
+        </w:rPr>
+      </w:pPr>
+      <w:r>
+        <w:rPr>
+          <w:b/>
+          <w:sz w:val="24"/>
+          <w:szCs w:val="24"/>
+          <w:lang w:val="fr-FR"/>
+        </w:rPr>
+        <w:t xml:space="preserve">TAHIENDRAZA </w:t>
+      </w:r>
+      <w:proofErr w:type="spellStart"/>
+      <w:r>
+        <w:rPr>
+          <w:b/>
+          <w:sz w:val="24"/>
+          <w:szCs w:val="24"/>
+          <w:lang w:val="fr-FR"/>
+        </w:rPr>
+        <w:t>Ravilimita</w:t>
+      </w:r>
+      <w:proofErr w:type="spellEnd"/>
+      <w:r>
+        <w:rPr>
+          <w:b/>
+          <w:sz w:val="24"/>
+          <w:szCs w:val="24"/>
+          <w:lang w:val="fr-FR"/>
+        </w:rPr>
+        <w:t xml:space="preserve"> Zidane</w:t>
+      </w:r>
+    </w:p>
+    <w:p>
+      <w:pPr>
+        <w:ind w:right="1"/>
+        <w:rPr>
+          <w:lang w:val="fr-FR"/>
+        </w:rPr>
+      </w:pPr>
+    </w:p>
+    <w:p>
+      <w:pPr>
+        <w:ind w:right="1"/>
+        <w:rPr>
+          <w:lang w:val="fr-FR"/>
+        </w:rPr>
+      </w:pPr>
+    </w:p>
+    <w:p>
+      <w:pPr>
+        <w:ind w:right="1"/>
+        <w:rPr>
+          <w:lang w:val="fr-FR"/>
+        </w:rPr>
+      </w:pPr>
+      <w:r>
+        <w:rPr>
+          <w:lang w:val="fr-FR"/>
+        </w:rPr>
+        <w:t>Semestre : S5</w:t>
+      </w:r>
+    </w:p>
+    <w:p>
+      <w:pPr>
+        <w:spacing w:after="1323"/>
+        <w:ind w:left="10" w:right="30" w:hanging="10"/>
+        <w:rPr>
+          <w:lang w:val="fr-FR"/>
+        </w:rPr>
+      </w:pPr>
+      <w:r>
+        <w:rPr>
+          <w:lang w:val="fr-FR"/>
+        </w:rPr>
+        <w:t xml:space="preserve">ANNEE UNIVERSITAIRE : 2024- 2025 </w:t>
+      </w:r>
+    </w:p>
+    <w:p>
+      <w:pPr>
+        <w:jc w:val="center"/>
+        <w:rPr>
+          <w:rFonts w:ascii="Times New Roman" w:hAnsi="Times New Roman" w:cs="Times New Roman"/>
+          <w:sz w:val="36"/>
+          <w:szCs w:val="36"/>
+          <w:lang w:val="fr-FR"/>
+        </w:rPr>
+      </w:pPr>
+      <w:r>
+        <w:rPr>
+          <w:rFonts w:ascii="Times New Roman" w:hAnsi="Times New Roman" w:cs="Times New Roman"/>
+          <w:sz w:val="36"/>
+          <w:szCs w:val="36"/>
+          <w:lang w:val="fr-FR"/>
+        </w:rPr>
+        <w:lastRenderedPageBreak/>
+        <w:t>SOMMAIRE</w:t>
+      </w:r>
+    </w:p>
+    <w:p>
+      <w:pPr>
+        <w:spacing w:after="200" w:line="276" w:lineRule="auto"/>
+        <w:rPr>
+          <w:rFonts w:ascii="Times New Roman" w:hAnsi="Times New Roman" w:cs="Times New Roman"/>
+          <w:sz w:val="24"/>
+          <w:szCs w:val="24"/>
+          <w:lang w:val="fr-FR"/>
+        </w:rPr>
+      </w:pPr>
+    </w:p>
+    <w:p>
+      <w:pPr>
+        <w:rPr>
+          <w:rFonts w:ascii="Times New Roman" w:hAnsi="Times New Roman" w:cs="Times New Roman"/>
+          <w:sz w:val="24"/>
+          <w:szCs w:val="24"/>
+          <w:lang w:val="fr-FR"/>
+        </w:rPr>
+      </w:pPr>
+      <w:r>
+        <w:rPr>
+          <w:rFonts w:ascii="Times New Roman" w:hAnsi="Times New Roman" w:cs="Times New Roman"/>
+          <w:sz w:val="24"/>
+          <w:szCs w:val="24"/>
+          <w:lang w:val="fr-FR"/>
+        </w:rPr>
+        <w:t>SOMMAIRE</w:t>
+      </w:r>
+      <w:r>
+        <w:rPr>
+          <w:rFonts w:ascii="Times New Roman" w:hAnsi="Times New Roman" w:cs="Times New Roman"/>
+          <w:sz w:val="24"/>
+          <w:szCs w:val="24"/>
+          <w:lang w:val="fr-FR"/>
+        </w:rPr>
+        <w:t xml:space="preserve"> </w:t>
+      </w:r>
+      <w:r>
+        <w:rPr>
+          <w:rFonts w:ascii="Times New Roman" w:hAnsi="Times New Roman" w:cs="Times New Roman"/>
+          <w:sz w:val="24"/>
+          <w:szCs w:val="24"/>
+          <w:lang w:val="fr-FR"/>
+        </w:rPr>
+        <w:t>:</w:t>
+      </w:r>
+      <w:r>
+        <w:rPr>
+          <w:rFonts w:ascii="Times New Roman" w:hAnsi="Times New Roman" w:cs="Times New Roman"/>
+          <w:sz w:val="24"/>
+          <w:szCs w:val="24"/>
+          <w:lang w:val="fr-FR"/>
+        </w:rPr>
+        <w:t xml:space="preserve"> ……………………………………………………………………… 1</w:t>
+      </w:r>
+    </w:p>
+    <w:p>
+      <w:pPr>
+        <w:rPr>
+          <w:rFonts w:ascii="Times New Roman" w:hAnsi="Times New Roman" w:cs="Times New Roman"/>
+          <w:sz w:val="24"/>
+          <w:szCs w:val="24"/>
+          <w:lang w:val="fr-FR"/>
+        </w:rPr>
+      </w:pPr>
+      <w:r>
+        <w:rPr>
+          <w:rFonts w:ascii="Times New Roman" w:hAnsi="Times New Roman" w:cs="Times New Roman"/>
+          <w:sz w:val="24"/>
+          <w:szCs w:val="24"/>
+          <w:lang w:val="fr-FR"/>
+        </w:rPr>
+        <w:t>LISTES DES ABREVIATIONS : ………………………………………</w:t>
+      </w:r>
+      <w:r>
+        <w:rPr>
+          <w:rFonts w:ascii="Times New Roman" w:hAnsi="Times New Roman" w:cs="Times New Roman"/>
+          <w:sz w:val="24"/>
+          <w:szCs w:val="24"/>
+          <w:lang w:val="fr-FR"/>
+        </w:rPr>
+        <w:t>………</w:t>
+      </w:r>
+      <w:r>
+        <w:rPr>
+          <w:rFonts w:ascii="Times New Roman" w:hAnsi="Times New Roman" w:cs="Times New Roman"/>
+          <w:sz w:val="24"/>
+          <w:szCs w:val="24"/>
+          <w:lang w:val="fr-FR"/>
+        </w:rPr>
+        <w:t>….  2</w:t>
+      </w:r>
+    </w:p>
+    <w:p>
+      <w:pPr>
+        <w:rPr>
+          <w:rFonts w:ascii="Times New Roman" w:hAnsi="Times New Roman" w:cs="Times New Roman"/>
+          <w:sz w:val="24"/>
+          <w:szCs w:val="24"/>
+          <w:lang w:val="fr-FR"/>
+        </w:rPr>
+      </w:pPr>
+      <w:r>
+        <w:rPr>
+          <w:rFonts w:ascii="Times New Roman" w:hAnsi="Times New Roman" w:cs="Times New Roman"/>
+          <w:sz w:val="24"/>
+          <w:szCs w:val="24"/>
+          <w:lang w:val="fr-FR"/>
+        </w:rPr>
+        <w:t xml:space="preserve">LISTES DES </w:t>
+      </w:r>
+      <w:r>
+        <w:rPr>
+          <w:rFonts w:ascii="Times New Roman" w:hAnsi="Times New Roman" w:cs="Times New Roman"/>
+          <w:sz w:val="24"/>
+          <w:szCs w:val="24"/>
+          <w:lang w:val="fr-FR"/>
+        </w:rPr>
+        <w:t>FIGURES : ……………………………………………………</w:t>
+      </w:r>
+      <w:proofErr w:type="gramStart"/>
+      <w:r>
+        <w:rPr>
+          <w:rFonts w:ascii="Times New Roman" w:hAnsi="Times New Roman" w:cs="Times New Roman"/>
+          <w:sz w:val="24"/>
+          <w:szCs w:val="24"/>
+          <w:lang w:val="fr-FR"/>
+        </w:rPr>
+        <w:t>…</w:t>
+      </w:r>
+      <w:r>
+        <w:rPr>
+          <w:rFonts w:ascii="Times New Roman" w:hAnsi="Times New Roman" w:cs="Times New Roman"/>
+          <w:sz w:val="24"/>
+          <w:szCs w:val="24"/>
+          <w:lang w:val="fr-FR"/>
+        </w:rPr>
+        <w:t>…</w:t>
+      </w:r>
+      <w:r>
+        <w:rPr>
+          <w:rFonts w:ascii="Times New Roman" w:hAnsi="Times New Roman" w:cs="Times New Roman"/>
+          <w:sz w:val="24"/>
+          <w:szCs w:val="24"/>
+          <w:lang w:val="fr-FR"/>
+        </w:rPr>
+        <w:t>.</w:t>
+      </w:r>
+      <w:proofErr w:type="gramEnd"/>
+      <w:r>
+        <w:rPr>
+          <w:rFonts w:ascii="Times New Roman" w:hAnsi="Times New Roman" w:cs="Times New Roman"/>
+          <w:sz w:val="24"/>
+          <w:szCs w:val="24"/>
+          <w:lang w:val="fr-FR"/>
+        </w:rPr>
+        <w:t>.  3</w:t>
+      </w:r>
+    </w:p>
+    <w:p>
+      <w:pPr>
+        <w:rPr>
+          <w:rFonts w:ascii="Times New Roman" w:hAnsi="Times New Roman" w:cs="Times New Roman"/>
+          <w:sz w:val="24"/>
+          <w:szCs w:val="24"/>
+          <w:lang w:val="fr-FR"/>
+        </w:rPr>
+      </w:pPr>
+      <w:r>
+        <w:rPr>
+          <w:rFonts w:ascii="Times New Roman" w:hAnsi="Times New Roman" w:cs="Times New Roman"/>
+          <w:sz w:val="24"/>
+          <w:szCs w:val="24"/>
+          <w:lang w:val="fr-FR"/>
+        </w:rPr>
+        <w:t xml:space="preserve">INTRODUCTION : ………………………………………………………………… </w:t>
+      </w:r>
+      <w:r>
+        <w:rPr>
+          <w:rFonts w:ascii="Times New Roman" w:hAnsi="Times New Roman" w:cs="Times New Roman"/>
+          <w:sz w:val="24"/>
+          <w:szCs w:val="24"/>
+          <w:lang w:val="fr-FR"/>
+        </w:rPr>
+        <w:t>4</w:t>
+      </w:r>
+    </w:p>
+    <w:p>
+      <w:pPr>
+        <w:rPr>
+          <w:rFonts w:ascii="Times New Roman" w:hAnsi="Times New Roman" w:cs="Times New Roman"/>
+          <w:sz w:val="24"/>
+          <w:szCs w:val="24"/>
+          <w:lang w:val="fr-FR"/>
+        </w:rPr>
+      </w:pPr>
+      <w:r>
+        <w:rPr>
+          <w:rFonts w:ascii="Times New Roman" w:hAnsi="Times New Roman" w:cs="Times New Roman"/>
+          <w:sz w:val="24"/>
+          <w:szCs w:val="24"/>
+          <w:lang w:val="fr-FR"/>
+        </w:rPr>
+        <w:t xml:space="preserve">PLAN DE DEVOIRE : </w:t>
+      </w:r>
+    </w:p>
+    <w:p>
+      <w:pPr>
+        <w:pStyle w:val="Titre4"/>
+        <w:rPr>
+          <w:rFonts w:ascii="Times New Roman" w:hAnsi="Times New Roman" w:cs="Times New Roman"/>
+          <w:b w:val="0"/>
+          <w:i w:val="0"/>
+          <w:color w:val="000000" w:themeColor="text1"/>
+          <w:lang w:val="fr-FR"/>
+        </w:rPr>
+      </w:pPr>
+      <w:r>
+        <w:rPr>
+          <w:rFonts w:ascii="Times New Roman" w:hAnsi="Times New Roman" w:cs="Times New Roman"/>
+          <w:sz w:val="24"/>
+          <w:szCs w:val="24"/>
+          <w:lang w:val="fr-FR"/>
+        </w:rPr>
+        <w:t xml:space="preserve">    </w:t>
+      </w:r>
+      <w:r>
+        <w:rPr>
+          <w:rFonts w:ascii="Times New Roman" w:hAnsi="Times New Roman" w:cs="Times New Roman"/>
+          <w:b w:val="0"/>
+          <w:i w:val="0"/>
+          <w:color w:val="000000" w:themeColor="text1"/>
+          <w:sz w:val="24"/>
+          <w:szCs w:val="24"/>
+          <w:lang w:val="fr-FR"/>
+        </w:rPr>
+        <w:t xml:space="preserve">PART 1 : </w:t>
+      </w:r>
+      <w:r>
+        <w:rPr>
+          <w:rStyle w:val="lev"/>
+          <w:rFonts w:ascii="Times New Roman" w:hAnsi="Times New Roman" w:cs="Times New Roman"/>
+          <w:i w:val="0"/>
+          <w:color w:val="000000" w:themeColor="text1"/>
+          <w:lang w:val="fr-FR"/>
+        </w:rPr>
+        <w:t xml:space="preserve"> ……………………………………………………………. </w:t>
+      </w:r>
+    </w:p>
+    <w:p>
+      <w:pPr>
+        <w:pStyle w:val="Titre4"/>
+        <w:rPr>
+          <w:rStyle w:val="lev"/>
+          <w:rFonts w:ascii="Times New Roman" w:hAnsi="Times New Roman" w:cs="Times New Roman"/>
+          <w:bCs/>
+          <w:i w:val="0"/>
+          <w:color w:val="000000" w:themeColor="text1"/>
+          <w:lang w:val="fr-FR"/>
+        </w:rPr>
+      </w:pPr>
+      <w:r>
+        <w:rPr>
+          <w:rFonts w:ascii="Times New Roman" w:hAnsi="Times New Roman" w:cs="Times New Roman"/>
+          <w:sz w:val="24"/>
+          <w:szCs w:val="24"/>
+          <w:lang w:val="fr-FR"/>
+        </w:rPr>
+        <w:t xml:space="preserve">    </w:t>
+      </w:r>
+      <w:r>
+        <w:rPr>
+          <w:rFonts w:ascii="Times New Roman" w:hAnsi="Times New Roman" w:cs="Times New Roman"/>
+          <w:b w:val="0"/>
+          <w:i w:val="0"/>
+          <w:color w:val="000000" w:themeColor="text1"/>
+          <w:sz w:val="24"/>
+          <w:szCs w:val="24"/>
+          <w:lang w:val="fr-FR"/>
+        </w:rPr>
+        <w:t xml:space="preserve">PART 2 : </w:t>
+      </w:r>
+      <w:r>
+        <w:rPr>
+          <w:rStyle w:val="lev"/>
+          <w:rFonts w:ascii="Times New Roman" w:hAnsi="Times New Roman" w:cs="Times New Roman"/>
+          <w:i w:val="0"/>
+          <w:color w:val="000000" w:themeColor="text1"/>
+          <w:lang w:val="fr-FR"/>
+        </w:rPr>
+        <w:t xml:space="preserve"> </w:t>
+      </w:r>
+      <w:proofErr w:type="gramStart"/>
+      <w:r>
+        <w:rPr>
+          <w:rStyle w:val="lev"/>
+          <w:rFonts w:ascii="Times New Roman" w:hAnsi="Times New Roman" w:cs="Times New Roman"/>
+          <w:i w:val="0"/>
+          <w:color w:val="000000" w:themeColor="text1"/>
+          <w:lang w:val="fr-FR"/>
+        </w:rPr>
+        <w:t>…….</w:t>
+      </w:r>
+      <w:proofErr w:type="gramEnd"/>
+      <w:r>
+        <w:rPr>
+          <w:rStyle w:val="lev"/>
+          <w:rFonts w:ascii="Times New Roman" w:hAnsi="Times New Roman" w:cs="Times New Roman"/>
+          <w:i w:val="0"/>
+          <w:color w:val="000000" w:themeColor="text1"/>
+          <w:lang w:val="fr-FR"/>
+        </w:rPr>
+        <w:t xml:space="preserve">……………………………………….… </w:t>
+      </w:r>
+    </w:p>
+    <w:p>
+      <w:pPr>
+        <w:rPr>
+          <w:lang w:val="fr-FR"/>
+        </w:rPr>
+      </w:pPr>
+    </w:p>
+    <w:p>
+      <w:pPr>
+        <w:rPr>
+          <w:rFonts w:ascii="Times New Roman" w:hAnsi="Times New Roman" w:cs="Times New Roman"/>
+          <w:sz w:val="24"/>
+          <w:szCs w:val="24"/>
+          <w:lang w:val="fr-FR"/>
+        </w:rPr>
+      </w:pPr>
+      <w:r>
+        <w:rPr>
+          <w:rFonts w:ascii="Times New Roman" w:hAnsi="Times New Roman" w:cs="Times New Roman"/>
+          <w:sz w:val="24"/>
+          <w:szCs w:val="24"/>
+          <w:lang w:val="fr-FR"/>
+        </w:rPr>
+        <w:t xml:space="preserve">CONCLUSION : …………………………………………………………………… </w:t>
+      </w:r>
+    </w:p>
+    <w:p/>
+    <w:p>
+      <w:r>
+        <w:rPr>
+          <w:rFonts w:ascii="Times New Roman" w:hAnsi="Times New Roman" w:cs="Times New Roman"/>
+          <w:noProof/>
+          <w:sz w:val="24"/>
+          <w:szCs w:val="24"/>
+        </w:rPr>
+        <mc:AlternateContent>
+          <mc:Choice Requires="wps">
+            <w:drawing>
+              <wp:anchor distT="0" distB="0" distL="114300" distR="114300" simplePos="0" relativeHeight="251669504" behindDoc="1" locked="0" layoutInCell="1" allowOverlap="1" wp14:anchorId="15B0FBB8" wp14:editId="20A91E27">
+                <wp:simplePos x="0" y="0"/>
+                <wp:positionH relativeFrom="column">
+                  <wp:posOffset>2734375</wp:posOffset>
+                </wp:positionH>
+                <wp:positionV relativeFrom="paragraph">
+                  <wp:posOffset>4776820</wp:posOffset>
+                </wp:positionV>
+                <wp:extent cx="588723" cy="413359"/>
+                <wp:effectExtent l="0" t="0" r="20955" b="25400"/>
+                <wp:wrapNone/>
+                <wp:docPr id="1" name="Vague 1"/>
+                <wp:cNvGraphicFramePr/>
+                <a:graphic xmlns:a="http://schemas.openxmlformats.org/drawingml/2006/main">
+                  <a:graphicData uri="http://schemas.microsoft.com/office/word/2010/wordprocessingShape">
+                    <wps:wsp>
+                      <wps:cNvSpPr/>
+                      <wps:spPr>
+                        <a:xfrm>
+                          <a:off x="0" y="0"/>
+                          <a:ext cx="588723" cy="413359"/>
+                        </a:xfrm>
+                        <a:prstGeom prst="wave">
+                          <a:avLst>
+                            <a:gd name="adj1" fmla="val 4087"/>
+                            <a:gd name="adj2" fmla="val -607"/>
+                          </a:avLst>
+                        </a:prstGeom>
+                        <a:noFill/>
+                        <a:ln w="19050"/>
+                      </wps:spPr>
+                      <wps:style>
+                        <a:lnRef idx="2">
+                          <a:schemeClr val="accent1">
+                            <a:shade val="50000"/>
+                          </a:schemeClr>
+                        </a:lnRef>
+                        <a:fillRef idx="1">
+                          <a:schemeClr val="accent1"/>
+                        </a:fillRef>
+                        <a:effectRef idx="0">
+                          <a:schemeClr val="accent1"/>
+                        </a:effectRef>
+                        <a:fontRef idx="minor">
+                          <a:schemeClr val="lt1"/>
+                        </a:fontRef>
+                      </wps:style>
+                      <wps:txbx>
+                        <w:txbxContent>
+                          <w:p>
+                            <w:pPr>
+                              <w:jc w:val="center"/>
+                              <w:rPr>
+                                <w:rFonts w:ascii="Times New Roman" w:hAnsi="Times New Roman" w:cs="Times New Roman"/>
+                                <w:color w:val="000000" w:themeColor="text1"/>
+                                <w:sz w:val="40"/>
+                                <w:szCs w:val="40"/>
+                              </w:rPr>
+                            </w:pPr>
+                            <w:r>
+                              <w:rPr>
+                                <w:rFonts w:ascii="Times New Roman" w:hAnsi="Times New Roman" w:cs="Times New Roman"/>
+                                <w:color w:val="000000" w:themeColor="text1"/>
+                                <w:sz w:val="40"/>
+                                <w:szCs w:val="40"/>
+                              </w:rPr>
+                              <w:t>1</w:t>
+                            </w:r>
+                          </w:p>
+                        </w:txbxContent>
+                      </wps:txbx>
+                      <wps:bodyPr rot="0" spcFirstLastPara="0" vertOverflow="overflow" horzOverflow="overflow" vert="horz" wrap="square" lIns="91440" tIns="45720" rIns="91440" bIns="45720" numCol="1" spcCol="0" rtlCol="0" fromWordArt="0" anchor="ctr" anchorCtr="0" forceAA="0" compatLnSpc="1">
+                        <a:prstTxWarp prst="textNoShape">
+                          <a:avLst/>
+                        </a:prstTxWarp>
+                        <a:noAutofit/>
+                      </wps:bodyPr>
+                    </wps:wsp>
+                  </a:graphicData>
+                </a:graphic>
+                <wp14:sizeRelH relativeFrom="margin">
+                  <wp14:pctWidth>0</wp14:pctWidth>
+                </wp14:sizeRelH>
+                <wp14:sizeRelV relativeFrom="margin">
+                  <wp14:pctHeight>0</wp14:pctHeight>
+                </wp14:sizeRelV>
+              </wp:anchor>
+            </w:drawing>
+          </mc:Choice>
+          <mc:Fallback>
+            <w:pict>
+              <v:shapetype w14:anchorId="15B0FBB8" id="_x0000_t64" coordsize="21600,21600" o:spt="64" adj="2809,10800" path="m@28@0c@27@1@26@3@25@0l@21@4c@22@5@23@6@24@4xe">
+                <v:formulas>
+                  <v:f eqn="val #0"/>
+                  <v:f eqn="prod @0 41 9"/>
+                  <v:f eqn="prod @0 23 9"/>
+                  <v:f eqn="sum 0 0 @2"/>
+                  <v:f eqn="sum 21600 0 #0"/>
+                  <v:f eqn="sum 21600 0 @1"/>
+                  <v:f eqn="sum 21600 0 @3"/>
+                  <v:f eqn="sum #1 0 10800"/>
+                  <v:f eqn="sum 21600 0 #1"/>
+                  <v:f eqn="prod @8 2 3"/>
+                  <v:f eqn="prod @8 4 3"/>
+                  <v:f eqn="prod @8 2 1"/>
+                  <v:f eqn="sum 21600 0 @9"/>
+                  <v:f eqn="sum 21600 0 @10"/>
+                  <v:f eqn="sum 21600 0 @11"/>
+                  <v:f eqn="prod #1 2 3"/>
+                  <v:f eqn="prod #1 4 3"/>
+                  <v:f eqn="prod #1 2 1"/>
+                  <v:f eqn="sum 21600 0 @15"/>
+                  <v:f eqn="sum 21600 0 @16"/>
+                  <v:f eqn="sum 21600 0 @17"/>
+                  <v:f eqn="if @7 @14 0"/>
+                  <v:f eqn="if @7 @13 @15"/>
+                  <v:f eqn="if @7 @12 @16"/>
+                  <v:f eqn="if @7 21600 @17"/>
+                  <v:f eqn="if @7 0 @20"/>
+                  <v:f eqn="if @7 @9 @19"/>
+                  <v:f eqn="if @7 @10 @18"/>
+                  <v:f eqn="if @7 @11 21600"/>
+                  <v:f eqn="sum @24 0 @21"/>
+                  <v:f eqn="sum @4 0 @0"/>
+                  <v:f eqn="max @21 @25"/>
+                  <v:f eqn="min @24 @28"/>
+                  <v:f eqn="prod @0 2 1"/>
+                  <v:f eqn="sum 21600 0 @33"/>
+                  <v:f eqn="mid @26 @27"/>
+                  <v:f eqn="mid @24 @28"/>
+                  <v:f eqn="mid @22 @23"/>
+                  <v:f eqn="mid @21 @25"/>
+                </v:formulas>
+                <v:path o:connecttype="custom" o:connectlocs="@35,@0;@38,10800;@37,@4;@36,10800" o:connectangles="270,180,90,0" textboxrect="@31,@33,@32,@34"/>
+                <v:handles>
+                  <v:h position="topLeft,#0" yrange="0,4459"/>
+                  <v:h position="#1,bottomRight" xrange="8640,12960"/>
+                </v:handles>
+              </v:shapetype>
+              <v:shape id="Vague 1" o:spid="_x0000_s1026" type="#_x0000_t64" style="position:absolute;margin-left:215.3pt;margin-top:376.15pt;width:46.35pt;height:32.55pt;z-index:-251646976;visibility:visible;mso-wrap-style:square;mso-width-percent:0;mso-height-percent:0;mso-wrap-distance-left:9pt;mso-wrap-distance-top:0;mso-wrap-distance-right:9pt;mso-wrap-distance-bottom:0;mso-position-horizontal:absolute;mso-position-horizontal-relative:text;mso-position-vertical:absolute;mso-position-vertical-relative:text;mso-width-percent:0;mso-height-percent:0;mso-width-relative:margin;mso-height-relative:margin;v-text-anchor:middle" o:gfxdata="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" adj="883,10669" filled="f" strokecolor="#1f4d78 [1604]" strokeweight="1.5pt">
+                <v:stroke joinstyle="miter"/>
+                <v:textbox>
+                  <w:txbxContent>
+                    <w:p>
+                      <w:pPr>
+                        <w:jc w:val="center"/>
+                        <w:rPr>
+                          <w:rFonts w:ascii="Times New Roman" w:hAnsi="Times New Roman" w:cs="Times New Roman"/>
+                          <w:color w:val="000000" w:themeColor="text1"/>
+                          <w:sz w:val="40"/>
+                          <w:szCs w:val="40"/>
+                        </w:rPr>
+                      </w:pPr>
+                      <w:r>
+                        <w:rPr>
+                          <w:rFonts w:ascii="Times New Roman" w:hAnsi="Times New Roman" w:cs="Times New Roman"/>
+                          <w:color w:val="000000" w:themeColor="text1"/>
+                          <w:sz w:val="40"/>
+                          <w:szCs w:val="40"/>
+                        </w:rPr>
+                        <w:t>1</w:t>
+                      </w:r>
+                    </w:p>
+                  </w:txbxContent>
+                </v:textbox>
+              </v:shape>
+            </w:pict>
+          </mc:Fallback>
+        </mc:AlternateContent>
+      </w:r>
+      <w:r>
+        <w:br w:type="page"/>
+      </w:r>
+    </w:p>
+    <w:p>
+      <w:pPr>
+        <w:jc w:val="center"/>
+        <w:rPr>
+          <w:rFonts w:ascii="Times New Roman" w:hAnsi="Times New Roman" w:cs="Times New Roman"/>
+          <w:sz w:val="28"/>
+          <w:szCs w:val="28"/>
+        </w:rPr>
+      </w:pPr>
+      <w:r>
+        <w:rPr>
+          <w:rFonts w:ascii="Times New Roman" w:hAnsi="Times New Roman" w:cs="Times New Roman"/>
+          <w:sz w:val="28"/>
+          <w:szCs w:val="28"/>
+        </w:rPr>
+        <w:lastRenderedPageBreak/>
+        <w:t>LISTES DES ABREVIATIONS</w:t>
+      </w:r>
+    </w:p>
+    <w:p>
+      <w:pPr>
+        <w:rPr>
+          <w:rFonts w:ascii="Times New Roman" w:hAnsi="Times New Roman" w:cs="Times New Roman"/>
+          <w:sz w:val="28"/>
+          <w:szCs w:val="28"/>
+        </w:rPr>
+      </w:pPr>
+      <w:r>
+        <w:rPr>
+          <w:rFonts w:ascii="Times New Roman" w:hAnsi="Times New Roman" w:cs="Times New Roman"/>
+          <w:noProof/>
+          <w:sz w:val="24"/>
+          <w:szCs w:val="24"/>
+        </w:rPr>
+        <mc:AlternateContent>
+          <mc:Choice Requires="wps">
+            <w:drawing>
+              <wp:anchor distT="0" distB="0" distL="114300" distR="114300" simplePos="0" relativeHeight="251671552" behindDoc="1" locked="0" layoutInCell="1" allowOverlap="1" wp14:anchorId="7D99349B" wp14:editId="0EFE6F0A">
+                <wp:simplePos x="0" y="0"/>
+                <wp:positionH relativeFrom="column">
+                  <wp:posOffset>2767418</wp:posOffset>
+                </wp:positionH>
+                <wp:positionV relativeFrom="paragraph">
+                  <wp:posOffset>8082915</wp:posOffset>
+                </wp:positionV>
+                <wp:extent cx="588723" cy="413359"/>
+                <wp:effectExtent l="0" t="0" r="20955" b="25400"/>
+                <wp:wrapNone/>
+                <wp:docPr id="2" name="Vague 2"/>
+                <wp:cNvGraphicFramePr/>
+                <a:graphic xmlns:a="http://schemas.openxmlformats.org/drawingml/2006/main">
+                  <a:graphicData uri="http://schemas.microsoft.com/office/word/2010/wordprocessingShape">
+                    <wps:wsp>
+                      <wps:cNvSpPr/>
+                      <wps:spPr>
+                        <a:xfrm>
+                          <a:off x="0" y="0"/>
+                          <a:ext cx="588723" cy="413359"/>
+                        </a:xfrm>
+                        <a:prstGeom prst="wave">
+                          <a:avLst>
+                            <a:gd name="adj1" fmla="val 4087"/>
+                            <a:gd name="adj2" fmla="val -607"/>
+                          </a:avLst>
+                        </a:prstGeom>
+                        <a:noFill/>
+                        <a:ln w="19050"/>
+                      </wps:spPr>
+                      <wps:style>
+                        <a:lnRef idx="2">
+                          <a:schemeClr val="accent1">
+                            <a:shade val="50000"/>
+                          </a:schemeClr>
+                        </a:lnRef>
+                        <a:fillRef idx="1">
+                          <a:schemeClr val="accent1"/>
+                        </a:fillRef>
+                        <a:effectRef idx="0">
+                          <a:schemeClr val="accent1"/>
+                        </a:effectRef>
+                        <a:fontRef idx="minor">
+                          <a:schemeClr val="lt1"/>
+                        </a:fontRef>
+                      </wps:style>
+                      <wps:txbx>
+                        <w:txbxContent>
+                          <w:p>
+                            <w:pPr>
+                              <w:jc w:val="center"/>
+                              <w:rPr>
+                                <w:rFonts w:ascii="Times New Roman" w:hAnsi="Times New Roman" w:cs="Times New Roman"/>
+                                <w:color w:val="000000" w:themeColor="text1"/>
+                                <w:sz w:val="40"/>
+                                <w:szCs w:val="40"/>
+                              </w:rPr>
+                            </w:pPr>
+                            <w:r>
+                              <w:rPr>
+                                <w:rFonts w:ascii="Times New Roman" w:hAnsi="Times New Roman" w:cs="Times New Roman"/>
+                                <w:color w:val="000000" w:themeColor="text1"/>
+                                <w:sz w:val="40"/>
+                                <w:szCs w:val="40"/>
+                              </w:rPr>
+                              <w:t>2</w:t>
+                            </w:r>
+                          </w:p>
+                        </w:txbxContent>
+                      </wps:txbx>
+                      <wps:bodyPr rot="0" spcFirstLastPara="0" vertOverflow="overflow" horzOverflow="overflow" vert="horz" wrap="square" lIns="91440" tIns="45720" rIns="91440" bIns="45720" numCol="1" spcCol="0" rtlCol="0" fromWordArt="0" anchor="ctr" anchorCtr="0" forceAA="0" compatLnSpc="1">
+                        <a:prstTxWarp prst="textNoShape">
+                          <a:avLst/>
+                        </a:prstTxWarp>
+                        <a:noAutofit/>
+                      </wps:bodyPr>
+                    </wps:wsp>
+                  </a:graphicData>
+                </a:graphic>
+                <wp14:sizeRelH relativeFrom="margin">
+                  <wp14:pctWidth>0</wp14:pctWidth>
+                </wp14:sizeRelH>
+                <wp14:sizeRelV relativeFrom="margin">
+                  <wp14:pctHeight>0</wp14:pctHeight>
+                </wp14:sizeRelV>
+              </wp:anchor>
+            </w:drawing>
+          </mc:Choice>
+          <mc:Fallback>
+            <w:pict>
+              <v:shape w14:anchorId="7D99349B" id="Vague 2" o:spid="_x0000_s1027" type="#_x0000_t64" style="position:absolute;margin-left:217.9pt;margin-top:636.45pt;width:46.35pt;height:32.55pt;z-index:-251644928;visibility:visible;mso-wrap-style:square;mso-width-percent:0;mso-height-percent:0;mso-wrap-distance-left:9pt;mso-wrap-distance-top:0;mso-wrap-distance-right:9pt;mso-wrap-distance-bottom:0;mso-position-horizontal:absolute;mso-position-horizontal-relative:text;mso-position-vertical:absolute;mso-position-vertical-relative:text;mso-width-percent:0;mso-height-percent:0;mso-width-relative:margin;mso-height-relative:margin;v-text-anchor:middle" o:gfxdata="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" adj="883,10669" filled="f" strokecolor="#1f4d78 [1604]" strokeweight="1.5pt">
+                <v:stroke joinstyle="miter"/>
+                <v:textbox>
+                  <w:txbxContent>
+                    <w:p>
+                      <w:pPr>
+                        <w:jc w:val="center"/>
+                        <w:rPr>
+                          <w:rFonts w:ascii="Times New Roman" w:hAnsi="Times New Roman" w:cs="Times New Roman"/>
+                          <w:color w:val="000000" w:themeColor="text1"/>
+                          <w:sz w:val="40"/>
+                          <w:szCs w:val="40"/>
+                        </w:rPr>
+                      </w:pPr>
+                      <w:r>
+                        <w:rPr>
+                          <w:rFonts w:ascii="Times New Roman" w:hAnsi="Times New Roman" w:cs="Times New Roman"/>
+                          <w:color w:val="000000" w:themeColor="text1"/>
+                          <w:sz w:val="40"/>
+                          <w:szCs w:val="40"/>
+                        </w:rPr>
+                        <w:t>2</w:t>
+                      </w:r>
+                    </w:p>
+                  </w:txbxContent>
+                </v:textbox>
+              </v:shape>
+            </w:pict>
+          </mc:Fallback>
+        </mc:AlternateContent>
+      </w:r>
+      <w:r>
+        <w:rPr>
+          <w:rFonts w:ascii="Times New Roman" w:hAnsi="Times New Roman" w:cs="Times New Roman"/>
+          <w:sz w:val="28"/>
+          <w:szCs w:val="28"/>
+        </w:rPr>
+        <w:br w:type="page"/>
+      </w:r>
+    </w:p>
+    <w:p>
+      <w:pPr>
+        <w:jc w:val="center"/>
+        <w:rPr>
+          <w:rFonts w:ascii="Times New Roman" w:hAnsi="Times New Roman" w:cs="Times New Roman"/>
+          <w:sz w:val="28"/>
+          <w:szCs w:val="28"/>
+        </w:rPr>
+      </w:pPr>
+      <w:r>
+        <w:rPr>
+          <w:rFonts w:ascii="Times New Roman" w:hAnsi="Times New Roman" w:cs="Times New Roman"/>
+          <w:sz w:val="28"/>
+          <w:szCs w:val="28"/>
+        </w:rPr>
+        <w:lastRenderedPageBreak/>
+        <w:t xml:space="preserve">LISTES DES </w:t>
+      </w:r>
+      <w:r>
+        <w:rPr>
+          <w:rFonts w:ascii="Times New Roman" w:hAnsi="Times New Roman" w:cs="Times New Roman"/>
+          <w:sz w:val="28"/>
+          <w:szCs w:val="28"/>
+        </w:rPr>
+        <w:t>FIGURES</w:t>
+      </w:r>
       <w:bookmarkStart w:id="0" w:name="_GoBack"/>
       <w:bookmarkEnd w:id="0"/>
+    </w:p>
+    <w:p>
+      <w:pPr>
+        <w:rPr>
+          <w:rFonts w:ascii="Times New Roman" w:hAnsi="Times New Roman" w:cs="Times New Roman"/>
+          <w:sz w:val="28"/>
+          <w:szCs w:val="28"/>
+        </w:rPr>
+      </w:pPr>
+      <w:r>
+        <w:rPr>
+          <w:rFonts w:ascii="Times New Roman" w:hAnsi="Times New Roman" w:cs="Times New Roman"/>
+          <w:noProof/>
+          <w:sz w:val="24"/>
+          <w:szCs w:val="24"/>
+        </w:rPr>
+        <mc:AlternateContent>
+          <mc:Choice Requires="wps">
+            <w:drawing>
+              <wp:anchor distT="0" distB="0" distL="114300" distR="114300" simplePos="0" relativeHeight="251673600" behindDoc="1" locked="0" layoutInCell="1" allowOverlap="1" wp14:anchorId="2624867F" wp14:editId="19998DCB">
+                <wp:simplePos x="0" y="0"/>
+                <wp:positionH relativeFrom="column">
+                  <wp:posOffset>2769529</wp:posOffset>
+                </wp:positionH>
+                <wp:positionV relativeFrom="paragraph">
+                  <wp:posOffset>8160054</wp:posOffset>
+                </wp:positionV>
+                <wp:extent cx="588723" cy="413359"/>
+                <wp:effectExtent l="0" t="0" r="20955" b="25400"/>
+                <wp:wrapNone/>
+                <wp:docPr id="4" name="Vague 4"/>
+                <wp:cNvGraphicFramePr/>
+                <a:graphic xmlns:a="http://schemas.openxmlformats.org/drawingml/2006/main">
+                  <a:graphicData uri="http://schemas.microsoft.com/office/word/2010/wordprocessingShape">
+                    <wps:wsp>
+                      <wps:cNvSpPr/>
+                      <wps:spPr>
+                        <a:xfrm>
+                          <a:off x="0" y="0"/>
+                          <a:ext cx="588723" cy="413359"/>
+                        </a:xfrm>
+                        <a:prstGeom prst="wave">
+                          <a:avLst>
+                            <a:gd name="adj1" fmla="val 4087"/>
+                            <a:gd name="adj2" fmla="val -607"/>
+                          </a:avLst>
+                        </a:prstGeom>
+                        <a:noFill/>
+                        <a:ln w="19050"/>
+                      </wps:spPr>
+                      <wps:style>
+                        <a:lnRef idx="2">
+                          <a:schemeClr val="accent1">
+                            <a:shade val="50000"/>
+                          </a:schemeClr>
+                        </a:lnRef>
+                        <a:fillRef idx="1">
+                          <a:schemeClr val="accent1"/>
+                        </a:fillRef>
+                        <a:effectRef idx="0">
+                          <a:schemeClr val="accent1"/>
+                        </a:effectRef>
+                        <a:fontRef idx="minor">
+                          <a:schemeClr val="lt1"/>
+                        </a:fontRef>
+                      </wps:style>
+                      <wps:txbx>
+                        <w:txbxContent>
+                          <w:p>
+                            <w:pPr>
+                              <w:jc w:val="center"/>
+                              <w:rPr>
+                                <w:rFonts w:ascii="Times New Roman" w:hAnsi="Times New Roman" w:cs="Times New Roman"/>
+                                <w:color w:val="000000" w:themeColor="text1"/>
+                                <w:sz w:val="40"/>
+                                <w:szCs w:val="40"/>
+                              </w:rPr>
+                            </w:pPr>
+                            <w:r>
+                              <w:rPr>
+                                <w:rFonts w:ascii="Times New Roman" w:hAnsi="Times New Roman" w:cs="Times New Roman"/>
+                                <w:color w:val="000000" w:themeColor="text1"/>
+                                <w:sz w:val="40"/>
+                                <w:szCs w:val="40"/>
+                              </w:rPr>
+                              <w:t>3</w:t>
+                            </w:r>
+                          </w:p>
+                        </w:txbxContent>
+                      </wps:txbx>
+                      <wps:bodyPr rot="0" spcFirstLastPara="0" vertOverflow="overflow" horzOverflow="overflow" vert="horz" wrap="square" lIns="91440" tIns="45720" rIns="91440" bIns="45720" numCol="1" spcCol="0" rtlCol="0" fromWordArt="0" anchor="ctr" anchorCtr="0" forceAA="0" compatLnSpc="1">
+                        <a:prstTxWarp prst="textNoShape">
+                          <a:avLst/>
+                        </a:prstTxWarp>
+                        <a:noAutofit/>
+                      </wps:bodyPr>
+                    </wps:wsp>
+                  </a:graphicData>
+                </a:graphic>
+                <wp14:sizeRelH relativeFrom="margin">
+                  <wp14:pctWidth>0</wp14:pctWidth>
+                </wp14:sizeRelH>
+                <wp14:sizeRelV relativeFrom="margin">
+                  <wp14:pctHeight>0</wp14:pctHeight>
+                </wp14:sizeRelV>
+              </wp:anchor>
+            </w:drawing>
+          </mc:Choice>
+          <mc:Fallback>
+            <w:pict>
+              <v:shape w14:anchorId="2624867F" id="Vague 4" o:spid="_x0000_s1028" type="#_x0000_t64" style="position:absolute;margin-left:218.05pt;margin-top:642.5pt;width:46.35pt;height:32.55pt;z-index:-251642880;visibility:visible;mso-wrap-style:square;mso-width-percent:0;mso-height-percent:0;mso-wrap-distance-left:9pt;mso-wrap-distance-top:0;mso-wrap-distance-right:9pt;mso-wrap-distance-bottom:0;mso-position-horizontal:absolute;mso-position-horizontal-relative:text;mso-position-vertical:absolute;mso-position-vertical-relative:text;mso-width-percent:0;mso-height-percent:0;mso-width-relative:margin;mso-height-relative:margin;v-text-anchor:middle" o:gfxdata="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" adj="883,10669" filled="f" strokecolor="#1f4d78 [1604]" strokeweight="1.5pt">
+                <v:stroke joinstyle="miter"/>
+                <v:textbox>
+                  <w:txbxContent>
+                    <w:p>
+                      <w:pPr>
+                        <w:jc w:val="center"/>
+                        <w:rPr>
+                          <w:rFonts w:ascii="Times New Roman" w:hAnsi="Times New Roman" w:cs="Times New Roman"/>
+                          <w:color w:val="000000" w:themeColor="text1"/>
+                          <w:sz w:val="40"/>
+                          <w:szCs w:val="40"/>
+                        </w:rPr>
+                      </w:pPr>
+                      <w:r>
+                        <w:rPr>
+                          <w:rFonts w:ascii="Times New Roman" w:hAnsi="Times New Roman" w:cs="Times New Roman"/>
+                          <w:color w:val="000000" w:themeColor="text1"/>
+                          <w:sz w:val="40"/>
+                          <w:szCs w:val="40"/>
+                        </w:rPr>
+                        <w:t>3</w:t>
+                      </w:r>
+                    </w:p>
+                  </w:txbxContent>
+                </v:textbox>
+              </v:shape>
+            </w:pict>
+          </mc:Fallback>
+        </mc:AlternateContent>
+      </w:r>
+      <w:r>
+        <w:rPr>
+          <w:rFonts w:ascii="Times New Roman" w:hAnsi="Times New Roman" w:cs="Times New Roman"/>
+          <w:sz w:val="28"/>
+          <w:szCs w:val="28"/>
+        </w:rPr>
+        <w:br w:type="page"/>
+      </w:r>
+    </w:p>
+    <w:p>
+      <w:pPr>
+        <w:jc w:val="center"/>
+        <w:rPr>
+          <w:rFonts w:ascii="Times New Roman" w:hAnsi="Times New Roman" w:cs="Times New Roman"/>
+          <w:sz w:val="28"/>
+          <w:szCs w:val="28"/>
+        </w:rPr>
+      </w:pPr>
+      <w:r>
+        <w:rPr>
+          <w:rFonts w:ascii="Times New Roman" w:hAnsi="Times New Roman" w:cs="Times New Roman"/>
+          <w:sz w:val="28"/>
+          <w:szCs w:val="28"/>
+        </w:rPr>
+        <w:lastRenderedPageBreak/>
+        <w:t>INTRODUCTION</w:t>
+      </w:r>
+    </w:p>
+    <w:p>
+      <w:pPr>
+        <w:rPr>
+          <w:rFonts w:ascii="Times New Roman" w:hAnsi="Times New Roman" w:cs="Times New Roman"/>
+          <w:sz w:val="28"/>
+          <w:szCs w:val="28"/>
+        </w:rPr>
+      </w:pPr>
+      <w:r>
+        <w:rPr>
+          <w:rFonts w:ascii="Times New Roman" w:hAnsi="Times New Roman" w:cs="Times New Roman"/>
+          <w:noProof/>
+          <w:sz w:val="24"/>
+          <w:szCs w:val="24"/>
+        </w:rPr>
+        <mc:AlternateContent>
+          <mc:Choice Requires="wps">
+            <w:drawing>
+              <wp:anchor distT="0" distB="0" distL="114300" distR="114300" simplePos="0" relativeHeight="251675648" behindDoc="1" locked="0" layoutInCell="1" allowOverlap="1" wp14:anchorId="26013A52" wp14:editId="2787EC70">
+                <wp:simplePos x="0" y="0"/>
+                <wp:positionH relativeFrom="column">
+                  <wp:posOffset>2805146</wp:posOffset>
+                </wp:positionH>
+                <wp:positionV relativeFrom="paragraph">
+                  <wp:posOffset>8089900</wp:posOffset>
+                </wp:positionV>
+                <wp:extent cx="588723" cy="413359"/>
+                <wp:effectExtent l="0" t="0" r="20955" b="25400"/>
+                <wp:wrapNone/>
+                <wp:docPr id="5" name="Vague 5"/>
+                <wp:cNvGraphicFramePr/>
+                <a:graphic xmlns:a="http://schemas.openxmlformats.org/drawingml/2006/main">
+                  <a:graphicData uri="http://schemas.microsoft.com/office/word/2010/wordprocessingShape">
+                    <wps:wsp>
+                      <wps:cNvSpPr/>
+                      <wps:spPr>
+                        <a:xfrm>
+                          <a:off x="0" y="0"/>
+                          <a:ext cx="588723" cy="413359"/>
+                        </a:xfrm>
+                        <a:prstGeom prst="wave">
+                          <a:avLst>
+                            <a:gd name="adj1" fmla="val 4087"/>
+                            <a:gd name="adj2" fmla="val -607"/>
+                          </a:avLst>
+                        </a:prstGeom>
+                        <a:noFill/>
+                        <a:ln w="19050"/>
+                      </wps:spPr>
+                      <wps:style>
+                        <a:lnRef idx="2">
+                          <a:schemeClr val="accent1">
+                            <a:shade val="50000"/>
+                          </a:schemeClr>
+                        </a:lnRef>
+                        <a:fillRef idx="1">
+                          <a:schemeClr val="accent1"/>
+                        </a:fillRef>
+                        <a:effectRef idx="0">
+                          <a:schemeClr val="accent1"/>
+                        </a:effectRef>
+                        <a:fontRef idx="minor">
+                          <a:schemeClr val="lt1"/>
+                        </a:fontRef>
+                      </wps:style>
+                      <wps:txbx>
+                        <w:txbxContent>
+                          <w:p>
+                            <w:pPr>
+                              <w:jc w:val="center"/>
+                              <w:rPr>
+                                <w:rFonts w:ascii="Times New Roman" w:hAnsi="Times New Roman" w:cs="Times New Roman"/>
+                                <w:color w:val="000000" w:themeColor="text1"/>
+                                <w:sz w:val="40"/>
+                                <w:szCs w:val="40"/>
+                              </w:rPr>
+                            </w:pPr>
+                            <w:r>
+                              <w:rPr>
+                                <w:rFonts w:ascii="Times New Roman" w:hAnsi="Times New Roman" w:cs="Times New Roman"/>
+                                <w:color w:val="000000" w:themeColor="text1"/>
+                                <w:sz w:val="40"/>
+                                <w:szCs w:val="40"/>
+                              </w:rPr>
+                              <w:t>4</w:t>
+                            </w:r>
+                          </w:p>
+                        </w:txbxContent>
+                      </wps:txbx>
+                      <wps:bodyPr rot="0" spcFirstLastPara="0" vertOverflow="overflow" horzOverflow="overflow" vert="horz" wrap="square" lIns="91440" tIns="45720" rIns="91440" bIns="45720" numCol="1" spcCol="0" rtlCol="0" fromWordArt="0" anchor="ctr" anchorCtr="0" forceAA="0" compatLnSpc="1">
+                        <a:prstTxWarp prst="textNoShape">
+                          <a:avLst/>
+                        </a:prstTxWarp>
+                        <a:noAutofit/>
+                      </wps:bodyPr>
+                    </wps:wsp>
+                  </a:graphicData>
+                </a:graphic>
+                <wp14:sizeRelH relativeFrom="margin">
+                  <wp14:pctWidth>0</wp14:pctWidth>
+                </wp14:sizeRelH>
+                <wp14:sizeRelV relativeFrom="margin">
+                  <wp14:pctHeight>0</wp14:pctHeight>
+                </wp14:sizeRelV>
+              </wp:anchor>
+            </w:drawing>
+          </mc:Choice>
+          <mc:Fallback>
+            <w:pict>
+              <v:shape w14:anchorId="26013A52" id="Vague 5" o:spid="_x0000_s1029" type="#_x0000_t64" style="position:absolute;margin-left:220.9pt;margin-top:637pt;width:46.35pt;height:32.55pt;z-index:-251640832;visibility:visible;mso-wrap-style:square;mso-width-percent:0;mso-height-percent:0;mso-wrap-distance-left:9pt;mso-wrap-distance-top:0;mso-wrap-distance-right:9pt;mso-wrap-distance-bottom:0;mso-position-horizontal:absolute;mso-position-horizontal-relative:text;mso-position-vertical:absolute;mso-position-vertical-relative:text;mso-width-percent:0;mso-height-percent:0;mso-width-relative:margin;mso-height-relative:margin;v-text-anchor:middle" o:gfxdata="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" adj="883,10669" filled="f" strokecolor="#1f4d78 [1604]" strokeweight="1.5pt">
+                <v:stroke joinstyle="miter"/>
+                <v:textbox>
+                  <w:txbxContent>
+                    <w:p>
+                      <w:pPr>
+                        <w:jc w:val="center"/>
+                        <w:rPr>
+                          <w:rFonts w:ascii="Times New Roman" w:hAnsi="Times New Roman" w:cs="Times New Roman"/>
+                          <w:color w:val="000000" w:themeColor="text1"/>
+                          <w:sz w:val="40"/>
+                          <w:szCs w:val="40"/>
+                        </w:rPr>
+                      </w:pPr>
+                      <w:r>
+                        <w:rPr>
+                          <w:rFonts w:ascii="Times New Roman" w:hAnsi="Times New Roman" w:cs="Times New Roman"/>
+                          <w:color w:val="000000" w:themeColor="text1"/>
+                          <w:sz w:val="40"/>
+                          <w:szCs w:val="40"/>
+                        </w:rPr>
+                        <w:t>4</w:t>
+                      </w:r>
+                    </w:p>
+                  </w:txbxContent>
+                </v:textbox>
+              </v:shape>
+            </w:pict>
+          </mc:Fallback>
+        </mc:AlternateContent>
+      </w:r>
+      <w:r>
+        <w:rPr>
+          <w:rFonts w:ascii="Times New Roman" w:hAnsi="Times New Roman" w:cs="Times New Roman"/>
+          <w:sz w:val="28"/>
+          <w:szCs w:val="28"/>
+        </w:rPr>
+        <w:br w:type="page"/>
+      </w:r>
+    </w:p>
+    <w:p>
+      <w:pPr>
+        <w:jc w:val="center"/>
+        <w:rPr>
+          <w:rFonts w:ascii="Times New Roman" w:hAnsi="Times New Roman" w:cs="Times New Roman"/>
+          <w:sz w:val="28"/>
+          <w:szCs w:val="28"/>
+        </w:rPr>
+      </w:pPr>
+    </w:p>
+    <w:p>
+      <w:pPr>
+        <w:rPr>
+          <w:rFonts w:ascii="Times New Roman" w:hAnsi="Times New Roman" w:cs="Times New Roman"/>
+          <w:sz w:val="28"/>
+          <w:szCs w:val="28"/>
+        </w:rPr>
+      </w:pPr>
+      <w:r>
+        <w:rPr>
+          <w:rFonts w:ascii="Times New Roman" w:hAnsi="Times New Roman" w:cs="Times New Roman"/>
+          <w:sz w:val="28"/>
+          <w:szCs w:val="28"/>
+        </w:rPr>
+        <w:br w:type="page"/>
+      </w:r>
+    </w:p>
+    <w:p>
+      <w:pPr>
+        <w:jc w:val="center"/>
+        <w:rPr>
+          <w:rFonts w:ascii="Times New Roman" w:hAnsi="Times New Roman" w:cs="Times New Roman"/>
+          <w:sz w:val="28"/>
+          <w:szCs w:val="28"/>
+        </w:rPr>
+      </w:pPr>
+    </w:p>
+    <w:p>
+      <w:pPr>
+        <w:rPr>
+          <w:rFonts w:ascii="Times New Roman" w:hAnsi="Times New Roman" w:cs="Times New Roman"/>
+          <w:sz w:val="28"/>
+          <w:szCs w:val="28"/>
+        </w:rPr>
+      </w:pPr>
+      <w:r>
+        <w:rPr>
+          <w:rFonts w:ascii="Times New Roman" w:hAnsi="Times New Roman" w:cs="Times New Roman"/>
+          <w:sz w:val="28"/>
+          <w:szCs w:val="28"/>
+        </w:rPr>
+        <w:br w:type="page"/>
+      </w:r>
+    </w:p>
+    <w:p>
+      <w:pPr>
+        <w:jc w:val="center"/>
+        <w:rPr>
+          <w:rFonts w:ascii="Times New Roman" w:hAnsi="Times New Roman" w:cs="Times New Roman"/>
+          <w:sz w:val="28"/>
+          <w:szCs w:val="28"/>
+        </w:rPr>
+      </w:pPr>
+    </w:p>
+    <w:p>
+      <w:pPr>
+        <w:rPr>
+          <w:rFonts w:ascii="Times New Roman" w:hAnsi="Times New Roman" w:cs="Times New Roman"/>
+          <w:sz w:val="28"/>
+          <w:szCs w:val="28"/>
+        </w:rPr>
+      </w:pPr>
+      <w:r>
+        <w:rPr>
+          <w:rFonts w:ascii="Times New Roman" w:hAnsi="Times New Roman" w:cs="Times New Roman"/>
+          <w:sz w:val="28"/>
+          <w:szCs w:val="28"/>
+        </w:rPr>
+        <w:br w:type="page"/>
+      </w:r>
+    </w:p>
+    <w:p>
+      <w:pPr>
+        <w:jc w:val="center"/>
+        <w:rPr>
+          <w:rFonts w:ascii="Times New Roman" w:hAnsi="Times New Roman" w:cs="Times New Roman"/>
+          <w:sz w:val="28"/>
+          <w:szCs w:val="28"/>
+        </w:rPr>
+      </w:pPr>
     </w:p>
     <w:sectPr>
       <w:pgSz w:w="12240" w:h="15840"/>
@@ -17,7 +2571,7 @@
 </file>
 
 <file path=word/styles.xml><?xml version="1.0" encoding="utf-8"?>
-<w:styles xmlns:mc="http://schemas.openxmlformats.org/markup-compatibility/2006" xmlns:r="http://schemas.openxmlformats.org/officeDocument/2006/relationships" xmlns:w="http://schemas.openxmlformats.org/wordprocessingml/2006/main" xmlns:w14="http://schemas.microsoft.com/office/word/2010/wordml" xmlns:w15="http://schemas.microsoft.com/office/word/2012/wordml" xmlns:w16se="http://schemas.microsoft.com/office/word/2015/wordml/symex" mc:Ignorable="w14 w15 w16se">
+<w:styles xmlns:mc="http://schemas.openxmlformats.org/markup-compatibility/2006" xmlns:r="http://schemas.openxmlformats.org/officeDocument/2006/relationships" xmlns:w="http://schemas.openxmlformats.org/wordprocessingml/2006/main" xmlns:w14="http://schemas.microsoft.com/office/word/2010/wordml" xmlns:w15="http://schemas.microsoft.com/office/word/2012/wordml" xmlns:w16cid="http://schemas.microsoft.com/office/word/2016/wordml/cid" xmlns:w16se="http://schemas.microsoft.com/office/word/2015/wordml/symex" mc:Ignorable="w14 w15 w16se w16cid">
   <w:docDefaults>
     <w:rPrDefault>
       <w:rPr>
@@ -33,7 +2587,7 @@
       </w:pPr>
     </w:pPrDefault>
   </w:docDefaults>
-  <w:latentStyles w:defLockedState="0" w:defUIPriority="99" w:defSemiHidden="0" w:defUnhideWhenUsed="0" w:defQFormat="0" w:count="371">
+  <w:latentStyles w:defLockedState="0" w:defUIPriority="99" w:defSemiHidden="0" w:defUnhideWhenUsed="0" w:defQFormat="0" w:count="377">
     <w:lsdException w:name="Normal" w:uiPriority="0" w:qFormat="1"/>
     <w:lsdException w:name="heading 1" w:uiPriority="9" w:qFormat="1"/>
     <w:lsdException w:name="heading 2" w:semiHidden="1" w:uiPriority="9" w:unhideWhenUsed="1" w:qFormat="1"/>
@@ -181,11 +2735,8 @@
     <w:lsdException w:name="Table 3D effects 3" w:semiHidden="1" w:unhideWhenUsed="1"/>
     <w:lsdException w:name="Table Contemporary" w:semiHidden="1" w:unhideWhenUsed="1"/>
     <w:lsdException w:name="Table Elegant" w:semiHidden="1" w:unhideWhenUsed="1"/>
-    <w:lsdException w:name="Table Professional" w:semiHidden="1" w:unhideWhenUsed="1"/>
     <w:lsdException w:name="Table Subtle 1" w:semiHidden="1" w:unhideWhenUsed="1"/>
     <w:lsdException w:name="Table Subtle 2" w:semiHidden="1" w:unhideWhenUsed="1"/>
-    <w:lsdException w:name="Table Web 1" w:semiHidden="1" w:unhideWhenUsed="1"/>
-    <w:lsdException w:name="Table Web 2" w:semiHidden="1" w:unhideWhenUsed="1"/>
     <w:lsdException w:name="Table Web 3" w:semiHidden="1" w:unhideWhenUsed="1"/>
     <w:lsdException w:name="Balloon Text" w:semiHidden="1" w:unhideWhenUsed="1"/>
     <w:lsdException w:name="Table Grid" w:uiPriority="39"/>
@@ -405,10 +2956,41 @@
     <w:lsdException w:name="List Table 5 Dark Accent 6" w:uiPriority="50"/>
     <w:lsdException w:name="List Table 6 Colorful Accent 6" w:uiPriority="51"/>
     <w:lsdException w:name="List Table 7 Colorful Accent 6" w:uiPriority="52"/>
+    <w:lsdException w:name="Mention" w:semiHidden="1" w:unhideWhenUsed="1"/>
+    <w:lsdException w:name="Smart Hyperlink" w:semiHidden="1" w:unhideWhenUsed="1"/>
+    <w:lsdException w:name="Hashtag" w:semiHidden="1" w:unhideWhenUsed="1"/>
+    <w:lsdException w:name="Unresolved Mention" w:semiHidden="1" w:unhideWhenUsed="1"/>
+    <w:lsdException w:name="Smart Link" w:semiHidden="1" w:unhideWhenUsed="1"/>
+    <w:lsdException w:name="Smart Link Error" w:semiHidden="1" w:unhideWhenUsed="1"/>
   </w:latentStyles>
   <w:style w:type="paragraph" w:default="1" w:styleId="Normal">
     <w:name w:val="Normal"/>
     <w:qFormat/>
+    <w:rsid w:val="006820E2"/>
+  </w:style>
+  <w:style w:type="paragraph" w:styleId="Titre4">
+    <w:name w:val="heading 4"/>
+    <w:basedOn w:val="Normal"/>
+    <w:next w:val="Normal"/>
+    <w:link w:val="Titre4Car"/>
+    <w:uiPriority w:val="9"/>
+    <w:unhideWhenUsed/>
+    <w:qFormat/>
+    <w:rsid w:val="00BE47F8"/>
+    <w:pPr>
+      <w:keepNext/>
+      <w:keepLines/>
+      <w:spacing w:before="200" w:after="0"/>
+      <w:outlineLvl w:val="3"/>
+    </w:pPr>
+    <w:rPr>
+      <w:rFonts w:asciiTheme="majorHAnsi" w:eastAsiaTheme="majorEastAsia" w:hAnsiTheme="majorHAnsi" w:cstheme="majorBidi"/>
+      <w:b/>
+      <w:bCs/>
+      <w:i/>
+      <w:iCs/>
+      <w:color w:val="5B9BD5" w:themeColor="accent1"/>
+    </w:rPr>
   </w:style>
   <w:style w:type="character" w:default="1" w:styleId="Policepardfaut">
     <w:name w:val="Default Paragraph Font"/>
@@ -436,6 +3018,32 @@
     <w:uiPriority w:val="99"/>
     <w:semiHidden/>
     <w:unhideWhenUsed/>
+  </w:style>
+  <w:style w:type="character" w:customStyle="1" w:styleId="Titre4Car">
+    <w:name w:val="Titre 4 Car"/>
+    <w:basedOn w:val="Policepardfaut"/>
+    <w:link w:val="Titre4"/>
+    <w:uiPriority w:val="9"/>
+    <w:rsid w:val="00BE47F8"/>
+    <w:rPr>
+      <w:rFonts w:asciiTheme="majorHAnsi" w:eastAsiaTheme="majorEastAsia" w:hAnsiTheme="majorHAnsi" w:cstheme="majorBidi"/>
+      <w:b/>
+      <w:bCs/>
+      <w:i/>
+      <w:iCs/>
+      <w:color w:val="5B9BD5" w:themeColor="accent1"/>
+    </w:rPr>
+  </w:style>
+  <w:style w:type="character" w:styleId="lev">
+    <w:name w:val="Strong"/>
+    <w:basedOn w:val="Policepardfaut"/>
+    <w:uiPriority w:val="22"/>
+    <w:qFormat/>
+    <w:rsid w:val="00BE47F8"/>
+    <w:rPr>
+      <w:b/>
+      <w:bCs/>
+    </w:rPr>
   </w:style>
 </w:styles>
 </file>

</xml_diff>

<commit_message>
présentation plan dans fichier word
</commit_message>
<xml_diff>
--- a/Projet_TAHIENDRAZA Ravilimita  Zidane/Présentation Word.docx
+++ b/Projet_TAHIENDRAZA Ravilimita  Zidane/Présentation Word.docx
@@ -1,6 +1,6 @@
 
 <file path=word/document.xml><?xml version="1.0" encoding="utf-8"?>
-<w:document xmlns:wpc="http://schemas.microsoft.com/office/word/2010/wordprocessingCanvas" xmlns:cx="http://schemas.microsoft.com/office/drawing/2014/chartex" xmlns:cx1="http://schemas.microsoft.com/office/drawing/2015/9/8/chartex" xmlns:cx2="http://schemas.microsoft.com/office/drawing/2015/10/21/chartex" xmlns:cx3="http://schemas.microsoft.com/office/drawing/2016/5/9/chartex" xmlns:cx4="http://schemas.microsoft.com/office/drawing/2016/5/10/chartex" xmlns:cx5="http://schemas.microsoft.com/office/drawing/2016/5/11/chartex" xmlns:cx6="http://schemas.microsoft.com/office/drawing/2016/5/12/chartex" xmlns:cx7="http://schemas.microsoft.com/office/drawing/2016/5/13/chartex" xmlns:cx8="http://schemas.microsoft.com/office/drawing/2016/5/14/chartex" xmlns:mc="http://schemas.openxmlformats.org/markup-compatibility/2006" xmlns:aink="http://schemas.microsoft.com/office/drawing/2016/ink" xmlns:am3d="http://schemas.microsoft.com/office/drawing/2017/model3d" xmlns:o="urn:schemas-microsoft-com:office:office" xmlns:r="http://schemas.openxmlformats.org/officeDocument/2006/relationships" xmlns:m="http://schemas.openxmlformats.org/officeDocument/2006/math" xmlns:v="urn:schemas-microsoft-com:vml" xmlns:wp14="http://schemas.microsoft.com/office/word/2010/wordprocessingDrawing" xmlns:wp="http://schemas.openxmlformats.org/drawingml/2006/wordprocessingDrawing" xmlns:w10="urn:schemas-microsoft-com:office:word" xmlns:w="http://schemas.openxmlformats.org/wordprocessingml/2006/main" xmlns:w14="http://schemas.microsoft.com/office/word/2010/wordml" xmlns:w15="http://schemas.microsoft.com/office/word/2012/wordml" xmlns:w16cid="http://schemas.microsoft.com/office/word/2016/wordml/cid" xmlns:w16se="http://schemas.microsoft.com/office/word/2015/wordml/symex" xmlns:wpg="http://schemas.microsoft.com/office/word/2010/wordprocessingGroup" xmlns:wpi="http://schemas.microsoft.com/office/word/2010/wordprocessingInk" xmlns:wne="http://schemas.microsoft.com/office/word/2006/wordml" xmlns:wps="http://schemas.microsoft.com/office/word/2010/wordprocessingShape" mc:Ignorable="w14 w15 w16se w16cid wp14">
+<w:document xmlns:wpc="http://schemas.microsoft.com/office/word/2010/wordprocessingCanvas" xmlns:cx="http://schemas.microsoft.com/office/drawing/2014/chartex" xmlns:cx1="http://schemas.microsoft.com/office/drawing/2015/9/8/chartex" xmlns:cx2="http://schemas.microsoft.com/office/drawing/2015/10/21/chartex" xmlns:cx3="http://schemas.microsoft.com/office/drawing/2016/5/9/chartex" xmlns:cx4="http://schemas.microsoft.com/office/drawing/2016/5/10/chartex" xmlns:cx5="http://schemas.microsoft.com/office/drawing/2016/5/11/chartex" xmlns:cx6="http://schemas.microsoft.com/office/drawing/2016/5/12/chartex" xmlns:cx7="http://schemas.microsoft.com/office/drawing/2016/5/13/chartex" xmlns:cx8="http://schemas.microsoft.com/office/drawing/2016/5/14/chartex" xmlns:mc="http://schemas.openxmlformats.org/markup-compatibility/2006" xmlns:aink="http://schemas.microsoft.com/office/drawing/2016/ink" xmlns:am3d="http://schemas.microsoft.com/office/drawing/2017/model3d" xmlns:o="urn:schemas-microsoft-com:office:office" xmlns:oel="http://schemas.microsoft.com/office/2019/extlst" xmlns:r="http://schemas.openxmlformats.org/officeDocument/2006/relationships" xmlns:m="http://schemas.openxmlformats.org/officeDocument/2006/math" xmlns:v="urn:schemas-microsoft-com:vml" xmlns:wp14="http://schemas.microsoft.com/office/word/2010/wordprocessingDrawing" xmlns:wp="http://schemas.openxmlformats.org/drawingml/2006/wordprocessingDrawing" xmlns:w10="urn:schemas-microsoft-com:office:word" xmlns:w="http://schemas.openxmlformats.org/wordprocessingml/2006/main" xmlns:w14="http://schemas.microsoft.com/office/word/2010/wordml" xmlns:w15="http://schemas.microsoft.com/office/word/2012/wordml" xmlns:w16cex="http://schemas.microsoft.com/office/word/2018/wordml/cex" xmlns:w16cid="http://schemas.microsoft.com/office/word/2016/wordml/cid" xmlns:w16="http://schemas.microsoft.com/office/word/2018/wordml" xmlns:w16du="http://schemas.microsoft.com/office/word/2023/wordml/word16du" xmlns:w16sdtdh="http://schemas.microsoft.com/office/word/2020/wordml/sdtdatahash" xmlns:w16sdtfl="http://schemas.microsoft.com/office/word/2024/wordml/sdtformatlock" xmlns:w16se="http://schemas.microsoft.com/office/word/2015/wordml/symex" xmlns:wpg="http://schemas.microsoft.com/office/word/2010/wordprocessingGroup" xmlns:wpi="http://schemas.microsoft.com/office/word/2010/wordprocessingInk" xmlns:wne="http://schemas.microsoft.com/office/word/2006/wordml" xmlns:wps="http://schemas.microsoft.com/office/word/2010/wordprocessingShape" mc:Ignorable="w14 w15 w16se w16cid w16 w16cex w16sdtdh w16sdtfl w16du wp14">
   <w:body>
     <w:p>
       <w:pPr>
@@ -9,9 +9,13 @@
         </w:tabs>
         <w:spacing w:after="150" w:line="240" w:lineRule="auto"/>
         <w:ind w:right="288"/>
-      </w:pPr>
-      <w:r>
-        <w:rPr>
+        <w:rPr>
+          <w:rFonts w:ascii="Times New Roman" w:hAnsi="Times New Roman" w:cs="Times New Roman"/>
+        </w:rPr>
+      </w:pPr>
+      <w:r>
+        <w:rPr>
+          <w:rFonts w:ascii="Times New Roman" w:hAnsi="Times New Roman" w:cs="Times New Roman"/>
           <w:b/>
           <w:noProof/>
         </w:rPr>
@@ -37,7 +41,7 @@
                     <pic:cNvPicPr/>
                   </pic:nvPicPr>
                   <pic:blipFill>
-                    <a:blip r:embed="rId4"/>
+                    <a:blip r:embed="rId5"/>
                     <a:stretch>
                       <a:fillRect/>
                     </a:stretch>
@@ -59,6 +63,7 @@
       </w:r>
       <w:r>
         <w:rPr>
+          <w:rFonts w:ascii="Times New Roman" w:hAnsi="Times New Roman" w:cs="Times New Roman"/>
           <w:b/>
           <w:noProof/>
         </w:rPr>
@@ -84,7 +89,7 @@
                     <pic:cNvPicPr/>
                   </pic:nvPicPr>
                   <pic:blipFill>
-                    <a:blip r:embed="rId5"/>
+                    <a:blip r:embed="rId6"/>
                     <a:stretch>
                       <a:fillRect/>
                     </a:stretch>
@@ -110,12 +115,14 @@
         <w:spacing w:line="240" w:lineRule="auto"/>
         <w:jc w:val="center"/>
         <w:rPr>
+          <w:rFonts w:ascii="Times New Roman" w:hAnsi="Times New Roman" w:cs="Times New Roman"/>
           <w:b/>
           <w:lang w:val="fr-FR"/>
         </w:rPr>
       </w:pPr>
       <w:r>
         <w:rPr>
+          <w:rFonts w:ascii="Times New Roman" w:hAnsi="Times New Roman" w:cs="Times New Roman"/>
           <w:b/>
           <w:lang w:val="fr-FR"/>
         </w:rPr>
@@ -127,31 +134,22 @@
         <w:spacing w:line="240" w:lineRule="auto"/>
         <w:jc w:val="center"/>
         <w:rPr>
+          <w:rFonts w:ascii="Times New Roman" w:hAnsi="Times New Roman" w:cs="Times New Roman"/>
           <w:b/>
           <w:i/>
           <w:sz w:val="20"/>
           <w:lang w:val="fr-FR"/>
         </w:rPr>
       </w:pPr>
-      <w:proofErr w:type="spellStart"/>
-      <w:r>
-        <w:rPr>
+      <w:r>
+        <w:rPr>
+          <w:rFonts w:ascii="Times New Roman" w:hAnsi="Times New Roman" w:cs="Times New Roman"/>
           <w:b/>
           <w:i/>
           <w:sz w:val="20"/>
           <w:lang w:val="fr-FR"/>
         </w:rPr>
-        <w:t>Fitiavana-Tanindrazana-Fandrosoana</w:t>
-      </w:r>
-      <w:proofErr w:type="spellEnd"/>
-      <w:r>
-        <w:rPr>
-          <w:b/>
-          <w:i/>
-          <w:sz w:val="20"/>
-          <w:lang w:val="fr-FR"/>
-        </w:rPr>
-        <w:t xml:space="preserve">                                                                                            </w:t>
+        <w:t xml:space="preserve">Fitiavana-Tanindrazana-Fandrosoana                                                                                            </w:t>
       </w:r>
     </w:p>
     <w:p>
@@ -163,6 +161,7 @@
         <w:ind w:right="-15"/>
         <w:jc w:val="center"/>
         <w:rPr>
+          <w:rFonts w:ascii="Times New Roman" w:hAnsi="Times New Roman" w:cs="Times New Roman"/>
           <w:b/>
           <w:color w:val="0909E9"/>
           <w:sz w:val="23"/>
@@ -172,7 +171,7 @@
       </w:pPr>
       <w:r>
         <w:rPr>
-          <w:rFonts w:ascii="Calibri" w:eastAsia="Calibri" w:hAnsi="Calibri" w:cs="Calibri"/>
+          <w:rFonts w:ascii="Times New Roman" w:eastAsia="Calibri" w:hAnsi="Times New Roman" w:cs="Times New Roman"/>
           <w:noProof/>
         </w:rPr>
         <mc:AlternateContent>
@@ -267,6 +266,7 @@
       </w:r>
       <w:r>
         <w:rPr>
+          <w:rFonts w:ascii="Times New Roman" w:hAnsi="Times New Roman" w:cs="Times New Roman"/>
           <w:b/>
           <w:color w:val="0909E9"/>
           <w:sz w:val="23"/>
@@ -277,42 +277,17 @@
       </w:r>
       <w:r>
         <w:rPr>
+          <w:rFonts w:ascii="Times New Roman" w:hAnsi="Times New Roman" w:cs="Times New Roman"/>
           <w:b/>
           <w:color w:val="0909E9"/>
           <w:vertAlign w:val="superscript"/>
           <w:lang w:val="fr-FR"/>
         </w:rPr>
-        <w:t>Mahajanga</w:t>
-      </w:r>
-      <w:r>
-        <w:rPr>
-          <w:b/>
-          <w:color w:val="0909E9"/>
-          <w:vertAlign w:val="superscript"/>
-          <w:lang w:val="fr-FR"/>
-        </w:rPr>
-        <w:t xml:space="preserve">                                                                                                                            </w:t>
-      </w:r>
-      <w:r>
-        <w:rPr>
-          <w:b/>
-          <w:color w:val="0909E9"/>
-          <w:vertAlign w:val="superscript"/>
-          <w:lang w:val="fr-FR"/>
-        </w:rPr>
-        <w:t xml:space="preserve">                                         </w:t>
-      </w:r>
-      <w:r>
-        <w:rPr>
-          <w:b/>
-          <w:color w:val="0909E9"/>
-          <w:vertAlign w:val="superscript"/>
-          <w:lang w:val="fr-FR"/>
-        </w:rPr>
-        <w:t xml:space="preserve">       </w:t>
-      </w:r>
-      <w:r>
-        <w:rPr>
+        <w:t xml:space="preserve">Mahajanga                                                                                                                                                                            </w:t>
+      </w:r>
+      <w:r>
+        <w:rPr>
+          <w:rFonts w:ascii="Times New Roman" w:hAnsi="Times New Roman" w:cs="Times New Roman"/>
           <w:b/>
           <w:vertAlign w:val="superscript"/>
           <w:lang w:val="fr-FR"/>
@@ -321,6 +296,7 @@
       </w:r>
       <w:r>
         <w:rPr>
+          <w:rFonts w:ascii="Times New Roman" w:hAnsi="Times New Roman" w:cs="Times New Roman"/>
           <w:b/>
           <w:color w:val="0909E9"/>
           <w:sz w:val="23"/>
@@ -336,12 +312,14 @@
         <w:spacing w:line="240" w:lineRule="auto"/>
         <w:jc w:val="center"/>
         <w:rPr>
+          <w:rFonts w:ascii="Times New Roman" w:hAnsi="Times New Roman" w:cs="Times New Roman"/>
           <w:b/>
           <w:lang w:val="fr-FR"/>
         </w:rPr>
       </w:pPr>
       <w:r>
         <w:rPr>
+          <w:rFonts w:ascii="Times New Roman" w:hAnsi="Times New Roman" w:cs="Times New Roman"/>
           <w:b/>
           <w:lang w:val="fr-FR"/>
         </w:rPr>
@@ -353,11 +331,13 @@
         <w:spacing w:line="240" w:lineRule="auto"/>
         <w:jc w:val="center"/>
         <w:rPr>
-          <w:lang w:val="fr-FR"/>
-        </w:rPr>
-      </w:pPr>
-      <w:r>
-        <w:rPr>
+          <w:rFonts w:ascii="Times New Roman" w:hAnsi="Times New Roman" w:cs="Times New Roman"/>
+          <w:lang w:val="fr-FR"/>
+        </w:rPr>
+      </w:pPr>
+      <w:r>
+        <w:rPr>
+          <w:rFonts w:ascii="Times New Roman" w:hAnsi="Times New Roman" w:cs="Times New Roman"/>
           <w:b/>
           <w:lang w:val="fr-FR"/>
         </w:rPr>
@@ -369,13 +349,14 @@
         <w:spacing w:line="240" w:lineRule="auto"/>
         <w:jc w:val="center"/>
         <w:rPr>
+          <w:rFonts w:ascii="Times New Roman" w:hAnsi="Times New Roman" w:cs="Times New Roman"/>
           <w:b/>
           <w:lang w:val="fr-FR"/>
         </w:rPr>
       </w:pPr>
       <w:r>
         <w:rPr>
-          <w:rFonts w:ascii="Calibri" w:eastAsia="Calibri" w:hAnsi="Calibri" w:cs="Calibri"/>
+          <w:rFonts w:ascii="Times New Roman" w:eastAsia="Calibri" w:hAnsi="Times New Roman" w:cs="Times New Roman"/>
           <w:noProof/>
         </w:rPr>
         <mc:AlternateContent>
@@ -474,11 +455,13 @@
         <w:spacing w:line="240" w:lineRule="auto"/>
         <w:jc w:val="center"/>
         <w:rPr>
-          <w:lang w:val="fr-FR"/>
-        </w:rPr>
-      </w:pPr>
-      <w:r>
-        <w:rPr>
+          <w:rFonts w:ascii="Times New Roman" w:hAnsi="Times New Roman" w:cs="Times New Roman"/>
+          <w:lang w:val="fr-FR"/>
+        </w:rPr>
+      </w:pPr>
+      <w:r>
+        <w:rPr>
+          <w:rFonts w:ascii="Times New Roman" w:hAnsi="Times New Roman" w:cs="Times New Roman"/>
           <w:b/>
           <w:lang w:val="fr-FR"/>
         </w:rPr>
@@ -490,12 +473,13 @@
         <w:spacing w:line="240" w:lineRule="auto"/>
         <w:jc w:val="center"/>
         <w:rPr>
-          <w:lang w:val="fr-FR"/>
-        </w:rPr>
-      </w:pPr>
-      <w:r>
-        <w:rPr>
-          <w:rFonts w:ascii="Calibri" w:eastAsia="Calibri" w:hAnsi="Calibri" w:cs="Calibri"/>
+          <w:rFonts w:ascii="Times New Roman" w:hAnsi="Times New Roman" w:cs="Times New Roman"/>
+          <w:lang w:val="fr-FR"/>
+        </w:rPr>
+      </w:pPr>
+      <w:r>
+        <w:rPr>
+          <w:rFonts w:ascii="Times New Roman" w:eastAsia="Calibri" w:hAnsi="Times New Roman" w:cs="Times New Roman"/>
           <w:noProof/>
         </w:rPr>
         <mc:AlternateContent>
@@ -594,11 +578,13 @@
         <w:spacing w:line="240" w:lineRule="auto"/>
         <w:jc w:val="center"/>
         <w:rPr>
-          <w:lang w:val="fr-FR"/>
-        </w:rPr>
-      </w:pPr>
-      <w:r>
-        <w:rPr>
+          <w:rFonts w:ascii="Times New Roman" w:hAnsi="Times New Roman" w:cs="Times New Roman"/>
+          <w:lang w:val="fr-FR"/>
+        </w:rPr>
+      </w:pPr>
+      <w:r>
+        <w:rPr>
+          <w:rFonts w:ascii="Times New Roman" w:hAnsi="Times New Roman" w:cs="Times New Roman"/>
           <w:b/>
           <w:color w:val="FF0000"/>
           <w:lang w:val="fr-FR"/>
@@ -607,6 +593,7 @@
       </w:r>
       <w:r>
         <w:rPr>
+          <w:rFonts w:ascii="Times New Roman" w:hAnsi="Times New Roman" w:cs="Times New Roman"/>
           <w:b/>
           <w:lang w:val="fr-FR"/>
         </w:rPr>
@@ -614,6 +601,7 @@
       </w:r>
       <w:r>
         <w:rPr>
+          <w:rFonts w:ascii="Times New Roman" w:hAnsi="Times New Roman" w:cs="Times New Roman"/>
           <w:b/>
           <w:color w:val="FF0000"/>
           <w:lang w:val="fr-FR"/>
@@ -622,6 +610,7 @@
       </w:r>
       <w:r>
         <w:rPr>
+          <w:rFonts w:ascii="Times New Roman" w:hAnsi="Times New Roman" w:cs="Times New Roman"/>
           <w:b/>
           <w:lang w:val="fr-FR"/>
         </w:rPr>
@@ -629,6 +618,7 @@
       </w:r>
       <w:r>
         <w:rPr>
+          <w:rFonts w:ascii="Times New Roman" w:hAnsi="Times New Roman" w:cs="Times New Roman"/>
           <w:b/>
           <w:color w:val="FF0000"/>
           <w:lang w:val="fr-FR"/>
@@ -637,6 +627,7 @@
       </w:r>
       <w:r>
         <w:rPr>
+          <w:rFonts w:ascii="Times New Roman" w:hAnsi="Times New Roman" w:cs="Times New Roman"/>
           <w:b/>
           <w:lang w:val="fr-FR"/>
         </w:rPr>
@@ -644,6 +635,7 @@
       </w:r>
       <w:r>
         <w:rPr>
+          <w:rFonts w:ascii="Times New Roman" w:hAnsi="Times New Roman" w:cs="Times New Roman"/>
           <w:b/>
           <w:color w:val="FF0000"/>
           <w:lang w:val="fr-FR"/>
@@ -652,6 +644,7 @@
       </w:r>
       <w:r>
         <w:rPr>
+          <w:rFonts w:ascii="Times New Roman" w:hAnsi="Times New Roman" w:cs="Times New Roman"/>
           <w:b/>
           <w:lang w:val="fr-FR"/>
         </w:rPr>
@@ -659,6 +652,7 @@
       </w:r>
       <w:r>
         <w:rPr>
+          <w:rFonts w:ascii="Times New Roman" w:hAnsi="Times New Roman" w:cs="Times New Roman"/>
           <w:b/>
           <w:color w:val="FF0000"/>
           <w:lang w:val="fr-FR"/>
@@ -667,6 +661,7 @@
       </w:r>
       <w:r>
         <w:rPr>
+          <w:rFonts w:ascii="Times New Roman" w:hAnsi="Times New Roman" w:cs="Times New Roman"/>
           <w:b/>
           <w:lang w:val="fr-FR"/>
         </w:rPr>
@@ -678,11 +673,13 @@
         <w:spacing w:line="240" w:lineRule="auto"/>
         <w:jc w:val="center"/>
         <w:rPr>
-          <w:lang w:val="fr-FR"/>
-        </w:rPr>
-      </w:pPr>
-      <w:r>
-        <w:rPr>
+          <w:rFonts w:ascii="Times New Roman" w:hAnsi="Times New Roman" w:cs="Times New Roman"/>
+          <w:lang w:val="fr-FR"/>
+        </w:rPr>
+      </w:pPr>
+      <w:r>
+        <w:rPr>
+          <w:rFonts w:ascii="Times New Roman" w:hAnsi="Times New Roman" w:cs="Times New Roman"/>
           <w:b/>
           <w:lang w:val="fr-FR"/>
         </w:rPr>
@@ -694,12 +691,13 @@
         <w:spacing w:line="240" w:lineRule="auto"/>
         <w:jc w:val="center"/>
         <w:rPr>
-          <w:lang w:val="fr-FR"/>
-        </w:rPr>
-      </w:pPr>
-      <w:r>
-        <w:rPr>
-          <w:rFonts w:ascii="Calibri" w:eastAsia="Calibri" w:hAnsi="Calibri" w:cs="Calibri"/>
+          <w:rFonts w:ascii="Times New Roman" w:hAnsi="Times New Roman" w:cs="Times New Roman"/>
+          <w:lang w:val="fr-FR"/>
+        </w:rPr>
+      </w:pPr>
+      <w:r>
+        <w:rPr>
+          <w:rFonts w:ascii="Times New Roman" w:eastAsia="Calibri" w:hAnsi="Times New Roman" w:cs="Times New Roman"/>
           <w:noProof/>
         </w:rPr>
         <mc:AlternateContent>
@@ -798,11 +796,13 @@
         <w:spacing w:line="240" w:lineRule="auto"/>
         <w:jc w:val="center"/>
         <w:rPr>
-          <w:lang w:val="fr-FR"/>
-        </w:rPr>
-      </w:pPr>
-      <w:r>
-        <w:rPr>
+          <w:rFonts w:ascii="Times New Roman" w:hAnsi="Times New Roman" w:cs="Times New Roman"/>
+          <w:lang w:val="fr-FR"/>
+        </w:rPr>
+      </w:pPr>
+      <w:r>
+        <w:rPr>
+          <w:rFonts w:ascii="Times New Roman" w:hAnsi="Times New Roman" w:cs="Times New Roman"/>
           <w:b/>
           <w:lang w:val="fr-FR"/>
         </w:rPr>
@@ -814,6 +814,7 @@
         <w:spacing w:line="240" w:lineRule="auto"/>
         <w:jc w:val="center"/>
         <w:rPr>
+          <w:rFonts w:ascii="Times New Roman" w:hAnsi="Times New Roman" w:cs="Times New Roman"/>
           <w:b/>
           <w:sz w:val="19"/>
           <w:lang w:val="fr-FR"/>
@@ -821,17 +822,11 @@
       </w:pPr>
       <w:r>
         <w:rPr>
+          <w:rFonts w:ascii="Times New Roman" w:hAnsi="Times New Roman" w:cs="Times New Roman"/>
           <w:b/>
           <w:lang w:val="fr-FR"/>
         </w:rPr>
-        <w:t xml:space="preserve">Parcours : Génie </w:t>
-      </w:r>
-      <w:r>
-        <w:rPr>
-          <w:b/>
-          <w:lang w:val="fr-FR"/>
-        </w:rPr>
-        <w:t>Informatique</w:t>
+        <w:t>Parcours : Génie Informatique</w:t>
       </w:r>
     </w:p>
     <w:p>
@@ -839,13 +834,14 @@
         <w:spacing w:line="240" w:lineRule="auto"/>
         <w:jc w:val="center"/>
         <w:rPr>
+          <w:rFonts w:ascii="Times New Roman" w:hAnsi="Times New Roman" w:cs="Times New Roman"/>
           <w:i/>
           <w:lang w:val="fr-FR"/>
         </w:rPr>
       </w:pPr>
       <w:r>
         <w:rPr>
-          <w:rFonts w:ascii="Calibri" w:eastAsia="Calibri" w:hAnsi="Calibri" w:cs="Calibri"/>
+          <w:rFonts w:ascii="Times New Roman" w:eastAsia="Calibri" w:hAnsi="Times New Roman" w:cs="Times New Roman"/>
           <w:noProof/>
         </w:rPr>
         <mc:AlternateContent>
@@ -940,6 +936,7 @@
       </w:r>
       <w:r>
         <w:rPr>
+          <w:rFonts w:ascii="Times New Roman" w:hAnsi="Times New Roman" w:cs="Times New Roman"/>
           <w:i/>
           <w:lang w:val="fr-FR"/>
         </w:rPr>
@@ -950,6 +947,7 @@
       <w:pPr>
         <w:spacing w:line="240" w:lineRule="auto"/>
         <w:rPr>
+          <w:rFonts w:ascii="Times New Roman" w:hAnsi="Times New Roman" w:cs="Times New Roman"/>
           <w:b/>
           <w:sz w:val="28"/>
           <w:szCs w:val="28"/>
@@ -958,7 +956,7 @@
       </w:pPr>
       <w:r>
         <w:rPr>
-          <w:rFonts w:ascii="Calibri" w:eastAsia="Calibri" w:hAnsi="Calibri" w:cs="Calibri"/>
+          <w:rFonts w:ascii="Times New Roman" w:eastAsia="Calibri" w:hAnsi="Times New Roman" w:cs="Times New Roman"/>
           <w:noProof/>
         </w:rPr>
         <mc:AlternateContent>
@@ -1053,23 +1051,14 @@
       </w:r>
       <w:r>
         <w:rPr>
+          <w:rFonts w:ascii="Times New Roman" w:hAnsi="Times New Roman" w:cs="Times New Roman"/>
           <w:b/>
           <w:i/>
           <w:sz w:val="28"/>
           <w:szCs w:val="28"/>
           <w:lang w:val="fr-FR"/>
         </w:rPr>
-        <w:t xml:space="preserve">                                                                  </w:t>
-      </w:r>
-      <w:r>
-        <w:rPr>
-          <w:b/>
-          <w:i/>
-          <w:sz w:val="28"/>
-          <w:szCs w:val="28"/>
-          <w:lang w:val="fr-FR"/>
-        </w:rPr>
-        <w:t xml:space="preserve">Projet </w:t>
+        <w:t xml:space="preserve">                                                                  Projet </w:t>
       </w:r>
     </w:p>
     <w:p>
@@ -1077,6 +1066,7 @@
         <w:spacing w:line="240" w:lineRule="auto"/>
         <w:jc w:val="center"/>
         <w:rPr>
+          <w:rFonts w:ascii="Times New Roman" w:hAnsi="Times New Roman" w:cs="Times New Roman"/>
           <w:lang w:val="fr-FR"/>
         </w:rPr>
       </w:pPr>
@@ -1086,12 +1076,13 @@
         <w:spacing w:line="240" w:lineRule="auto"/>
         <w:jc w:val="center"/>
         <w:rPr>
-          <w:lang w:val="fr-FR"/>
-        </w:rPr>
-      </w:pPr>
-      <w:r>
-        <w:rPr>
-          <w:rFonts w:ascii="Calibri" w:eastAsia="Calibri" w:hAnsi="Calibri" w:cs="Calibri"/>
+          <w:rFonts w:ascii="Times New Roman" w:hAnsi="Times New Roman" w:cs="Times New Roman"/>
+          <w:lang w:val="fr-FR"/>
+        </w:rPr>
+      </w:pPr>
+      <w:r>
+        <w:rPr>
+          <w:rFonts w:ascii="Times New Roman" w:eastAsia="Calibri" w:hAnsi="Times New Roman" w:cs="Times New Roman"/>
           <w:noProof/>
         </w:rPr>
         <mc:AlternateContent>
@@ -1180,6 +1171,7 @@
         <w:spacing w:line="240" w:lineRule="auto"/>
         <w:jc w:val="center"/>
         <w:rPr>
+          <w:rFonts w:ascii="Times New Roman" w:hAnsi="Times New Roman" w:cs="Times New Roman"/>
           <w:b/>
           <w:color w:val="0070C0"/>
           <w:sz w:val="32"/>
@@ -1189,33 +1181,39 @@
       </w:pPr>
       <w:r>
         <w:rPr>
+          <w:rFonts w:ascii="Times New Roman" w:hAnsi="Times New Roman" w:cs="Times New Roman"/>
           <w:b/>
           <w:color w:val="0070C0"/>
           <w:sz w:val="32"/>
           <w:szCs w:val="32"/>
           <w:lang w:val="fr-FR"/>
         </w:rPr>
-        <w:t xml:space="preserve"> </w:t>
-      </w:r>
-      <w:r>
-        <w:rPr>
+        <w:t xml:space="preserve"> « GESTION ET SUIVI DES PROJETS </w:t>
+      </w:r>
+    </w:p>
+    <w:p>
+      <w:pPr>
+        <w:spacing w:line="240" w:lineRule="auto"/>
+        <w:jc w:val="center"/>
+        <w:rPr>
+          <w:rFonts w:ascii="Times New Roman" w:hAnsi="Times New Roman" w:cs="Times New Roman"/>
           <w:b/>
           <w:color w:val="0070C0"/>
           <w:sz w:val="32"/>
           <w:szCs w:val="32"/>
           <w:lang w:val="fr-FR"/>
         </w:rPr>
-        <w:t xml:space="preserve">« </w:t>
-      </w:r>
-      <w:r>
-        <w:rPr>
+      </w:pPr>
+      <w:r>
+        <w:rPr>
+          <w:rFonts w:ascii="Times New Roman" w:hAnsi="Times New Roman" w:cs="Times New Roman"/>
           <w:b/>
           <w:color w:val="0070C0"/>
           <w:sz w:val="32"/>
           <w:szCs w:val="32"/>
           <w:lang w:val="fr-FR"/>
         </w:rPr>
-        <w:t xml:space="preserve">GESTION ET SUIVI DES PROJETS </w:t>
+        <w:t xml:space="preserve">DE </w:t>
       </w:r>
     </w:p>
     <w:p>
@@ -1223,6 +1221,7 @@
         <w:spacing w:line="240" w:lineRule="auto"/>
         <w:jc w:val="center"/>
         <w:rPr>
+          <w:rFonts w:ascii="Times New Roman" w:hAnsi="Times New Roman" w:cs="Times New Roman"/>
           <w:b/>
           <w:color w:val="0070C0"/>
           <w:sz w:val="32"/>
@@ -1232,13 +1231,14 @@
       </w:pPr>
       <w:r>
         <w:rPr>
+          <w:rFonts w:ascii="Times New Roman" w:hAnsi="Times New Roman" w:cs="Times New Roman"/>
           <w:b/>
           <w:color w:val="0070C0"/>
           <w:sz w:val="32"/>
           <w:szCs w:val="32"/>
           <w:lang w:val="fr-FR"/>
         </w:rPr>
-        <w:t xml:space="preserve">DE </w:t>
+        <w:t xml:space="preserve">  L’ENTREPRISE »</w:t>
       </w:r>
     </w:p>
     <w:p>
@@ -1246,6 +1246,7 @@
         <w:spacing w:line="240" w:lineRule="auto"/>
         <w:jc w:val="center"/>
         <w:rPr>
+          <w:rFonts w:ascii="Times New Roman" w:hAnsi="Times New Roman" w:cs="Times New Roman"/>
           <w:b/>
           <w:color w:val="0070C0"/>
           <w:sz w:val="32"/>
@@ -1253,39 +1254,6 @@
           <w:lang w:val="fr-FR"/>
         </w:rPr>
       </w:pPr>
-      <w:r>
-        <w:rPr>
-          <w:b/>
-          <w:color w:val="0070C0"/>
-          <w:sz w:val="32"/>
-          <w:szCs w:val="32"/>
-          <w:lang w:val="fr-FR"/>
-        </w:rPr>
-        <w:t xml:space="preserve">  L’ENTREPRISE</w:t>
-      </w:r>
-      <w:r>
-        <w:rPr>
-          <w:b/>
-          <w:color w:val="0070C0"/>
-          <w:sz w:val="32"/>
-          <w:szCs w:val="32"/>
-          <w:lang w:val="fr-FR"/>
-        </w:rPr>
-        <w:t> »</w:t>
-      </w:r>
-    </w:p>
-    <w:p>
-      <w:pPr>
-        <w:spacing w:line="240" w:lineRule="auto"/>
-        <w:jc w:val="center"/>
-        <w:rPr>
-          <w:b/>
-          <w:color w:val="0070C0"/>
-          <w:sz w:val="32"/>
-          <w:szCs w:val="32"/>
-          <w:lang w:val="fr-FR"/>
-        </w:rPr>
-      </w:pPr>
     </w:p>
     <w:p>
       <w:pPr>
@@ -1293,11 +1261,13 @@
         <w:ind w:left="10" w:right="55" w:hanging="10"/>
         <w:jc w:val="center"/>
         <w:rPr>
-          <w:lang w:val="fr-FR"/>
-        </w:rPr>
-      </w:pPr>
-      <w:r>
-        <w:rPr>
+          <w:rFonts w:ascii="Times New Roman" w:hAnsi="Times New Roman" w:cs="Times New Roman"/>
+          <w:lang w:val="fr-FR"/>
+        </w:rPr>
+      </w:pPr>
+      <w:r>
+        <w:rPr>
+          <w:rFonts w:ascii="Times New Roman" w:hAnsi="Times New Roman" w:cs="Times New Roman"/>
           <w:u w:val="single" w:color="000000"/>
           <w:lang w:val="fr-FR"/>
         </w:rPr>
@@ -1305,6 +1275,7 @@
       </w:r>
       <w:r>
         <w:rPr>
+          <w:rFonts w:ascii="Times New Roman" w:hAnsi="Times New Roman" w:cs="Times New Roman"/>
           <w:lang w:val="fr-FR"/>
         </w:rPr>
         <w:t xml:space="preserve"> : </w:t>
@@ -1316,6 +1287,7 @@
         <w:ind w:left="10" w:right="55" w:hanging="10"/>
         <w:jc w:val="center"/>
         <w:rPr>
+          <w:rFonts w:ascii="Times New Roman" w:hAnsi="Times New Roman" w:cs="Times New Roman"/>
           <w:lang w:val="fr-FR"/>
         </w:rPr>
       </w:pPr>
@@ -1325,6 +1297,7 @@
         <w:spacing w:line="240" w:lineRule="auto"/>
         <w:jc w:val="center"/>
         <w:rPr>
+          <w:rFonts w:ascii="Times New Roman" w:hAnsi="Times New Roman" w:cs="Times New Roman"/>
           <w:b/>
           <w:sz w:val="24"/>
           <w:szCs w:val="24"/>
@@ -1333,110 +1306,132 @@
       </w:pPr>
       <w:r>
         <w:rPr>
+          <w:rFonts w:ascii="Times New Roman" w:hAnsi="Times New Roman" w:cs="Times New Roman"/>
           <w:b/>
           <w:sz w:val="24"/>
           <w:szCs w:val="24"/>
           <w:lang w:val="fr-FR"/>
         </w:rPr>
-        <w:t xml:space="preserve">TAHIENDRAZA </w:t>
-      </w:r>
-      <w:proofErr w:type="spellStart"/>
-      <w:r>
-        <w:rPr>
-          <w:b/>
+        <w:t>TAHIENDRAZA Ravilimita Zidane</w:t>
+      </w:r>
+    </w:p>
+    <w:p>
+      <w:pPr>
+        <w:ind w:right="1"/>
+        <w:rPr>
+          <w:rFonts w:ascii="Times New Roman" w:hAnsi="Times New Roman" w:cs="Times New Roman"/>
+          <w:lang w:val="fr-FR"/>
+        </w:rPr>
+      </w:pPr>
+    </w:p>
+    <w:p>
+      <w:pPr>
+        <w:ind w:right="1"/>
+        <w:rPr>
+          <w:rFonts w:ascii="Times New Roman" w:hAnsi="Times New Roman" w:cs="Times New Roman"/>
+          <w:lang w:val="fr-FR"/>
+        </w:rPr>
+      </w:pPr>
+    </w:p>
+    <w:p>
+      <w:pPr>
+        <w:ind w:right="1"/>
+        <w:rPr>
+          <w:rFonts w:ascii="Times New Roman" w:hAnsi="Times New Roman" w:cs="Times New Roman"/>
+          <w:lang w:val="fr-FR"/>
+        </w:rPr>
+      </w:pPr>
+      <w:r>
+        <w:rPr>
+          <w:rFonts w:ascii="Times New Roman" w:hAnsi="Times New Roman" w:cs="Times New Roman"/>
+          <w:lang w:val="fr-FR"/>
+        </w:rPr>
+        <w:t>Semestre : S5</w:t>
+      </w:r>
+    </w:p>
+    <w:p>
+      <w:pPr>
+        <w:spacing w:after="1323"/>
+        <w:ind w:left="10" w:right="30" w:hanging="10"/>
+        <w:rPr>
+          <w:rFonts w:ascii="Times New Roman" w:hAnsi="Times New Roman" w:cs="Times New Roman"/>
+          <w:lang w:val="fr-FR"/>
+        </w:rPr>
+      </w:pPr>
+      <w:r>
+        <w:rPr>
+          <w:rFonts w:ascii="Times New Roman" w:hAnsi="Times New Roman" w:cs="Times New Roman"/>
+          <w:lang w:val="fr-FR"/>
+        </w:rPr>
+        <w:t xml:space="preserve">ANNEE UNIVERSITAIRE : 2024- 2025 </w:t>
+      </w:r>
+    </w:p>
+    <w:p>
+      <w:pPr>
+        <w:rPr>
+          <w:rFonts w:ascii="Times New Roman" w:hAnsi="Times New Roman" w:cs="Times New Roman"/>
+          <w:lang w:val="fr-FR"/>
+        </w:rPr>
+      </w:pPr>
+      <w:r>
+        <w:rPr>
+          <w:rFonts w:ascii="Times New Roman" w:hAnsi="Times New Roman" w:cs="Times New Roman"/>
+          <w:lang w:val="fr-FR"/>
+        </w:rPr>
+        <w:lastRenderedPageBreak/>
+        <w:br w:type="page"/>
+      </w:r>
+    </w:p>
+    <w:p>
+      <w:pPr>
+        <w:jc w:val="center"/>
+        <w:rPr>
+          <w:rFonts w:ascii="Times New Roman" w:hAnsi="Times New Roman" w:cs="Times New Roman"/>
+          <w:sz w:val="36"/>
+          <w:szCs w:val="36"/>
+          <w:lang w:val="fr-FR"/>
+        </w:rPr>
+      </w:pPr>
+      <w:r>
+        <w:rPr>
+          <w:rFonts w:ascii="Times New Roman" w:hAnsi="Times New Roman" w:cs="Times New Roman"/>
+          <w:sz w:val="36"/>
+          <w:szCs w:val="36"/>
+          <w:lang w:val="fr-FR"/>
+        </w:rPr>
+        <w:lastRenderedPageBreak/>
+        <w:t>SOMMAIRE</w:t>
+      </w:r>
+    </w:p>
+    <w:p>
+      <w:pPr>
+        <w:spacing w:after="200" w:line="276" w:lineRule="auto"/>
+        <w:rPr>
+          <w:rFonts w:ascii="Times New Roman" w:hAnsi="Times New Roman" w:cs="Times New Roman"/>
           <w:sz w:val="24"/>
           <w:szCs w:val="24"/>
           <w:lang w:val="fr-FR"/>
         </w:rPr>
-        <w:t>Ravilimita</w:t>
-      </w:r>
-      <w:proofErr w:type="spellEnd"/>
-      <w:r>
-        <w:rPr>
-          <w:b/>
+      </w:pPr>
+    </w:p>
+    <w:p>
+      <w:pPr>
+        <w:rPr>
+          <w:rFonts w:ascii="Times New Roman" w:hAnsi="Times New Roman" w:cs="Times New Roman"/>
           <w:sz w:val="24"/>
           <w:szCs w:val="24"/>
           <w:lang w:val="fr-FR"/>
         </w:rPr>
-        <w:t xml:space="preserve"> Zidane</w:t>
-      </w:r>
-    </w:p>
-    <w:p>
-      <w:pPr>
-        <w:ind w:right="1"/>
-        <w:rPr>
-          <w:lang w:val="fr-FR"/>
-        </w:rPr>
-      </w:pPr>
-    </w:p>
-    <w:p>
-      <w:pPr>
-        <w:ind w:right="1"/>
-        <w:rPr>
-          <w:lang w:val="fr-FR"/>
-        </w:rPr>
-      </w:pPr>
-    </w:p>
-    <w:p>
-      <w:pPr>
-        <w:ind w:right="1"/>
-        <w:rPr>
-          <w:lang w:val="fr-FR"/>
-        </w:rPr>
-      </w:pPr>
-      <w:r>
-        <w:rPr>
-          <w:lang w:val="fr-FR"/>
-        </w:rPr>
-        <w:t>Semestre : S5</w:t>
-      </w:r>
-    </w:p>
-    <w:p>
-      <w:pPr>
-        <w:spacing w:after="1323"/>
-        <w:ind w:left="10" w:right="30" w:hanging="10"/>
-        <w:rPr>
-          <w:lang w:val="fr-FR"/>
-        </w:rPr>
-      </w:pPr>
-      <w:r>
-        <w:rPr>
-          <w:lang w:val="fr-FR"/>
-        </w:rPr>
-        <w:t xml:space="preserve">ANNEE UNIVERSITAIRE : 2024- 2025 </w:t>
-      </w:r>
-    </w:p>
-    <w:p>
-      <w:pPr>
-        <w:jc w:val="center"/>
-        <w:rPr>
-          <w:rFonts w:ascii="Times New Roman" w:hAnsi="Times New Roman" w:cs="Times New Roman"/>
-          <w:sz w:val="36"/>
-          <w:szCs w:val="36"/>
-          <w:lang w:val="fr-FR"/>
-        </w:rPr>
-      </w:pPr>
-      <w:r>
-        <w:rPr>
-          <w:rFonts w:ascii="Times New Roman" w:hAnsi="Times New Roman" w:cs="Times New Roman"/>
-          <w:sz w:val="36"/>
-          <w:szCs w:val="36"/>
-          <w:lang w:val="fr-FR"/>
-        </w:rPr>
-        <w:lastRenderedPageBreak/>
-        <w:t>SOMMAIRE</w:t>
-      </w:r>
-    </w:p>
-    <w:p>
-      <w:pPr>
-        <w:spacing w:after="200" w:line="276" w:lineRule="auto"/>
+      </w:pPr>
+      <w:r>
         <w:rPr>
           <w:rFonts w:ascii="Times New Roman" w:hAnsi="Times New Roman" w:cs="Times New Roman"/>
           <w:sz w:val="24"/>
           <w:szCs w:val="24"/>
           <w:lang w:val="fr-FR"/>
         </w:rPr>
-      </w:pPr>
+        <w:t>SOMMAIRE : ……………………………………………………………………… 1</w:t>
+      </w:r>
     </w:p>
     <w:p>
       <w:pPr>
@@ -1454,7 +1449,7 @@
           <w:szCs w:val="24"/>
           <w:lang w:val="fr-FR"/>
         </w:rPr>
-        <w:t>SOMMAIRE</w:t>
+        <w:t>LISTES DES ABREVIATIONS : ………………………………………</w:t>
       </w:r>
       <w:r>
         <w:rPr>
@@ -1463,7 +1458,7 @@
           <w:szCs w:val="24"/>
           <w:lang w:val="fr-FR"/>
         </w:rPr>
-        <w:t xml:space="preserve"> </w:t>
+        <w:t>………</w:t>
       </w:r>
       <w:r>
         <w:rPr>
@@ -1472,27 +1467,27 @@
           <w:szCs w:val="24"/>
           <w:lang w:val="fr-FR"/>
         </w:rPr>
-        <w:t>:</w:t>
-      </w:r>
-      <w:r>
+        <w:t>….  2</w:t>
+      </w:r>
+    </w:p>
+    <w:p>
+      <w:pPr>
         <w:rPr>
           <w:rFonts w:ascii="Times New Roman" w:hAnsi="Times New Roman" w:cs="Times New Roman"/>
           <w:sz w:val="24"/>
           <w:szCs w:val="24"/>
           <w:lang w:val="fr-FR"/>
         </w:rPr>
-        <w:t xml:space="preserve"> ……………………………………………………………………… 1</w:t>
-      </w:r>
-    </w:p>
-    <w:p>
-      <w:pPr>
+      </w:pPr>
+      <w:r>
         <w:rPr>
           <w:rFonts w:ascii="Times New Roman" w:hAnsi="Times New Roman" w:cs="Times New Roman"/>
           <w:sz w:val="24"/>
           <w:szCs w:val="24"/>
           <w:lang w:val="fr-FR"/>
         </w:rPr>
-      </w:pPr>
+        <w:t xml:space="preserve">LISTES DES </w:t>
+      </w:r>
       <w:r>
         <w:rPr>
           <w:rFonts w:ascii="Times New Roman" w:hAnsi="Times New Roman" w:cs="Times New Roman"/>
@@ -1500,7 +1495,7 @@
           <w:szCs w:val="24"/>
           <w:lang w:val="fr-FR"/>
         </w:rPr>
-        <w:t>LISTES DES ABREVIATIONS : ………………………………………</w:t>
+        <w:t>FIGURES : ……………………………………………………</w:t>
       </w:r>
       <w:r>
         <w:rPr>
@@ -1509,7 +1504,7 @@
           <w:szCs w:val="24"/>
           <w:lang w:val="fr-FR"/>
         </w:rPr>
-        <w:t>………</w:t>
+        <w:t>……</w:t>
       </w:r>
       <w:r>
         <w:rPr>
@@ -1518,7 +1513,7 @@
           <w:szCs w:val="24"/>
           <w:lang w:val="fr-FR"/>
         </w:rPr>
-        <w:t>….  2</w:t>
+        <w:t>.  3</w:t>
       </w:r>
     </w:p>
     <w:p>
@@ -1537,7 +1532,7 @@
           <w:szCs w:val="24"/>
           <w:lang w:val="fr-FR"/>
         </w:rPr>
-        <w:t xml:space="preserve">LISTES DES </w:t>
+        <w:t xml:space="preserve">INTRODUCTION : ………………………………………………………………… </w:t>
       </w:r>
       <w:r>
         <w:rPr>
@@ -1546,18 +1541,18 @@
           <w:szCs w:val="24"/>
           <w:lang w:val="fr-FR"/>
         </w:rPr>
-        <w:t>FIGURES : ……………………………………………………</w:t>
-      </w:r>
-      <w:proofErr w:type="gramStart"/>
-      <w:r>
+        <w:t>4</w:t>
+      </w:r>
+    </w:p>
+    <w:p>
+      <w:pPr>
         <w:rPr>
           <w:rFonts w:ascii="Times New Roman" w:hAnsi="Times New Roman" w:cs="Times New Roman"/>
           <w:sz w:val="24"/>
           <w:szCs w:val="24"/>
           <w:lang w:val="fr-FR"/>
         </w:rPr>
-        <w:t>…</w:t>
-      </w:r>
+      </w:pPr>
       <w:r>
         <w:rPr>
           <w:rFonts w:ascii="Times New Roman" w:hAnsi="Times New Roman" w:cs="Times New Roman"/>
@@ -1565,18 +1560,18 @@
           <w:szCs w:val="24"/>
           <w:lang w:val="fr-FR"/>
         </w:rPr>
-        <w:t>…</w:t>
-      </w:r>
-      <w:r>
+        <w:t xml:space="preserve">PLAN DE DEVOIRE : </w:t>
+      </w:r>
+    </w:p>
+    <w:p>
+      <w:pPr>
         <w:rPr>
           <w:rFonts w:ascii="Times New Roman" w:hAnsi="Times New Roman" w:cs="Times New Roman"/>
           <w:sz w:val="24"/>
           <w:szCs w:val="24"/>
           <w:lang w:val="fr-FR"/>
         </w:rPr>
-        <w:t>.</w:t>
-      </w:r>
-      <w:proofErr w:type="gramEnd"/>
+      </w:pPr>
       <w:r>
         <w:rPr>
           <w:rFonts w:ascii="Times New Roman" w:hAnsi="Times New Roman" w:cs="Times New Roman"/>
@@ -1584,62 +1579,24 @@
           <w:szCs w:val="24"/>
           <w:lang w:val="fr-FR"/>
         </w:rPr>
-        <w:t>.  3</w:t>
-      </w:r>
-    </w:p>
-    <w:p>
-      <w:pPr>
+        <w:t xml:space="preserve">   Contexte générale du projet …………………………………………………</w:t>
+      </w:r>
+      <w:r>
         <w:rPr>
           <w:rFonts w:ascii="Times New Roman" w:hAnsi="Times New Roman" w:cs="Times New Roman"/>
           <w:sz w:val="24"/>
           <w:szCs w:val="24"/>
           <w:lang w:val="fr-FR"/>
         </w:rPr>
-      </w:pPr>
-      <w:r>
-        <w:rPr>
-          <w:rFonts w:ascii="Times New Roman" w:hAnsi="Times New Roman" w:cs="Times New Roman"/>
-          <w:sz w:val="24"/>
-          <w:szCs w:val="24"/>
-          <w:lang w:val="fr-FR"/>
-        </w:rPr>
-        <w:t xml:space="preserve">INTRODUCTION : ………………………………………………………………… </w:t>
-      </w:r>
-      <w:r>
-        <w:rPr>
-          <w:rFonts w:ascii="Times New Roman" w:hAnsi="Times New Roman" w:cs="Times New Roman"/>
-          <w:sz w:val="24"/>
-          <w:szCs w:val="24"/>
-          <w:lang w:val="fr-FR"/>
-        </w:rPr>
-        <w:t>4</w:t>
-      </w:r>
-    </w:p>
-    <w:p>
-      <w:pPr>
-        <w:rPr>
-          <w:rFonts w:ascii="Times New Roman" w:hAnsi="Times New Roman" w:cs="Times New Roman"/>
-          <w:sz w:val="24"/>
-          <w:szCs w:val="24"/>
-          <w:lang w:val="fr-FR"/>
-        </w:rPr>
-      </w:pPr>
-      <w:r>
-        <w:rPr>
-          <w:rFonts w:ascii="Times New Roman" w:hAnsi="Times New Roman" w:cs="Times New Roman"/>
-          <w:sz w:val="24"/>
-          <w:szCs w:val="24"/>
-          <w:lang w:val="fr-FR"/>
-        </w:rPr>
-        <w:t xml:space="preserve">PLAN DE DEVOIRE : </w:t>
+        <w:t>…….</w:t>
       </w:r>
     </w:p>
     <w:p>
       <w:pPr>
         <w:pStyle w:val="Titre4"/>
         <w:rPr>
-          <w:rFonts w:ascii="Times New Roman" w:hAnsi="Times New Roman" w:cs="Times New Roman"/>
-          <w:b w:val="0"/>
+          <w:rStyle w:val="lev"/>
+          <w:rFonts w:ascii="Times New Roman" w:hAnsi="Times New Roman" w:cs="Times New Roman"/>
           <w:i w:val="0"/>
           <w:color w:val="000000" w:themeColor="text1"/>
           <w:lang w:val="fr-FR"/>
@@ -1664,39 +1621,7 @@
           <w:szCs w:val="24"/>
           <w:lang w:val="fr-FR"/>
         </w:rPr>
-        <w:t xml:space="preserve">PART 1 : </w:t>
-      </w:r>
-      <w:r>
-        <w:rPr>
-          <w:rStyle w:val="lev"/>
-          <w:rFonts w:ascii="Times New Roman" w:hAnsi="Times New Roman" w:cs="Times New Roman"/>
-          <w:i w:val="0"/>
-          <w:color w:val="000000" w:themeColor="text1"/>
-          <w:lang w:val="fr-FR"/>
-        </w:rPr>
-        <w:t xml:space="preserve"> ……………………………………………………………. </w:t>
-      </w:r>
-    </w:p>
-    <w:p>
-      <w:pPr>
-        <w:pStyle w:val="Titre4"/>
-        <w:rPr>
-          <w:rStyle w:val="lev"/>
-          <w:rFonts w:ascii="Times New Roman" w:hAnsi="Times New Roman" w:cs="Times New Roman"/>
-          <w:bCs/>
-          <w:i w:val="0"/>
-          <w:color w:val="000000" w:themeColor="text1"/>
-          <w:lang w:val="fr-FR"/>
-        </w:rPr>
-      </w:pPr>
-      <w:r>
-        <w:rPr>
-          <w:rFonts w:ascii="Times New Roman" w:hAnsi="Times New Roman" w:cs="Times New Roman"/>
-          <w:sz w:val="24"/>
-          <w:szCs w:val="24"/>
-          <w:lang w:val="fr-FR"/>
-        </w:rPr>
-        <w:t xml:space="preserve">    </w:t>
+        <w:t>Chapitre</w:t>
       </w:r>
       <w:r>
         <w:rPr>
@@ -1708,7 +1633,7 @@
           <w:szCs w:val="24"/>
           <w:lang w:val="fr-FR"/>
         </w:rPr>
-        <w:t xml:space="preserve">PART 2 : </w:t>
+        <w:t xml:space="preserve"> 1 : </w:t>
       </w:r>
       <w:r>
         <w:rPr>
@@ -1718,9 +1643,8 @@
           <w:color w:val="000000" w:themeColor="text1"/>
           <w:lang w:val="fr-FR"/>
         </w:rPr>
-        <w:t xml:space="preserve"> </w:t>
-      </w:r>
-      <w:proofErr w:type="gramStart"/>
+        <w:t xml:space="preserve"> ……………………………………………………………</w:t>
+      </w:r>
       <w:r>
         <w:rPr>
           <w:rStyle w:val="lev"/>
@@ -1729,10 +1653,440 @@
           <w:color w:val="000000" w:themeColor="text1"/>
           <w:lang w:val="fr-FR"/>
         </w:rPr>
-        <w:t>…….</w:t>
-      </w:r>
-      <w:proofErr w:type="gramEnd"/>
-      <w:r>
+        <w:t>……………….</w:t>
+      </w:r>
+    </w:p>
+    <w:p>
+      <w:pPr>
+        <w:pStyle w:val="Paragraphedeliste"/>
+        <w:numPr>
+          <w:ilvl w:val="1"/>
+          <w:numId w:val="1"/>
+        </w:numPr>
+        <w:jc w:val="both"/>
+        <w:rPr>
+          <w:rFonts w:ascii="Times New Roman" w:hAnsi="Times New Roman" w:cs="Times New Roman"/>
+          <w:lang w:val="fr-FR"/>
+        </w:rPr>
+      </w:pPr>
+      <w:r>
+        <w:rPr>
+          <w:rFonts w:ascii="Times New Roman" w:hAnsi="Times New Roman" w:cs="Times New Roman"/>
+          <w:lang w:val="fr-FR"/>
+        </w:rPr>
+        <w:t xml:space="preserve">Contexte et Motivation de l’Etude :  </w:t>
+      </w:r>
+      <w:r>
+        <w:rPr>
+          <w:rFonts w:ascii="Times New Roman" w:hAnsi="Times New Roman" w:cs="Times New Roman"/>
+          <w:sz w:val="24"/>
+          <w:szCs w:val="24"/>
+          <w:lang w:val="fr-FR"/>
+        </w:rPr>
+        <w:t>…………………………</w:t>
+      </w:r>
+      <w:r>
+        <w:rPr>
+          <w:rFonts w:ascii="Times New Roman" w:hAnsi="Times New Roman" w:cs="Times New Roman"/>
+          <w:sz w:val="24"/>
+          <w:szCs w:val="24"/>
+          <w:lang w:val="fr-FR"/>
+        </w:rPr>
+        <w:t>…</w:t>
+      </w:r>
+      <w:r>
+        <w:rPr>
+          <w:rFonts w:ascii="Times New Roman" w:hAnsi="Times New Roman" w:cs="Times New Roman"/>
+          <w:sz w:val="24"/>
+          <w:szCs w:val="24"/>
+          <w:lang w:val="fr-FR"/>
+        </w:rPr>
+        <w:t>………</w:t>
+      </w:r>
+      <w:r>
+        <w:rPr>
+          <w:rFonts w:ascii="Times New Roman" w:hAnsi="Times New Roman" w:cs="Times New Roman"/>
+          <w:sz w:val="24"/>
+          <w:szCs w:val="24"/>
+          <w:lang w:val="fr-FR"/>
+        </w:rPr>
+        <w:t>……</w:t>
+      </w:r>
+      <w:r>
+        <w:rPr>
+          <w:rFonts w:ascii="Times New Roman" w:hAnsi="Times New Roman" w:cs="Times New Roman"/>
+          <w:sz w:val="24"/>
+          <w:szCs w:val="24"/>
+          <w:lang w:val="fr-FR"/>
+        </w:rPr>
+        <w:t>.</w:t>
+      </w:r>
+    </w:p>
+    <w:p>
+      <w:pPr>
+        <w:pStyle w:val="Paragraphedeliste"/>
+        <w:numPr>
+          <w:ilvl w:val="2"/>
+          <w:numId w:val="1"/>
+        </w:numPr>
+        <w:jc w:val="both"/>
+        <w:rPr>
+          <w:rFonts w:ascii="Times New Roman" w:hAnsi="Times New Roman" w:cs="Times New Roman"/>
+          <w:lang w:val="fr-FR"/>
+        </w:rPr>
+      </w:pPr>
+      <w:r>
+        <w:rPr>
+          <w:rFonts w:ascii="Times New Roman" w:eastAsia="Times New Roman" w:hAnsi="Times New Roman" w:cs="Times New Roman"/>
+        </w:rPr>
+        <w:t xml:space="preserve"> </w:t>
+      </w:r>
+      <w:r>
+        <w:rPr>
+          <w:rFonts w:ascii="Times New Roman" w:eastAsia="Times New Roman" w:hAnsi="Times New Roman" w:cs="Times New Roman"/>
+        </w:rPr>
+        <w:t xml:space="preserve">État de </w:t>
+      </w:r>
+      <w:r>
+        <w:rPr>
+          <w:rFonts w:ascii="Times New Roman" w:eastAsia="Times New Roman" w:hAnsi="Times New Roman" w:cs="Times New Roman"/>
+        </w:rPr>
+        <w:t>lard</w:t>
+      </w:r>
+      <w:r>
+        <w:rPr>
+          <w:rFonts w:ascii="Times New Roman" w:eastAsia="Times New Roman" w:hAnsi="Times New Roman" w:cs="Times New Roman"/>
+        </w:rPr>
+        <w:t xml:space="preserve"> des solutions </w:t>
+      </w:r>
+      <w:r>
+        <w:rPr>
+          <w:rFonts w:ascii="Times New Roman" w:eastAsia="Times New Roman" w:hAnsi="Times New Roman" w:cs="Times New Roman"/>
+        </w:rPr>
+        <w:t>existantes:</w:t>
+      </w:r>
+      <w:r>
+        <w:rPr>
+          <w:rFonts w:ascii="Times New Roman" w:eastAsia="Times New Roman" w:hAnsi="Times New Roman" w:cs="Times New Roman"/>
+        </w:rPr>
+        <w:t xml:space="preserve"> ………………………</w:t>
+      </w:r>
+      <w:r>
+        <w:rPr>
+          <w:rFonts w:ascii="Times New Roman" w:eastAsia="Times New Roman" w:hAnsi="Times New Roman" w:cs="Times New Roman"/>
+        </w:rPr>
+        <w:t>…………</w:t>
+      </w:r>
+      <w:r>
+        <w:rPr>
+          <w:rFonts w:ascii="Times New Roman" w:eastAsia="Times New Roman" w:hAnsi="Times New Roman" w:cs="Times New Roman"/>
+        </w:rPr>
+        <w:t>….</w:t>
+      </w:r>
+    </w:p>
+    <w:p>
+      <w:pPr>
+        <w:pStyle w:val="Paragraphedeliste"/>
+        <w:numPr>
+          <w:ilvl w:val="2"/>
+          <w:numId w:val="3"/>
+        </w:numPr>
+        <w:jc w:val="both"/>
+        <w:rPr>
+          <w:rFonts w:ascii="Times New Roman" w:hAnsi="Times New Roman" w:cs="Times New Roman"/>
+          <w:lang w:val="fr-FR"/>
+        </w:rPr>
+      </w:pPr>
+      <w:r>
+        <w:rPr>
+          <w:rFonts w:ascii="Times New Roman" w:eastAsia="Times New Roman" w:hAnsi="Times New Roman" w:cs="Times New Roman"/>
+        </w:rPr>
+        <w:t xml:space="preserve"> </w:t>
+      </w:r>
+      <w:r>
+        <w:rPr>
+          <w:rFonts w:ascii="Times New Roman" w:eastAsia="Times New Roman" w:hAnsi="Times New Roman" w:cs="Times New Roman"/>
+          <w:lang w:val="fr-FR"/>
+        </w:rPr>
+        <w:t>Justification du projet :</w:t>
+      </w:r>
+      <w:r>
+        <w:rPr>
+          <w:rFonts w:ascii="Times New Roman" w:eastAsia="Times New Roman" w:hAnsi="Times New Roman" w:cs="Times New Roman"/>
+          <w:lang w:val="fr-FR"/>
+        </w:rPr>
+        <w:t xml:space="preserve"> ……………………………………</w:t>
+      </w:r>
+      <w:r>
+        <w:rPr>
+          <w:rFonts w:ascii="Times New Roman" w:eastAsia="Times New Roman" w:hAnsi="Times New Roman" w:cs="Times New Roman"/>
+          <w:lang w:val="fr-FR"/>
+        </w:rPr>
+        <w:t>……………....</w:t>
+      </w:r>
+    </w:p>
+    <w:p>
+      <w:pPr>
+        <w:pStyle w:val="Paragraphedeliste"/>
+        <w:numPr>
+          <w:ilvl w:val="1"/>
+          <w:numId w:val="1"/>
+        </w:numPr>
+        <w:spacing w:after="0"/>
+        <w:jc w:val="both"/>
+        <w:rPr>
+          <w:rFonts w:ascii="Times New Roman" w:hAnsi="Times New Roman" w:cs="Times New Roman"/>
+          <w:lang w:val="fr-FR"/>
+        </w:rPr>
+      </w:pPr>
+      <w:r>
+        <w:rPr>
+          <w:rFonts w:ascii="Times New Roman" w:hAnsi="Times New Roman" w:cs="Times New Roman"/>
+          <w:lang w:val="fr-FR"/>
+        </w:rPr>
+        <w:t>Analyse des besoins : …………………………………</w:t>
+      </w:r>
+      <w:r>
+        <w:rPr>
+          <w:rFonts w:ascii="Times New Roman" w:hAnsi="Times New Roman" w:cs="Times New Roman"/>
+          <w:lang w:val="fr-FR"/>
+        </w:rPr>
+        <w:t>……………</w:t>
+      </w:r>
+      <w:r>
+        <w:rPr>
+          <w:rFonts w:ascii="Times New Roman" w:hAnsi="Times New Roman" w:cs="Times New Roman"/>
+          <w:lang w:val="fr-FR"/>
+        </w:rPr>
+        <w:t>……………...</w:t>
+      </w:r>
+    </w:p>
+    <w:p>
+      <w:pPr>
+        <w:pStyle w:val="Paragraphedeliste"/>
+        <w:numPr>
+          <w:ilvl w:val="2"/>
+          <w:numId w:val="1"/>
+        </w:numPr>
+        <w:spacing w:after="0"/>
+        <w:jc w:val="both"/>
+        <w:rPr>
+          <w:rFonts w:ascii="Times New Roman" w:hAnsi="Times New Roman" w:cs="Times New Roman"/>
+          <w:lang w:val="fr-FR"/>
+        </w:rPr>
+      </w:pPr>
+      <w:r>
+        <w:rPr>
+          <w:rFonts w:ascii="Times New Roman" w:hAnsi="Times New Roman" w:cs="Times New Roman"/>
+          <w:lang w:val="fr-FR"/>
+        </w:rPr>
+        <w:t xml:space="preserve"> Spécification des besoins : ………………</w:t>
+      </w:r>
+      <w:r>
+        <w:rPr>
+          <w:rFonts w:ascii="Times New Roman" w:hAnsi="Times New Roman" w:cs="Times New Roman"/>
+          <w:lang w:val="fr-FR"/>
+        </w:rPr>
+        <w:t>…………………</w:t>
+      </w:r>
+      <w:r>
+        <w:rPr>
+          <w:rFonts w:ascii="Times New Roman" w:hAnsi="Times New Roman" w:cs="Times New Roman"/>
+          <w:lang w:val="fr-FR"/>
+        </w:rPr>
+        <w:t>………</w:t>
+      </w:r>
+      <w:r>
+        <w:rPr>
+          <w:rFonts w:ascii="Times New Roman" w:hAnsi="Times New Roman" w:cs="Times New Roman"/>
+          <w:lang w:val="fr-FR"/>
+        </w:rPr>
+        <w:t>……</w:t>
+      </w:r>
+      <w:r>
+        <w:rPr>
+          <w:rFonts w:ascii="Times New Roman" w:hAnsi="Times New Roman" w:cs="Times New Roman"/>
+          <w:lang w:val="fr-FR"/>
+        </w:rPr>
+        <w:t>.</w:t>
+      </w:r>
+    </w:p>
+    <w:p>
+      <w:pPr>
+        <w:pStyle w:val="Paragraphedeliste"/>
+        <w:numPr>
+          <w:ilvl w:val="2"/>
+          <w:numId w:val="1"/>
+        </w:numPr>
+        <w:spacing w:after="0"/>
+        <w:jc w:val="both"/>
+        <w:rPr>
+          <w:rFonts w:ascii="Times New Roman" w:hAnsi="Times New Roman" w:cs="Times New Roman"/>
+          <w:lang w:val="fr-FR"/>
+        </w:rPr>
+      </w:pPr>
+      <w:r>
+        <w:rPr>
+          <w:rFonts w:ascii="Times New Roman" w:hAnsi="Times New Roman" w:cs="Times New Roman"/>
+          <w:lang w:val="fr-FR"/>
+        </w:rPr>
+        <w:t xml:space="preserve"> Gestion des Utilisateurs et Rôles : ………</w:t>
+      </w:r>
+      <w:r>
+        <w:rPr>
+          <w:rFonts w:ascii="Times New Roman" w:hAnsi="Times New Roman" w:cs="Times New Roman"/>
+          <w:lang w:val="fr-FR"/>
+        </w:rPr>
+        <w:t>……………………</w:t>
+      </w:r>
+      <w:r>
+        <w:rPr>
+          <w:rFonts w:ascii="Times New Roman" w:hAnsi="Times New Roman" w:cs="Times New Roman"/>
+          <w:lang w:val="fr-FR"/>
+        </w:rPr>
+        <w:t>……</w:t>
+      </w:r>
+      <w:r>
+        <w:rPr>
+          <w:rFonts w:ascii="Times New Roman" w:hAnsi="Times New Roman" w:cs="Times New Roman"/>
+          <w:lang w:val="fr-FR"/>
+        </w:rPr>
+        <w:t>……</w:t>
+      </w:r>
+      <w:r>
+        <w:rPr>
+          <w:rFonts w:ascii="Times New Roman" w:hAnsi="Times New Roman" w:cs="Times New Roman"/>
+          <w:lang w:val="fr-FR"/>
+        </w:rPr>
+        <w:t>.</w:t>
+      </w:r>
+    </w:p>
+    <w:p>
+      <w:pPr>
+        <w:pStyle w:val="Paragraphedeliste"/>
+        <w:numPr>
+          <w:ilvl w:val="1"/>
+          <w:numId w:val="1"/>
+        </w:numPr>
+        <w:spacing w:after="0"/>
+        <w:jc w:val="both"/>
+        <w:rPr>
+          <w:rFonts w:ascii="Times New Roman" w:hAnsi="Times New Roman" w:cs="Times New Roman"/>
+          <w:lang w:val="fr-FR"/>
+        </w:rPr>
+      </w:pPr>
+      <w:r>
+        <w:rPr>
+          <w:rFonts w:ascii="Times New Roman" w:hAnsi="Times New Roman" w:cs="Times New Roman"/>
+          <w:lang w:val="fr-FR"/>
+        </w:rPr>
+        <w:t>Gestions des Projets : ………………………</w:t>
+      </w:r>
+      <w:r>
+        <w:rPr>
+          <w:rFonts w:ascii="Times New Roman" w:hAnsi="Times New Roman" w:cs="Times New Roman"/>
+          <w:lang w:val="fr-FR"/>
+        </w:rPr>
+        <w:t>…………………………</w:t>
+      </w:r>
+      <w:r>
+        <w:rPr>
+          <w:rFonts w:ascii="Times New Roman" w:hAnsi="Times New Roman" w:cs="Times New Roman"/>
+          <w:lang w:val="fr-FR"/>
+        </w:rPr>
+        <w:t>…………...</w:t>
+      </w:r>
+    </w:p>
+    <w:p>
+      <w:pPr>
+        <w:pStyle w:val="Paragraphedeliste"/>
+        <w:numPr>
+          <w:ilvl w:val="2"/>
+          <w:numId w:val="1"/>
+        </w:numPr>
+        <w:spacing w:after="0"/>
+        <w:jc w:val="both"/>
+        <w:rPr>
+          <w:rFonts w:ascii="Times New Roman" w:hAnsi="Times New Roman" w:cs="Times New Roman"/>
+          <w:lang w:val="fr-FR"/>
+        </w:rPr>
+      </w:pPr>
+      <w:r>
+        <w:rPr>
+          <w:rFonts w:ascii="Times New Roman" w:hAnsi="Times New Roman" w:cs="Times New Roman"/>
+          <w:lang w:val="fr-FR"/>
+        </w:rPr>
+        <w:t xml:space="preserve"> </w:t>
+      </w:r>
+      <w:r>
+        <w:rPr>
+          <w:rFonts w:ascii="Times New Roman" w:hAnsi="Times New Roman" w:cs="Times New Roman"/>
+          <w:lang w:val="fr-FR"/>
+        </w:rPr>
+        <w:t>Gestion des tâches : ………………………</w:t>
+      </w:r>
+      <w:r>
+        <w:rPr>
+          <w:rFonts w:ascii="Times New Roman" w:hAnsi="Times New Roman" w:cs="Times New Roman"/>
+          <w:lang w:val="fr-FR"/>
+        </w:rPr>
+        <w:t>…………………</w:t>
+      </w:r>
+      <w:r>
+        <w:rPr>
+          <w:rFonts w:ascii="Times New Roman" w:hAnsi="Times New Roman" w:cs="Times New Roman"/>
+          <w:lang w:val="fr-FR"/>
+        </w:rPr>
+        <w:t>…………….</w:t>
+      </w:r>
+    </w:p>
+    <w:p>
+      <w:pPr>
+        <w:pStyle w:val="Paragraphedeliste"/>
+        <w:numPr>
+          <w:ilvl w:val="2"/>
+          <w:numId w:val="1"/>
+        </w:numPr>
+        <w:spacing w:after="0"/>
+        <w:jc w:val="both"/>
+        <w:rPr>
+          <w:rFonts w:ascii="Times New Roman" w:hAnsi="Times New Roman" w:cs="Times New Roman"/>
+          <w:lang w:val="fr-FR"/>
+        </w:rPr>
+      </w:pPr>
+      <w:r>
+        <w:rPr>
+          <w:rFonts w:ascii="Times New Roman" w:hAnsi="Times New Roman" w:cs="Times New Roman"/>
+          <w:lang w:val="fr-FR"/>
+        </w:rPr>
+        <w:t xml:space="preserve"> </w:t>
+      </w:r>
+      <w:r>
+        <w:rPr>
+          <w:rFonts w:ascii="Times New Roman" w:hAnsi="Times New Roman" w:cs="Times New Roman"/>
+          <w:lang w:val="fr-FR"/>
+        </w:rPr>
+        <w:t>Visualisation des projets</w:t>
+      </w:r>
+      <w:r>
+        <w:rPr>
+          <w:rFonts w:ascii="Times New Roman" w:hAnsi="Times New Roman" w:cs="Times New Roman"/>
+          <w:lang w:val="fr-FR"/>
+        </w:rPr>
+        <w:t> : ……………………………………</w:t>
+      </w:r>
+      <w:r>
+        <w:rPr>
+          <w:rFonts w:ascii="Times New Roman" w:hAnsi="Times New Roman" w:cs="Times New Roman"/>
+          <w:lang w:val="fr-FR"/>
+        </w:rPr>
+        <w:t>……………</w:t>
+      </w:r>
+    </w:p>
+    <w:p>
+      <w:pPr>
+        <w:pStyle w:val="Titre4"/>
+        <w:jc w:val="both"/>
         <w:rPr>
           <w:rStyle w:val="lev"/>
           <w:rFonts w:ascii="Times New Roman" w:hAnsi="Times New Roman" w:cs="Times New Roman"/>
@@ -1740,37 +2094,901 @@
           <w:color w:val="000000" w:themeColor="text1"/>
           <w:lang w:val="fr-FR"/>
         </w:rPr>
-        <w:t xml:space="preserve">……………………………………….… </w:t>
-      </w:r>
-    </w:p>
-    <w:p>
-      <w:pPr>
-        <w:rPr>
-          <w:lang w:val="fr-FR"/>
-        </w:rPr>
-      </w:pPr>
-    </w:p>
-    <w:p>
-      <w:pPr>
+      </w:pPr>
+      <w:r>
         <w:rPr>
           <w:rFonts w:ascii="Times New Roman" w:hAnsi="Times New Roman" w:cs="Times New Roman"/>
           <w:sz w:val="24"/>
           <w:szCs w:val="24"/>
           <w:lang w:val="fr-FR"/>
         </w:rPr>
-      </w:pPr>
-      <w:r>
-        <w:rPr>
-          <w:rFonts w:ascii="Times New Roman" w:hAnsi="Times New Roman" w:cs="Times New Roman"/>
+        <w:t xml:space="preserve">    </w:t>
+      </w:r>
+      <w:r>
+        <w:rPr>
+          <w:rFonts w:ascii="Times New Roman" w:hAnsi="Times New Roman" w:cs="Times New Roman"/>
+          <w:b w:val="0"/>
+          <w:i w:val="0"/>
+          <w:color w:val="000000" w:themeColor="text1"/>
           <w:sz w:val="24"/>
           <w:szCs w:val="24"/>
           <w:lang w:val="fr-FR"/>
         </w:rPr>
+        <w:t>Chapitre</w:t>
+      </w:r>
+      <w:r>
+        <w:rPr>
+          <w:rFonts w:ascii="Times New Roman" w:hAnsi="Times New Roman" w:cs="Times New Roman"/>
+          <w:b w:val="0"/>
+          <w:i w:val="0"/>
+          <w:color w:val="000000" w:themeColor="text1"/>
+          <w:sz w:val="24"/>
+          <w:szCs w:val="24"/>
+          <w:lang w:val="fr-FR"/>
+        </w:rPr>
+        <w:t xml:space="preserve"> 2 : </w:t>
+      </w:r>
+      <w:r>
+        <w:rPr>
+          <w:rStyle w:val="lev"/>
+          <w:rFonts w:ascii="Times New Roman" w:hAnsi="Times New Roman" w:cs="Times New Roman"/>
+          <w:i w:val="0"/>
+          <w:color w:val="000000" w:themeColor="text1"/>
+          <w:lang w:val="fr-FR"/>
+        </w:rPr>
+        <w:t xml:space="preserve"> </w:t>
+      </w:r>
+      <w:r>
+        <w:rPr>
+          <w:rStyle w:val="lev"/>
+          <w:rFonts w:ascii="Times New Roman" w:hAnsi="Times New Roman" w:cs="Times New Roman"/>
+          <w:i w:val="0"/>
+          <w:color w:val="000000" w:themeColor="text1"/>
+          <w:lang w:val="fr-FR"/>
+        </w:rPr>
+        <w:t>……</w:t>
+      </w:r>
+      <w:r>
+        <w:rPr>
+          <w:rStyle w:val="lev"/>
+          <w:rFonts w:ascii="Times New Roman" w:hAnsi="Times New Roman" w:cs="Times New Roman"/>
+          <w:i w:val="0"/>
+          <w:color w:val="000000" w:themeColor="text1"/>
+          <w:lang w:val="fr-FR"/>
+        </w:rPr>
+        <w:t>…………………………………</w:t>
+      </w:r>
+      <w:r>
+        <w:rPr>
+          <w:rStyle w:val="lev"/>
+          <w:rFonts w:ascii="Times New Roman" w:hAnsi="Times New Roman" w:cs="Times New Roman"/>
+          <w:i w:val="0"/>
+          <w:color w:val="000000" w:themeColor="text1"/>
+          <w:lang w:val="fr-FR"/>
+        </w:rPr>
+        <w:t>……</w:t>
+      </w:r>
+      <w:r>
+        <w:rPr>
+          <w:rStyle w:val="lev"/>
+          <w:rFonts w:ascii="Times New Roman" w:hAnsi="Times New Roman" w:cs="Times New Roman"/>
+          <w:i w:val="0"/>
+          <w:color w:val="000000" w:themeColor="text1"/>
+          <w:lang w:val="fr-FR"/>
+        </w:rPr>
+        <w:t xml:space="preserve">… </w:t>
+      </w:r>
+      <w:r>
+        <w:rPr>
+          <w:rStyle w:val="lev"/>
+          <w:rFonts w:ascii="Times New Roman" w:hAnsi="Times New Roman" w:cs="Times New Roman"/>
+          <w:i w:val="0"/>
+          <w:color w:val="000000" w:themeColor="text1"/>
+          <w:lang w:val="fr-FR"/>
+        </w:rPr>
+        <w:t>………………</w:t>
+      </w:r>
+      <w:r>
+        <w:rPr>
+          <w:rStyle w:val="lev"/>
+          <w:rFonts w:ascii="Times New Roman" w:hAnsi="Times New Roman" w:cs="Times New Roman"/>
+          <w:i w:val="0"/>
+          <w:color w:val="000000" w:themeColor="text1"/>
+          <w:lang w:val="fr-FR"/>
+        </w:rPr>
+        <w:t>……</w:t>
+      </w:r>
+      <w:r>
+        <w:rPr>
+          <w:rStyle w:val="lev"/>
+          <w:rFonts w:ascii="Times New Roman" w:hAnsi="Times New Roman" w:cs="Times New Roman"/>
+          <w:i w:val="0"/>
+          <w:color w:val="000000" w:themeColor="text1"/>
+          <w:lang w:val="fr-FR"/>
+        </w:rPr>
+        <w:t>……</w:t>
+      </w:r>
+      <w:r>
+        <w:rPr>
+          <w:rStyle w:val="lev"/>
+          <w:rFonts w:ascii="Times New Roman" w:hAnsi="Times New Roman" w:cs="Times New Roman"/>
+          <w:i w:val="0"/>
+          <w:color w:val="000000" w:themeColor="text1"/>
+          <w:lang w:val="fr-FR"/>
+        </w:rPr>
+        <w:t>.</w:t>
+      </w:r>
+    </w:p>
+    <w:p>
+      <w:pPr>
+        <w:pStyle w:val="Paragraphedeliste"/>
+        <w:numPr>
+          <w:ilvl w:val="1"/>
+          <w:numId w:val="5"/>
+        </w:numPr>
+        <w:rPr>
+          <w:rFonts w:ascii="Times New Roman" w:hAnsi="Times New Roman" w:cs="Times New Roman"/>
+          <w:lang w:val="fr-FR"/>
+        </w:rPr>
+      </w:pPr>
+      <w:r>
+        <w:rPr>
+          <w:rFonts w:ascii="Times New Roman" w:hAnsi="Times New Roman" w:cs="Times New Roman"/>
+          <w:lang w:val="fr-FR"/>
+        </w:rPr>
+        <w:t>Architecture générale de l’application : ……………</w:t>
+      </w:r>
+      <w:r>
+        <w:rPr>
+          <w:rFonts w:ascii="Times New Roman" w:hAnsi="Times New Roman" w:cs="Times New Roman"/>
+          <w:lang w:val="fr-FR"/>
+        </w:rPr>
+        <w:t>…</w:t>
+      </w:r>
+      <w:r>
+        <w:rPr>
+          <w:rFonts w:ascii="Times New Roman" w:hAnsi="Times New Roman" w:cs="Times New Roman"/>
+          <w:lang w:val="fr-FR"/>
+        </w:rPr>
+        <w:t>……</w:t>
+      </w:r>
+      <w:r>
+        <w:rPr>
+          <w:rFonts w:ascii="Times New Roman" w:hAnsi="Times New Roman" w:cs="Times New Roman"/>
+          <w:lang w:val="fr-FR"/>
+        </w:rPr>
+        <w:t>……</w:t>
+      </w:r>
+      <w:r>
+        <w:rPr>
+          <w:rFonts w:ascii="Times New Roman" w:hAnsi="Times New Roman" w:cs="Times New Roman"/>
+          <w:lang w:val="fr-FR"/>
+        </w:rPr>
+        <w:t>………………….</w:t>
+      </w:r>
+    </w:p>
+    <w:p>
+      <w:pPr>
+        <w:pStyle w:val="Paragraphedeliste"/>
+        <w:numPr>
+          <w:ilvl w:val="2"/>
+          <w:numId w:val="5"/>
+        </w:numPr>
+        <w:rPr>
+          <w:rFonts w:ascii="Times New Roman" w:hAnsi="Times New Roman" w:cs="Times New Roman"/>
+          <w:lang w:val="fr-FR"/>
+        </w:rPr>
+      </w:pPr>
+      <w:r>
+        <w:rPr>
+          <w:rFonts w:ascii="Times New Roman" w:hAnsi="Times New Roman" w:cs="Times New Roman"/>
+          <w:lang w:val="fr-FR"/>
+        </w:rPr>
+        <w:t xml:space="preserve"> Modèle d’architecture : ………</w:t>
+      </w:r>
+      <w:r>
+        <w:rPr>
+          <w:rFonts w:ascii="Times New Roman" w:hAnsi="Times New Roman" w:cs="Times New Roman"/>
+          <w:lang w:val="fr-FR"/>
+        </w:rPr>
+        <w:t>…………………………</w:t>
+      </w:r>
+      <w:r>
+        <w:rPr>
+          <w:rFonts w:ascii="Times New Roman" w:hAnsi="Times New Roman" w:cs="Times New Roman"/>
+          <w:lang w:val="fr-FR"/>
+        </w:rPr>
+        <w:t>………………….</w:t>
+      </w:r>
+    </w:p>
+    <w:p>
+      <w:pPr>
+        <w:pStyle w:val="Paragraphedeliste"/>
+        <w:numPr>
+          <w:ilvl w:val="2"/>
+          <w:numId w:val="5"/>
+        </w:numPr>
+        <w:rPr>
+          <w:rFonts w:ascii="Times New Roman" w:hAnsi="Times New Roman" w:cs="Times New Roman"/>
+          <w:lang w:val="fr-FR"/>
+        </w:rPr>
+      </w:pPr>
+      <w:r>
+        <w:rPr>
+          <w:rFonts w:ascii="Times New Roman" w:hAnsi="Times New Roman" w:cs="Times New Roman"/>
+          <w:lang w:val="fr-FR"/>
+        </w:rPr>
+        <w:t xml:space="preserve"> Choix des technologies : ……</w:t>
+      </w:r>
+      <w:r>
+        <w:rPr>
+          <w:rFonts w:ascii="Times New Roman" w:hAnsi="Times New Roman" w:cs="Times New Roman"/>
+          <w:lang w:val="fr-FR"/>
+        </w:rPr>
+        <w:t>………………………</w:t>
+      </w:r>
+      <w:r>
+        <w:rPr>
+          <w:rFonts w:ascii="Times New Roman" w:hAnsi="Times New Roman" w:cs="Times New Roman"/>
+          <w:lang w:val="fr-FR"/>
+        </w:rPr>
+        <w:t>……………………</w:t>
+      </w:r>
+      <w:r>
+        <w:rPr>
+          <w:rFonts w:ascii="Times New Roman" w:hAnsi="Times New Roman" w:cs="Times New Roman"/>
+          <w:lang w:val="fr-FR"/>
+        </w:rPr>
+        <w:t>…</w:t>
+      </w:r>
+    </w:p>
+    <w:p>
+      <w:pPr>
+        <w:pStyle w:val="Paragraphedeliste"/>
+        <w:numPr>
+          <w:ilvl w:val="1"/>
+          <w:numId w:val="5"/>
+        </w:numPr>
+        <w:rPr>
+          <w:rFonts w:ascii="Times New Roman" w:hAnsi="Times New Roman" w:cs="Times New Roman"/>
+          <w:lang w:val="fr-FR"/>
+        </w:rPr>
+      </w:pPr>
+      <w:r>
+        <w:rPr>
+          <w:rFonts w:ascii="Times New Roman" w:hAnsi="Times New Roman" w:cs="Times New Roman"/>
+          <w:lang w:val="fr-FR"/>
+        </w:rPr>
+        <w:t>Conception détaillé de l’Application : …</w:t>
+      </w:r>
+      <w:r>
+        <w:rPr>
+          <w:rFonts w:ascii="Times New Roman" w:hAnsi="Times New Roman" w:cs="Times New Roman"/>
+          <w:lang w:val="fr-FR"/>
+        </w:rPr>
+        <w:t>…………………………………</w:t>
+      </w:r>
+      <w:r>
+        <w:rPr>
+          <w:rFonts w:ascii="Times New Roman" w:hAnsi="Times New Roman" w:cs="Times New Roman"/>
+          <w:lang w:val="fr-FR"/>
+        </w:rPr>
+        <w:t>……</w:t>
+      </w:r>
+      <w:r>
+        <w:rPr>
+          <w:rFonts w:ascii="Times New Roman" w:hAnsi="Times New Roman" w:cs="Times New Roman"/>
+          <w:lang w:val="fr-FR"/>
+        </w:rPr>
+        <w:t>……</w:t>
+      </w:r>
+      <w:r>
+        <w:rPr>
+          <w:rFonts w:ascii="Times New Roman" w:hAnsi="Times New Roman" w:cs="Times New Roman"/>
+          <w:lang w:val="fr-FR"/>
+        </w:rPr>
+        <w:t>.</w:t>
+      </w:r>
+    </w:p>
+    <w:p>
+      <w:pPr>
+        <w:pStyle w:val="Paragraphedeliste"/>
+        <w:numPr>
+          <w:ilvl w:val="2"/>
+          <w:numId w:val="5"/>
+        </w:numPr>
+        <w:rPr>
+          <w:rFonts w:ascii="Times New Roman" w:hAnsi="Times New Roman" w:cs="Times New Roman"/>
+          <w:lang w:val="fr-FR"/>
+        </w:rPr>
+      </w:pPr>
+      <w:r>
+        <w:rPr>
+          <w:rFonts w:ascii="Times New Roman" w:hAnsi="Times New Roman" w:cs="Times New Roman"/>
+          <w:lang w:val="fr-FR"/>
+        </w:rPr>
+        <w:t xml:space="preserve"> Modélisation de la base de données : …</w:t>
+      </w:r>
+      <w:r>
+        <w:rPr>
+          <w:rFonts w:ascii="Times New Roman" w:hAnsi="Times New Roman" w:cs="Times New Roman"/>
+          <w:lang w:val="fr-FR"/>
+        </w:rPr>
+        <w:t>……………………</w:t>
+      </w:r>
+      <w:r>
+        <w:rPr>
+          <w:rFonts w:ascii="Times New Roman" w:hAnsi="Times New Roman" w:cs="Times New Roman"/>
+          <w:lang w:val="fr-FR"/>
+        </w:rPr>
+        <w:t>……………….</w:t>
+      </w:r>
+    </w:p>
+    <w:p>
+      <w:pPr>
+        <w:pStyle w:val="Paragraphedeliste"/>
+        <w:numPr>
+          <w:ilvl w:val="2"/>
+          <w:numId w:val="5"/>
+        </w:numPr>
+        <w:rPr>
+          <w:rFonts w:ascii="Times New Roman" w:hAnsi="Times New Roman" w:cs="Times New Roman"/>
+          <w:lang w:val="fr-FR"/>
+        </w:rPr>
+      </w:pPr>
+      <w:r>
+        <w:rPr>
+          <w:rFonts w:ascii="Times New Roman" w:hAnsi="Times New Roman" w:cs="Times New Roman"/>
+          <w:lang w:val="fr-FR"/>
+        </w:rPr>
+        <w:t xml:space="preserve"> Conception de l’Interface graphique</w:t>
+      </w:r>
+      <w:r>
+        <w:rPr>
+          <w:rFonts w:ascii="Times New Roman" w:hAnsi="Times New Roman" w:cs="Times New Roman"/>
+          <w:lang w:val="fr-FR"/>
+        </w:rPr>
+        <w:t> : ……</w:t>
+      </w:r>
+      <w:r>
+        <w:rPr>
+          <w:rFonts w:ascii="Times New Roman" w:hAnsi="Times New Roman" w:cs="Times New Roman"/>
+          <w:lang w:val="fr-FR"/>
+        </w:rPr>
+        <w:t>…</w:t>
+      </w:r>
+      <w:r>
+        <w:rPr>
+          <w:rFonts w:ascii="Times New Roman" w:hAnsi="Times New Roman" w:cs="Times New Roman"/>
+          <w:lang w:val="fr-FR"/>
+        </w:rPr>
+        <w:t>………………</w:t>
+      </w:r>
+      <w:r>
+        <w:rPr>
+          <w:rFonts w:ascii="Times New Roman" w:hAnsi="Times New Roman" w:cs="Times New Roman"/>
+          <w:lang w:val="fr-FR"/>
+        </w:rPr>
+        <w:t>……………….</w:t>
+      </w:r>
+    </w:p>
+    <w:p>
+      <w:pPr>
+        <w:pStyle w:val="Paragraphedeliste"/>
+        <w:numPr>
+          <w:ilvl w:val="1"/>
+          <w:numId w:val="5"/>
+        </w:numPr>
+        <w:rPr>
+          <w:rFonts w:ascii="Times New Roman" w:hAnsi="Times New Roman" w:cs="Times New Roman"/>
+          <w:lang w:val="fr-FR"/>
+        </w:rPr>
+      </w:pPr>
+      <w:r>
+        <w:rPr>
+          <w:rFonts w:ascii="Times New Roman" w:hAnsi="Times New Roman" w:cs="Times New Roman"/>
+          <w:lang w:val="fr-FR"/>
+        </w:rPr>
+        <w:t>Conception des API</w:t>
+      </w:r>
+      <w:r>
+        <w:rPr>
+          <w:rFonts w:ascii="Times New Roman" w:hAnsi="Times New Roman" w:cs="Times New Roman"/>
+          <w:lang w:val="fr-FR"/>
+        </w:rPr>
+        <w:t> : ………………………</w:t>
+      </w:r>
+      <w:r>
+        <w:rPr>
+          <w:rFonts w:ascii="Times New Roman" w:hAnsi="Times New Roman" w:cs="Times New Roman"/>
+          <w:lang w:val="fr-FR"/>
+        </w:rPr>
+        <w:t>………</w:t>
+      </w:r>
+      <w:r>
+        <w:rPr>
+          <w:rFonts w:ascii="Times New Roman" w:hAnsi="Times New Roman" w:cs="Times New Roman"/>
+          <w:lang w:val="fr-FR"/>
+        </w:rPr>
+        <w:t>………………………………</w:t>
+      </w:r>
+      <w:r>
+        <w:rPr>
+          <w:rFonts w:ascii="Times New Roman" w:hAnsi="Times New Roman" w:cs="Times New Roman"/>
+          <w:lang w:val="fr-FR"/>
+        </w:rPr>
+        <w:t>….</w:t>
+      </w:r>
+    </w:p>
+    <w:p>
+      <w:pPr>
+        <w:pStyle w:val="Titre4"/>
+        <w:rPr>
+          <w:rStyle w:val="lev"/>
+          <w:rFonts w:ascii="Times New Roman" w:hAnsi="Times New Roman" w:cs="Times New Roman"/>
+          <w:i w:val="0"/>
+          <w:color w:val="000000" w:themeColor="text1"/>
+          <w:lang w:val="fr-FR"/>
+        </w:rPr>
+      </w:pPr>
+      <w:r>
+        <w:rPr>
+          <w:rFonts w:ascii="Times New Roman" w:hAnsi="Times New Roman" w:cs="Times New Roman"/>
+          <w:lang w:val="fr-FR"/>
+        </w:rPr>
+        <w:t xml:space="preserve">  </w:t>
+      </w:r>
+      <w:r>
+        <w:rPr>
+          <w:rFonts w:ascii="Times New Roman" w:hAnsi="Times New Roman" w:cs="Times New Roman"/>
+          <w:sz w:val="24"/>
+          <w:szCs w:val="24"/>
+          <w:lang w:val="fr-FR"/>
+        </w:rPr>
+        <w:t xml:space="preserve">  </w:t>
+      </w:r>
+      <w:r>
+        <w:rPr>
+          <w:rFonts w:ascii="Times New Roman" w:hAnsi="Times New Roman" w:cs="Times New Roman"/>
+          <w:b w:val="0"/>
+          <w:i w:val="0"/>
+          <w:color w:val="000000" w:themeColor="text1"/>
+          <w:sz w:val="24"/>
+          <w:szCs w:val="24"/>
+          <w:lang w:val="fr-FR"/>
+        </w:rPr>
+        <w:t>C</w:t>
+      </w:r>
+      <w:r>
+        <w:rPr>
+          <w:rFonts w:ascii="Times New Roman" w:hAnsi="Times New Roman" w:cs="Times New Roman"/>
+          <w:b w:val="0"/>
+          <w:i w:val="0"/>
+          <w:color w:val="000000" w:themeColor="text1"/>
+          <w:sz w:val="24"/>
+          <w:szCs w:val="24"/>
+          <w:lang w:val="fr-FR"/>
+        </w:rPr>
+        <w:t>hapitre</w:t>
+      </w:r>
+      <w:r>
+        <w:rPr>
+          <w:rFonts w:ascii="Times New Roman" w:hAnsi="Times New Roman" w:cs="Times New Roman"/>
+          <w:b w:val="0"/>
+          <w:i w:val="0"/>
+          <w:color w:val="000000" w:themeColor="text1"/>
+          <w:sz w:val="24"/>
+          <w:szCs w:val="24"/>
+          <w:lang w:val="fr-FR"/>
+        </w:rPr>
+        <w:t xml:space="preserve"> </w:t>
+      </w:r>
+      <w:r>
+        <w:rPr>
+          <w:rFonts w:ascii="Times New Roman" w:hAnsi="Times New Roman" w:cs="Times New Roman"/>
+          <w:b w:val="0"/>
+          <w:i w:val="0"/>
+          <w:color w:val="000000" w:themeColor="text1"/>
+          <w:sz w:val="24"/>
+          <w:szCs w:val="24"/>
+          <w:lang w:val="fr-FR"/>
+        </w:rPr>
+        <w:t>3</w:t>
+      </w:r>
+      <w:r>
+        <w:rPr>
+          <w:rFonts w:ascii="Times New Roman" w:hAnsi="Times New Roman" w:cs="Times New Roman"/>
+          <w:b w:val="0"/>
+          <w:i w:val="0"/>
+          <w:color w:val="000000" w:themeColor="text1"/>
+          <w:sz w:val="24"/>
+          <w:szCs w:val="24"/>
+          <w:lang w:val="fr-FR"/>
+        </w:rPr>
+        <w:t xml:space="preserve"> : </w:t>
+      </w:r>
+      <w:r>
+        <w:rPr>
+          <w:rStyle w:val="lev"/>
+          <w:rFonts w:ascii="Times New Roman" w:hAnsi="Times New Roman" w:cs="Times New Roman"/>
+          <w:i w:val="0"/>
+          <w:color w:val="000000" w:themeColor="text1"/>
+          <w:lang w:val="fr-FR"/>
+        </w:rPr>
+        <w:t xml:space="preserve"> </w:t>
+      </w:r>
+      <w:r>
+        <w:rPr>
+          <w:rStyle w:val="lev"/>
+          <w:rFonts w:ascii="Times New Roman" w:hAnsi="Times New Roman" w:cs="Times New Roman"/>
+          <w:i w:val="0"/>
+          <w:color w:val="000000" w:themeColor="text1"/>
+          <w:lang w:val="fr-FR"/>
+        </w:rPr>
+        <w:t>……</w:t>
+      </w:r>
+      <w:r>
+        <w:rPr>
+          <w:rStyle w:val="lev"/>
+          <w:rFonts w:ascii="Times New Roman" w:hAnsi="Times New Roman" w:cs="Times New Roman"/>
+          <w:i w:val="0"/>
+          <w:color w:val="000000" w:themeColor="text1"/>
+          <w:lang w:val="fr-FR"/>
+        </w:rPr>
+        <w:t>……………</w:t>
+      </w:r>
+      <w:r>
+        <w:rPr>
+          <w:rStyle w:val="lev"/>
+          <w:rFonts w:ascii="Times New Roman" w:hAnsi="Times New Roman" w:cs="Times New Roman"/>
+          <w:i w:val="0"/>
+          <w:color w:val="000000" w:themeColor="text1"/>
+          <w:lang w:val="fr-FR"/>
+        </w:rPr>
+        <w:t>………………………………………</w:t>
+      </w:r>
+      <w:r>
+        <w:rPr>
+          <w:rStyle w:val="lev"/>
+          <w:rFonts w:ascii="Times New Roman" w:hAnsi="Times New Roman" w:cs="Times New Roman"/>
+          <w:i w:val="0"/>
+          <w:color w:val="000000" w:themeColor="text1"/>
+          <w:lang w:val="fr-FR"/>
+        </w:rPr>
+        <w:t>……</w:t>
+      </w:r>
+      <w:r>
+        <w:rPr>
+          <w:rStyle w:val="lev"/>
+          <w:rFonts w:ascii="Times New Roman" w:hAnsi="Times New Roman" w:cs="Times New Roman"/>
+          <w:i w:val="0"/>
+          <w:color w:val="000000" w:themeColor="text1"/>
+          <w:lang w:val="fr-FR"/>
+        </w:rPr>
+        <w:t>……</w:t>
+      </w:r>
+      <w:r>
+        <w:rPr>
+          <w:rStyle w:val="lev"/>
+          <w:rFonts w:ascii="Times New Roman" w:hAnsi="Times New Roman" w:cs="Times New Roman"/>
+          <w:i w:val="0"/>
+          <w:color w:val="000000" w:themeColor="text1"/>
+          <w:lang w:val="fr-FR"/>
+        </w:rPr>
+        <w:t>……….</w:t>
+      </w:r>
+    </w:p>
+    <w:p>
+      <w:pPr>
+        <w:pStyle w:val="Paragraphedeliste"/>
+        <w:numPr>
+          <w:ilvl w:val="1"/>
+          <w:numId w:val="11"/>
+        </w:numPr>
+        <w:rPr>
+          <w:rFonts w:ascii="Times New Roman" w:hAnsi="Times New Roman" w:cs="Times New Roman"/>
+          <w:lang w:val="fr-FR"/>
+        </w:rPr>
+      </w:pPr>
+      <w:r>
+        <w:rPr>
+          <w:rFonts w:ascii="Times New Roman" w:hAnsi="Times New Roman" w:cs="Times New Roman"/>
+          <w:lang w:val="fr-FR"/>
+        </w:rPr>
+        <w:t>Environnement de Développement : ……………………………………………</w:t>
+      </w:r>
+      <w:r>
+        <w:rPr>
+          <w:rFonts w:ascii="Times New Roman" w:hAnsi="Times New Roman" w:cs="Times New Roman"/>
+          <w:lang w:val="fr-FR"/>
+        </w:rPr>
+        <w:t>……</w:t>
+      </w:r>
+      <w:r>
+        <w:rPr>
+          <w:rFonts w:ascii="Times New Roman" w:hAnsi="Times New Roman" w:cs="Times New Roman"/>
+          <w:lang w:val="fr-FR"/>
+        </w:rPr>
+        <w:t>.</w:t>
+      </w:r>
+    </w:p>
+    <w:p>
+      <w:pPr>
+        <w:pStyle w:val="Paragraphedeliste"/>
+        <w:numPr>
+          <w:ilvl w:val="2"/>
+          <w:numId w:val="11"/>
+        </w:numPr>
+        <w:rPr>
+          <w:rFonts w:ascii="Times New Roman" w:hAnsi="Times New Roman" w:cs="Times New Roman"/>
+          <w:lang w:val="fr-FR"/>
+        </w:rPr>
+      </w:pPr>
+      <w:r>
+        <w:rPr>
+          <w:rFonts w:ascii="Times New Roman" w:hAnsi="Times New Roman" w:cs="Times New Roman"/>
+          <w:lang w:val="fr-FR"/>
+        </w:rPr>
+        <w:t xml:space="preserve"> Description de l’environnement : ………………………………</w:t>
+      </w:r>
+      <w:r>
+        <w:rPr>
+          <w:rFonts w:ascii="Times New Roman" w:hAnsi="Times New Roman" w:cs="Times New Roman"/>
+          <w:lang w:val="fr-FR"/>
+        </w:rPr>
+        <w:t>………</w:t>
+      </w:r>
+      <w:r>
+        <w:rPr>
+          <w:rFonts w:ascii="Times New Roman" w:hAnsi="Times New Roman" w:cs="Times New Roman"/>
+          <w:lang w:val="fr-FR"/>
+        </w:rPr>
+        <w:t>……</w:t>
+      </w:r>
+      <w:r>
+        <w:rPr>
+          <w:rFonts w:ascii="Times New Roman" w:hAnsi="Times New Roman" w:cs="Times New Roman"/>
+          <w:lang w:val="fr-FR"/>
+        </w:rPr>
+        <w:t>.</w:t>
+      </w:r>
+    </w:p>
+    <w:p>
+      <w:pPr>
+        <w:pStyle w:val="Paragraphedeliste"/>
+        <w:numPr>
+          <w:ilvl w:val="2"/>
+          <w:numId w:val="11"/>
+        </w:numPr>
+        <w:rPr>
+          <w:rFonts w:ascii="Times New Roman" w:hAnsi="Times New Roman" w:cs="Times New Roman"/>
+          <w:lang w:val="fr-FR"/>
+        </w:rPr>
+      </w:pPr>
+      <w:r>
+        <w:rPr>
+          <w:rFonts w:ascii="Times New Roman" w:hAnsi="Times New Roman" w:cs="Times New Roman"/>
+          <w:lang w:val="fr-FR"/>
+        </w:rPr>
+        <w:t>Gestion du code source : ……………………</w:t>
+      </w:r>
+      <w:r>
+        <w:rPr>
+          <w:rFonts w:ascii="Times New Roman" w:hAnsi="Times New Roman" w:cs="Times New Roman"/>
+          <w:lang w:val="fr-FR"/>
+        </w:rPr>
+        <w:t>……</w:t>
+      </w:r>
+      <w:r>
+        <w:rPr>
+          <w:rFonts w:ascii="Times New Roman" w:hAnsi="Times New Roman" w:cs="Times New Roman"/>
+          <w:lang w:val="fr-FR"/>
+        </w:rPr>
+        <w:t>………………</w:t>
+      </w:r>
+      <w:r>
+        <w:rPr>
+          <w:rFonts w:ascii="Times New Roman" w:hAnsi="Times New Roman" w:cs="Times New Roman"/>
+          <w:lang w:val="fr-FR"/>
+        </w:rPr>
+        <w:t>……………</w:t>
+      </w:r>
+    </w:p>
+    <w:p>
+      <w:pPr>
+        <w:pStyle w:val="Paragraphedeliste"/>
+        <w:numPr>
+          <w:ilvl w:val="1"/>
+          <w:numId w:val="11"/>
+        </w:numPr>
+        <w:rPr>
+          <w:rFonts w:ascii="Times New Roman" w:hAnsi="Times New Roman" w:cs="Times New Roman"/>
+          <w:lang w:val="fr-FR"/>
+        </w:rPr>
+      </w:pPr>
+      <w:r>
+        <w:rPr>
+          <w:rFonts w:ascii="Times New Roman" w:hAnsi="Times New Roman" w:cs="Times New Roman"/>
+          <w:lang w:val="fr-FR"/>
+        </w:rPr>
+        <w:t>Réalisation et Développement : ………………………</w:t>
+      </w:r>
+      <w:r>
+        <w:rPr>
+          <w:rFonts w:ascii="Times New Roman" w:hAnsi="Times New Roman" w:cs="Times New Roman"/>
+          <w:lang w:val="fr-FR"/>
+        </w:rPr>
+        <w:t>…</w:t>
+      </w:r>
+      <w:r>
+        <w:rPr>
+          <w:rFonts w:ascii="Times New Roman" w:hAnsi="Times New Roman" w:cs="Times New Roman"/>
+          <w:lang w:val="fr-FR"/>
+        </w:rPr>
+        <w:t>…</w:t>
+      </w:r>
+      <w:r>
+        <w:rPr>
+          <w:rFonts w:ascii="Times New Roman" w:hAnsi="Times New Roman" w:cs="Times New Roman"/>
+          <w:lang w:val="fr-FR"/>
+        </w:rPr>
+        <w:t>……………</w:t>
+      </w:r>
+      <w:r>
+        <w:rPr>
+          <w:rFonts w:ascii="Times New Roman" w:hAnsi="Times New Roman" w:cs="Times New Roman"/>
+          <w:lang w:val="fr-FR"/>
+        </w:rPr>
+        <w:t>…………….</w:t>
+      </w:r>
+    </w:p>
+    <w:p>
+      <w:pPr>
+        <w:pStyle w:val="Paragraphedeliste"/>
+        <w:numPr>
+          <w:ilvl w:val="2"/>
+          <w:numId w:val="11"/>
+        </w:numPr>
+        <w:rPr>
+          <w:rFonts w:ascii="Times New Roman" w:hAnsi="Times New Roman" w:cs="Times New Roman"/>
+          <w:lang w:val="fr-FR"/>
+        </w:rPr>
+      </w:pPr>
+      <w:r>
+        <w:rPr>
+          <w:rFonts w:ascii="Times New Roman" w:hAnsi="Times New Roman" w:cs="Times New Roman"/>
+          <w:lang w:val="fr-FR"/>
+        </w:rPr>
+        <w:t xml:space="preserve"> Développement du Frontend : …………………</w:t>
+      </w:r>
+      <w:r>
+        <w:rPr>
+          <w:rFonts w:ascii="Times New Roman" w:hAnsi="Times New Roman" w:cs="Times New Roman"/>
+          <w:lang w:val="fr-FR"/>
+        </w:rPr>
+        <w:t>……</w:t>
+      </w:r>
+      <w:r>
+        <w:rPr>
+          <w:rFonts w:ascii="Times New Roman" w:hAnsi="Times New Roman" w:cs="Times New Roman"/>
+          <w:lang w:val="fr-FR"/>
+        </w:rPr>
+        <w:t>………</w:t>
+      </w:r>
+      <w:r>
+        <w:rPr>
+          <w:rFonts w:ascii="Times New Roman" w:hAnsi="Times New Roman" w:cs="Times New Roman"/>
+          <w:lang w:val="fr-FR"/>
+        </w:rPr>
+        <w:t>………………</w:t>
+      </w:r>
+      <w:r>
+        <w:rPr>
+          <w:rFonts w:ascii="Times New Roman" w:hAnsi="Times New Roman" w:cs="Times New Roman"/>
+          <w:lang w:val="fr-FR"/>
+        </w:rPr>
+        <w:t>.</w:t>
+      </w:r>
+    </w:p>
+    <w:p>
+      <w:pPr>
+        <w:pStyle w:val="Paragraphedeliste"/>
+        <w:numPr>
+          <w:ilvl w:val="2"/>
+          <w:numId w:val="11"/>
+        </w:numPr>
+        <w:rPr>
+          <w:rFonts w:ascii="Times New Roman" w:hAnsi="Times New Roman" w:cs="Times New Roman"/>
+          <w:lang w:val="fr-FR"/>
+        </w:rPr>
+      </w:pPr>
+      <w:r>
+        <w:rPr>
+          <w:rFonts w:ascii="Times New Roman" w:hAnsi="Times New Roman" w:cs="Times New Roman"/>
+          <w:lang w:val="fr-FR"/>
+        </w:rPr>
+        <w:t xml:space="preserve"> Développement du Backend : ………………………………………………...</w:t>
+      </w:r>
+    </w:p>
+    <w:p>
+      <w:pPr>
+        <w:pStyle w:val="Paragraphedeliste"/>
+        <w:numPr>
+          <w:ilvl w:val="2"/>
+          <w:numId w:val="11"/>
+        </w:numPr>
+        <w:rPr>
+          <w:rFonts w:ascii="Times New Roman" w:hAnsi="Times New Roman" w:cs="Times New Roman"/>
+          <w:lang w:val="fr-FR"/>
+        </w:rPr>
+      </w:pPr>
+      <w:r>
+        <w:rPr>
+          <w:rFonts w:ascii="Times New Roman" w:hAnsi="Times New Roman" w:cs="Times New Roman"/>
+          <w:lang w:val="fr-FR"/>
+        </w:rPr>
+        <w:t>Intégration et Déploiement : ……………………………………………</w:t>
+      </w:r>
+      <w:r>
+        <w:rPr>
+          <w:rFonts w:ascii="Times New Roman" w:hAnsi="Times New Roman" w:cs="Times New Roman"/>
+          <w:lang w:val="fr-FR"/>
+        </w:rPr>
+        <w:t>……</w:t>
+      </w:r>
+      <w:r>
+        <w:rPr>
+          <w:rFonts w:ascii="Times New Roman" w:hAnsi="Times New Roman" w:cs="Times New Roman"/>
+          <w:lang w:val="fr-FR"/>
+        </w:rPr>
+        <w:t>.</w:t>
+      </w:r>
+    </w:p>
+    <w:p>
+      <w:pPr>
+        <w:pStyle w:val="Paragraphedeliste"/>
+        <w:numPr>
+          <w:ilvl w:val="2"/>
+          <w:numId w:val="11"/>
+        </w:numPr>
+        <w:rPr>
+          <w:rFonts w:ascii="Times New Roman" w:hAnsi="Times New Roman" w:cs="Times New Roman"/>
+          <w:lang w:val="fr-FR"/>
+        </w:rPr>
+      </w:pPr>
+      <w:r>
+        <w:rPr>
+          <w:rFonts w:ascii="Times New Roman" w:hAnsi="Times New Roman" w:cs="Times New Roman"/>
+          <w:lang w:val="fr-FR"/>
+        </w:rPr>
+        <w:t>Tests d’Utilisateur : ……………………………………………………………</w:t>
+      </w:r>
+    </w:p>
+    <w:p>
+      <w:pPr>
+        <w:rPr>
+          <w:rFonts w:ascii="Times New Roman" w:hAnsi="Times New Roman" w:cs="Times New Roman"/>
+          <w:sz w:val="24"/>
+          <w:szCs w:val="24"/>
+          <w:lang w:val="fr-FR"/>
+        </w:rPr>
+      </w:pPr>
+      <w:r>
+        <w:rPr>
+          <w:rFonts w:ascii="Times New Roman" w:hAnsi="Times New Roman" w:cs="Times New Roman"/>
+          <w:sz w:val="24"/>
+          <w:szCs w:val="24"/>
+          <w:lang w:val="fr-FR"/>
+        </w:rPr>
         <w:t xml:space="preserve">CONCLUSION : …………………………………………………………………… </w:t>
       </w:r>
     </w:p>
-    <w:p/>
-    <w:p>
+    <w:p>
+      <w:pPr>
+        <w:rPr>
+          <w:rFonts w:ascii="Times New Roman" w:hAnsi="Times New Roman" w:cs="Times New Roman"/>
+        </w:rPr>
+      </w:pPr>
       <w:r>
         <w:rPr>
           <w:rFonts w:ascii="Times New Roman" w:hAnsi="Times New Roman" w:cs="Times New Roman"/>
@@ -1781,13 +2999,13 @@
         <mc:AlternateContent>
           <mc:Choice Requires="wps">
             <w:drawing>
-              <wp:anchor distT="0" distB="0" distL="114300" distR="114300" simplePos="0" relativeHeight="251669504" behindDoc="1" locked="0" layoutInCell="1" allowOverlap="1" wp14:anchorId="15B0FBB8" wp14:editId="20A91E27">
+              <wp:anchor distT="0" distB="0" distL="114300" distR="114300" simplePos="0" relativeHeight="251669504" behindDoc="1" locked="0" layoutInCell="1" allowOverlap="1" wp14:anchorId="15B0FBB8" wp14:editId="102B5E67">
                 <wp:simplePos x="0" y="0"/>
                 <wp:positionH relativeFrom="column">
-                  <wp:posOffset>2734375</wp:posOffset>
+                  <wp:posOffset>2650309</wp:posOffset>
                 </wp:positionH>
                 <wp:positionV relativeFrom="paragraph">
-                  <wp:posOffset>4776820</wp:posOffset>
+                  <wp:posOffset>562494</wp:posOffset>
                 </wp:positionV>
                 <wp:extent cx="588723" cy="413359"/>
                 <wp:effectExtent l="0" t="0" r="20955" b="25400"/>
@@ -1920,7 +3138,7 @@
                   <v:h position="#1,bottomRight" xrange="8640,12960"/>
                 </v:handles>
               </v:shapetype>
-              <v:shape id="Vague 1" o:spid="_x0000_s1026" type="#_x0000_t64" style="position:absolute;margin-left:215.3pt;margin-top:376.15pt;width:46.35pt;height:32.55pt;z-index:-251646976;visibility:visible;mso-wrap-style:square;mso-width-percent:0;mso-height-percent:0;mso-wrap-distance-left:9pt;mso-wrap-distance-top:0;mso-wrap-distance-right:9pt;mso-wrap-distance-bottom:0;mso-position-horizontal:absolute;mso-position-horizontal-relative:text;mso-position-vertical:absolute;mso-position-vertical-relative:text;mso-width-percent:0;mso-height-percent:0;mso-width-relative:margin;mso-height-relative:margin;v-text-anchor:middle" o:gfxdata="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" adj="883,10669" filled="f" strokecolor="#1f4d78 [1604]" strokeweight="1.5pt">
+              <v:shape id="Vague 1" o:spid="_x0000_s1026" type="#_x0000_t64" style="position:absolute;margin-left:208.7pt;margin-top:44.3pt;width:46.35pt;height:32.55pt;z-index:-251646976;visibility:visible;mso-wrap-style:square;mso-width-percent:0;mso-height-percent:0;mso-wrap-distance-left:9pt;mso-wrap-distance-top:0;mso-wrap-distance-right:9pt;mso-wrap-distance-bottom:0;mso-position-horizontal:absolute;mso-position-horizontal-relative:text;mso-position-vertical:absolute;mso-position-vertical-relative:text;mso-width-percent:0;mso-height-percent:0;mso-width-relative:margin;mso-height-relative:margin;v-text-anchor:middle" o:gfxdata="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" adj="883,10669" filled="f" strokecolor="#1f4d78 [1604]" strokeweight="1.5pt">
                 <v:stroke joinstyle="miter"/>
                 <v:textbox>
                   <w:txbxContent>
@@ -1951,9 +3169,27 @@
           </mc:Fallback>
         </mc:AlternateContent>
       </w:r>
-      <w:r>
-        <w:br w:type="page"/>
-      </w:r>
+    </w:p>
+    <w:p>
+      <w:pPr>
+        <w:rPr>
+          <w:rFonts w:ascii="Times New Roman" w:hAnsi="Times New Roman" w:cs="Times New Roman"/>
+        </w:rPr>
+      </w:pPr>
+    </w:p>
+    <w:p>
+      <w:pPr>
+        <w:rPr>
+          <w:rFonts w:ascii="Times New Roman" w:hAnsi="Times New Roman" w:cs="Times New Roman"/>
+        </w:rPr>
+      </w:pPr>
+    </w:p>
+    <w:p>
+      <w:pPr>
+        <w:rPr>
+          <w:rFonts w:ascii="Times New Roman" w:hAnsi="Times New Roman" w:cs="Times New Roman"/>
+        </w:rPr>
+      </w:pPr>
     </w:p>
     <w:p>
       <w:pPr>
@@ -1970,7 +3206,6 @@
           <w:sz w:val="28"/>
           <w:szCs w:val="28"/>
         </w:rPr>
-        <w:lastRenderedPageBreak/>
         <w:t>LISTES DES ABREVIATIONS</w:t>
       </w:r>
     </w:p>
@@ -1992,13 +3227,13 @@
         <mc:AlternateContent>
           <mc:Choice Requires="wps">
             <w:drawing>
-              <wp:anchor distT="0" distB="0" distL="114300" distR="114300" simplePos="0" relativeHeight="251671552" behindDoc="1" locked="0" layoutInCell="1" allowOverlap="1" wp14:anchorId="7D99349B" wp14:editId="0EFE6F0A">
+              <wp:anchor distT="0" distB="0" distL="114300" distR="114300" simplePos="0" relativeHeight="251671552" behindDoc="1" locked="0" layoutInCell="1" allowOverlap="1" wp14:anchorId="7D99349B" wp14:editId="5880D5CE">
                 <wp:simplePos x="0" y="0"/>
                 <wp:positionH relativeFrom="column">
-                  <wp:posOffset>2767418</wp:posOffset>
+                  <wp:posOffset>2696078</wp:posOffset>
                 </wp:positionH>
                 <wp:positionV relativeFrom="paragraph">
-                  <wp:posOffset>8082915</wp:posOffset>
+                  <wp:posOffset>7738531</wp:posOffset>
                 </wp:positionV>
                 <wp:extent cx="588723" cy="413359"/>
                 <wp:effectExtent l="0" t="0" r="20955" b="25400"/>
@@ -2083,7 +3318,7 @@
           </mc:Choice>
           <mc:Fallback>
             <w:pict>
-              <v:shape w14:anchorId="7D99349B" id="Vague 2" o:spid="_x0000_s1027" type="#_x0000_t64" style="position:absolute;margin-left:217.9pt;margin-top:636.45pt;width:46.35pt;height:32.55pt;z-index:-251644928;visibility:visible;mso-wrap-style:square;mso-width-percent:0;mso-height-percent:0;mso-wrap-distance-left:9pt;mso-wrap-distance-top:0;mso-wrap-distance-right:9pt;mso-wrap-distance-bottom:0;mso-position-horizontal:absolute;mso-position-horizontal-relative:text;mso-position-vertical:absolute;mso-position-vertical-relative:text;mso-width-percent:0;mso-height-percent:0;mso-width-relative:margin;mso-height-relative:margin;v-text-anchor:middle" o:gfxdata="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" adj="883,10669" filled="f" strokecolor="#1f4d78 [1604]" strokeweight="1.5pt">
+              <v:shape w14:anchorId="7D99349B" id="Vague 2" o:spid="_x0000_s1027" type="#_x0000_t64" style="position:absolute;margin-left:212.3pt;margin-top:609.35pt;width:46.35pt;height:32.55pt;z-index:-251644928;visibility:visible;mso-wrap-style:square;mso-width-percent:0;mso-height-percent:0;mso-wrap-distance-left:9pt;mso-wrap-distance-top:0;mso-wrap-distance-right:9pt;mso-wrap-distance-bottom:0;mso-position-horizontal:absolute;mso-position-horizontal-relative:text;mso-position-vertical:absolute;mso-position-vertical-relative:text;mso-width-percent:0;mso-height-percent:0;mso-width-relative:margin;mso-height-relative:margin;v-text-anchor:middle" o:gfxdata="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" adj="883,10669" filled="f" strokecolor="#1f4d78 [1604]" strokeweight="1.5pt">
                 <v:stroke joinstyle="miter"/>
                 <v:textbox>
                   <w:txbxContent>
@@ -2139,18 +3374,8 @@
           <w:szCs w:val="28"/>
         </w:rPr>
         <w:lastRenderedPageBreak/>
-        <w:t xml:space="preserve">LISTES DES </w:t>
-      </w:r>
-      <w:r>
-        <w:rPr>
-          <w:rFonts w:ascii="Times New Roman" w:hAnsi="Times New Roman" w:cs="Times New Roman"/>
-          <w:sz w:val="28"/>
-          <w:szCs w:val="28"/>
-        </w:rPr>
-        <w:t>FIGURES</w:t>
-      </w:r>
-      <w:bookmarkStart w:id="0" w:name="_GoBack"/>
-      <w:bookmarkEnd w:id="0"/>
+        <w:t>LISTES DES FIGURES</w:t>
+      </w:r>
     </w:p>
     <w:p>
       <w:pPr>
@@ -2261,7 +3486,7 @@
           </mc:Choice>
           <mc:Fallback>
             <w:pict>
-              <v:shape w14:anchorId="2624867F" id="Vague 4" o:spid="_x0000_s1028" type="#_x0000_t64" style="position:absolute;margin-left:218.05pt;margin-top:642.5pt;width:46.35pt;height:32.55pt;z-index:-251642880;visibility:visible;mso-wrap-style:square;mso-width-percent:0;mso-height-percent:0;mso-wrap-distance-left:9pt;mso-wrap-distance-top:0;mso-wrap-distance-right:9pt;mso-wrap-distance-bottom:0;mso-position-horizontal:absolute;mso-position-horizontal-relative:text;mso-position-vertical:absolute;mso-position-vertical-relative:text;mso-width-percent:0;mso-height-percent:0;mso-width-relative:margin;mso-height-relative:margin;v-text-anchor:middle" o:gfxdata="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" adj="883,10669" filled="f" strokecolor="#1f4d78 [1604]" strokeweight="1.5pt">
+              <v:shape w14:anchorId="2624867F" id="Vague 4" o:spid="_x0000_s1028" type="#_x0000_t64" style="position:absolute;margin-left:218.05pt;margin-top:642.5pt;width:46.35pt;height:32.55pt;z-index:-251642880;visibility:visible;mso-wrap-style:square;mso-width-percent:0;mso-height-percent:0;mso-wrap-distance-left:9pt;mso-wrap-distance-top:0;mso-wrap-distance-right:9pt;mso-wrap-distance-bottom:0;mso-position-horizontal:absolute;mso-position-horizontal-relative:text;mso-position-vertical:absolute;mso-position-vertical-relative:text;mso-width-percent:0;mso-height-percent:0;mso-width-relative:margin;mso-height-relative:margin;v-text-anchor:middle" o:gfxdata="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" adj="883,10669" filled="f" strokecolor="#1f4d78 [1604]" strokeweight="1.5pt">
                 <v:stroke joinstyle="miter"/>
                 <v:textbox>
                   <w:txbxContent>
@@ -2429,7 +3654,7 @@
           </mc:Choice>
           <mc:Fallback>
             <w:pict>
-              <v:shape w14:anchorId="26013A52" id="Vague 5" o:spid="_x0000_s1029" type="#_x0000_t64" style="position:absolute;margin-left:220.9pt;margin-top:637pt;width:46.35pt;height:32.55pt;z-index:-251640832;visibility:visible;mso-wrap-style:square;mso-width-percent:0;mso-height-percent:0;mso-wrap-distance-left:9pt;mso-wrap-distance-top:0;mso-wrap-distance-right:9pt;mso-wrap-distance-bottom:0;mso-position-horizontal:absolute;mso-position-horizontal-relative:text;mso-position-vertical:absolute;mso-position-vertical-relative:text;mso-width-percent:0;mso-height-percent:0;mso-width-relative:margin;mso-height-relative:margin;v-text-anchor:middle" o:gfxdata="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" adj="883,10669" filled="f" strokecolor="#1f4d78 [1604]" strokeweight="1.5pt">
+              <v:shape w14:anchorId="26013A52" id="Vague 5" o:spid="_x0000_s1029" type="#_x0000_t64" style="position:absolute;margin-left:220.9pt;margin-top:637pt;width:46.35pt;height:32.55pt;z-index:-251640832;visibility:visible;mso-wrap-style:square;mso-width-percent:0;mso-height-percent:0;mso-wrap-distance-left:9pt;mso-wrap-distance-top:0;mso-wrap-distance-right:9pt;mso-wrap-distance-bottom:0;mso-position-horizontal:absolute;mso-position-horizontal-relative:text;mso-position-vertical:absolute;mso-position-vertical-relative:text;mso-width-percent:0;mso-height-percent:0;mso-width-relative:margin;mso-height-relative:margin;v-text-anchor:middle" o:gfxdata="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" adj="883,10669" filled="f" strokecolor="#1f4d78 [1604]" strokeweight="1.5pt">
                 <v:stroke joinstyle="miter"/>
                 <v:textbox>
                   <w:txbxContent>
@@ -2570,8 +3795,1131 @@
 </w:document>
 </file>
 
+<file path=word/numbering.xml><?xml version="1.0" encoding="utf-8"?>
+<w:numbering xmlns:wpc="http://schemas.microsoft.com/office/word/2010/wordprocessingCanvas" xmlns:cx="http://schemas.microsoft.com/office/drawing/2014/chartex" xmlns:cx1="http://schemas.microsoft.com/office/drawing/2015/9/8/chartex" xmlns:cx2="http://schemas.microsoft.com/office/drawing/2015/10/21/chartex" xmlns:cx3="http://schemas.microsoft.com/office/drawing/2016/5/9/chartex" xmlns:cx4="http://schemas.microsoft.com/office/drawing/2016/5/10/chartex" xmlns:cx5="http://schemas.microsoft.com/office/drawing/2016/5/11/chartex" xmlns:cx6="http://schemas.microsoft.com/office/drawing/2016/5/12/chartex" xmlns:cx7="http://schemas.microsoft.com/office/drawing/2016/5/13/chartex" xmlns:cx8="http://schemas.microsoft.com/office/drawing/2016/5/14/chartex" xmlns:mc="http://schemas.openxmlformats.org/markup-compatibility/2006" xmlns:aink="http://schemas.microsoft.com/office/drawing/2016/ink" xmlns:am3d="http://schemas.microsoft.com/office/drawing/2017/model3d" xmlns:o="urn:schemas-microsoft-com:office:office" xmlns:oel="http://schemas.microsoft.com/office/2019/extlst" xmlns:r="http://schemas.openxmlformats.org/officeDocument/2006/relationships" xmlns:m="http://schemas.openxmlformats.org/officeDocument/2006/math" xmlns:v="urn:schemas-microsoft-com:vml" xmlns:wp14="http://schemas.microsoft.com/office/word/2010/wordprocessingDrawing" xmlns:wp="http://schemas.openxmlformats.org/drawingml/2006/wordprocessingDrawing" xmlns:w10="urn:schemas-microsoft-com:office:word" xmlns:w="http://schemas.openxmlformats.org/wordprocessingml/2006/main" xmlns:w14="http://schemas.microsoft.com/office/word/2010/wordml" xmlns:w15="http://schemas.microsoft.com/office/word/2012/wordml" xmlns:w16cex="http://schemas.microsoft.com/office/word/2018/wordml/cex" xmlns:w16cid="http://schemas.microsoft.com/office/word/2016/wordml/cid" xmlns:w16="http://schemas.microsoft.com/office/word/2018/wordml" xmlns:w16du="http://schemas.microsoft.com/office/word/2023/wordml/word16du" xmlns:w16sdtdh="http://schemas.microsoft.com/office/word/2020/wordml/sdtdatahash" xmlns:w16sdtfl="http://schemas.microsoft.com/office/word/2024/wordml/sdtformatlock" xmlns:w16se="http://schemas.microsoft.com/office/word/2015/wordml/symex" xmlns:wpg="http://schemas.microsoft.com/office/word/2010/wordprocessingGroup" xmlns:wpi="http://schemas.microsoft.com/office/word/2010/wordprocessingInk" xmlns:wne="http://schemas.microsoft.com/office/word/2006/wordml" xmlns:wps="http://schemas.microsoft.com/office/word/2010/wordprocessingShape" mc:Ignorable="w14 w15 w16se w16cid w16 w16cex w16sdtdh w16sdtfl w16du wp14">
+  <w:abstractNum w:abstractNumId="0" w15:restartNumberingAfterBreak="0">
+    <w:nsid w:val="0BC66ECE"/>
+    <w:multiLevelType w:val="multilevel"/>
+    <w:tmpl w:val="040C001F"/>
+    <w:lvl w:ilvl="0">
+      <w:start w:val="1"/>
+      <w:numFmt w:val="decimal"/>
+      <w:lvlText w:val="%1."/>
+      <w:lvlJc w:val="left"/>
+      <w:pPr>
+        <w:ind w:left="360" w:hanging="360"/>
+      </w:pPr>
+    </w:lvl>
+    <w:lvl w:ilvl="1">
+      <w:start w:val="1"/>
+      <w:numFmt w:val="decimal"/>
+      <w:lvlText w:val="%1.%2."/>
+      <w:lvlJc w:val="left"/>
+      <w:pPr>
+        <w:ind w:left="792" w:hanging="432"/>
+      </w:pPr>
+      <w:rPr>
+        <w:rFonts w:hint="default"/>
+      </w:rPr>
+    </w:lvl>
+    <w:lvl w:ilvl="2">
+      <w:start w:val="1"/>
+      <w:numFmt w:val="decimal"/>
+      <w:lvlText w:val="%1.%2.%3."/>
+      <w:lvlJc w:val="left"/>
+      <w:pPr>
+        <w:ind w:left="1224" w:hanging="504"/>
+      </w:pPr>
+      <w:rPr>
+        <w:rFonts w:hint="default"/>
+      </w:rPr>
+    </w:lvl>
+    <w:lvl w:ilvl="3">
+      <w:start w:val="1"/>
+      <w:numFmt w:val="decimal"/>
+      <w:lvlText w:val="%1.%2.%3.%4."/>
+      <w:lvlJc w:val="left"/>
+      <w:pPr>
+        <w:ind w:left="1728" w:hanging="648"/>
+      </w:pPr>
+    </w:lvl>
+    <w:lvl w:ilvl="4">
+      <w:start w:val="1"/>
+      <w:numFmt w:val="decimal"/>
+      <w:lvlText w:val="%1.%2.%3.%4.%5."/>
+      <w:lvlJc w:val="left"/>
+      <w:pPr>
+        <w:ind w:left="2232" w:hanging="792"/>
+      </w:pPr>
+    </w:lvl>
+    <w:lvl w:ilvl="5">
+      <w:start w:val="1"/>
+      <w:numFmt w:val="decimal"/>
+      <w:lvlText w:val="%1.%2.%3.%4.%5.%6."/>
+      <w:lvlJc w:val="left"/>
+      <w:pPr>
+        <w:ind w:left="2736" w:hanging="936"/>
+      </w:pPr>
+    </w:lvl>
+    <w:lvl w:ilvl="6">
+      <w:start w:val="1"/>
+      <w:numFmt w:val="decimal"/>
+      <w:lvlText w:val="%1.%2.%3.%4.%5.%6.%7."/>
+      <w:lvlJc w:val="left"/>
+      <w:pPr>
+        <w:ind w:left="3240" w:hanging="1080"/>
+      </w:pPr>
+    </w:lvl>
+    <w:lvl w:ilvl="7">
+      <w:start w:val="1"/>
+      <w:numFmt w:val="decimal"/>
+      <w:lvlText w:val="%1.%2.%3.%4.%5.%6.%7.%8."/>
+      <w:lvlJc w:val="left"/>
+      <w:pPr>
+        <w:ind w:left="3744" w:hanging="1224"/>
+      </w:pPr>
+    </w:lvl>
+    <w:lvl w:ilvl="8">
+      <w:start w:val="1"/>
+      <w:numFmt w:val="decimal"/>
+      <w:lvlText w:val="%1.%2.%3.%4.%5.%6.%7.%8.%9."/>
+      <w:lvlJc w:val="left"/>
+      <w:pPr>
+        <w:ind w:left="4320" w:hanging="1440"/>
+      </w:pPr>
+    </w:lvl>
+  </w:abstractNum>
+  <w:abstractNum w:abstractNumId="1" w15:restartNumberingAfterBreak="0">
+    <w:nsid w:val="175C505C"/>
+    <w:multiLevelType w:val="multilevel"/>
+    <w:tmpl w:val="3976BA86"/>
+    <w:styleLink w:val="Style1"/>
+    <w:lvl w:ilvl="0">
+      <w:start w:val="2"/>
+      <w:numFmt w:val="decimal"/>
+      <w:lvlText w:val="%1."/>
+      <w:lvlJc w:val="left"/>
+      <w:pPr>
+        <w:ind w:left="360" w:hanging="360"/>
+      </w:pPr>
+      <w:rPr>
+        <w:rFonts w:hint="default"/>
+      </w:rPr>
+    </w:lvl>
+    <w:lvl w:ilvl="1">
+      <w:start w:val="2"/>
+      <w:numFmt w:val="decimal"/>
+      <w:lvlText w:val="%1.%2."/>
+      <w:lvlJc w:val="left"/>
+      <w:pPr>
+        <w:ind w:left="574" w:hanging="432"/>
+      </w:pPr>
+      <w:rPr>
+        <w:rFonts w:hint="default"/>
+      </w:rPr>
+    </w:lvl>
+    <w:lvl w:ilvl="2">
+      <w:start w:val="1"/>
+      <w:numFmt w:val="decimal"/>
+      <w:lvlText w:val="%1.%2.%3."/>
+      <w:lvlJc w:val="left"/>
+      <w:pPr>
+        <w:ind w:left="1224" w:hanging="504"/>
+      </w:pPr>
+      <w:rPr>
+        <w:rFonts w:hint="default"/>
+      </w:rPr>
+    </w:lvl>
+    <w:lvl w:ilvl="3">
+      <w:start w:val="1"/>
+      <w:numFmt w:val="decimal"/>
+      <w:lvlText w:val="%1.%2.%3.%4."/>
+      <w:lvlJc w:val="left"/>
+      <w:pPr>
+        <w:ind w:left="1728" w:hanging="648"/>
+      </w:pPr>
+      <w:rPr>
+        <w:rFonts w:hint="default"/>
+      </w:rPr>
+    </w:lvl>
+    <w:lvl w:ilvl="4">
+      <w:start w:val="1"/>
+      <w:numFmt w:val="decimal"/>
+      <w:lvlText w:val="%1.%2.%3.%4.%5."/>
+      <w:lvlJc w:val="left"/>
+      <w:pPr>
+        <w:ind w:left="2232" w:hanging="792"/>
+      </w:pPr>
+      <w:rPr>
+        <w:rFonts w:hint="default"/>
+      </w:rPr>
+    </w:lvl>
+    <w:lvl w:ilvl="5">
+      <w:start w:val="1"/>
+      <w:numFmt w:val="decimal"/>
+      <w:lvlText w:val="%1.%2.%3.%4.%5.%6."/>
+      <w:lvlJc w:val="left"/>
+      <w:pPr>
+        <w:ind w:left="2736" w:hanging="936"/>
+      </w:pPr>
+      <w:rPr>
+        <w:rFonts w:hint="default"/>
+      </w:rPr>
+    </w:lvl>
+    <w:lvl w:ilvl="6">
+      <w:start w:val="1"/>
+      <w:numFmt w:val="decimal"/>
+      <w:lvlText w:val="%1.%2.%3.%4.%5.%6.%7."/>
+      <w:lvlJc w:val="left"/>
+      <w:pPr>
+        <w:ind w:left="3240" w:hanging="1080"/>
+      </w:pPr>
+      <w:rPr>
+        <w:rFonts w:hint="default"/>
+      </w:rPr>
+    </w:lvl>
+    <w:lvl w:ilvl="7">
+      <w:start w:val="1"/>
+      <w:numFmt w:val="decimal"/>
+      <w:lvlText w:val="%1.%2.%3.%4.%5.%6.%7.%8."/>
+      <w:lvlJc w:val="left"/>
+      <w:pPr>
+        <w:ind w:left="3744" w:hanging="1224"/>
+      </w:pPr>
+      <w:rPr>
+        <w:rFonts w:hint="default"/>
+      </w:rPr>
+    </w:lvl>
+    <w:lvl w:ilvl="8">
+      <w:start w:val="1"/>
+      <w:numFmt w:val="decimal"/>
+      <w:lvlText w:val="%1.%2.%3.%4.%5.%6.%7.%8.%9."/>
+      <w:lvlJc w:val="left"/>
+      <w:pPr>
+        <w:ind w:left="4320" w:hanging="1440"/>
+      </w:pPr>
+      <w:rPr>
+        <w:rFonts w:hint="default"/>
+      </w:rPr>
+    </w:lvl>
+  </w:abstractNum>
+  <w:abstractNum w:abstractNumId="2" w15:restartNumberingAfterBreak="0">
+    <w:nsid w:val="24EA6432"/>
+    <w:multiLevelType w:val="multilevel"/>
+    <w:tmpl w:val="B3A07D78"/>
+    <w:lvl w:ilvl="0">
+      <w:start w:val="1"/>
+      <w:numFmt w:val="decimal"/>
+      <w:lvlText w:val="%1."/>
+      <w:lvlJc w:val="left"/>
+      <w:pPr>
+        <w:ind w:left="360" w:hanging="360"/>
+      </w:pPr>
+      <w:rPr>
+        <w:rFonts w:hint="default"/>
+      </w:rPr>
+    </w:lvl>
+    <w:lvl w:ilvl="1">
+      <w:start w:val="1"/>
+      <w:numFmt w:val="decimal"/>
+      <w:lvlText w:val="%1.%2."/>
+      <w:lvlJc w:val="left"/>
+      <w:pPr>
+        <w:ind w:left="574" w:hanging="432"/>
+      </w:pPr>
+      <w:rPr>
+        <w:rFonts w:hint="default"/>
+      </w:rPr>
+    </w:lvl>
+    <w:lvl w:ilvl="2">
+      <w:start w:val="1"/>
+      <w:numFmt w:val="decimal"/>
+      <w:lvlText w:val="%1.%2.%3."/>
+      <w:lvlJc w:val="left"/>
+      <w:pPr>
+        <w:ind w:left="1224" w:hanging="504"/>
+      </w:pPr>
+      <w:rPr>
+        <w:rFonts w:hint="default"/>
+      </w:rPr>
+    </w:lvl>
+    <w:lvl w:ilvl="3">
+      <w:start w:val="1"/>
+      <w:numFmt w:val="decimal"/>
+      <w:lvlText w:val="%1.%2.%3.%4."/>
+      <w:lvlJc w:val="left"/>
+      <w:pPr>
+        <w:ind w:left="1728" w:hanging="648"/>
+      </w:pPr>
+      <w:rPr>
+        <w:rFonts w:hint="default"/>
+      </w:rPr>
+    </w:lvl>
+    <w:lvl w:ilvl="4">
+      <w:start w:val="1"/>
+      <w:numFmt w:val="decimal"/>
+      <w:lvlText w:val="%1.%2.%3.%4.%5."/>
+      <w:lvlJc w:val="left"/>
+      <w:pPr>
+        <w:ind w:left="2232" w:hanging="792"/>
+      </w:pPr>
+      <w:rPr>
+        <w:rFonts w:hint="default"/>
+      </w:rPr>
+    </w:lvl>
+    <w:lvl w:ilvl="5">
+      <w:start w:val="1"/>
+      <w:numFmt w:val="decimal"/>
+      <w:lvlText w:val="%1.%2.%3.%4.%5.%6."/>
+      <w:lvlJc w:val="left"/>
+      <w:pPr>
+        <w:ind w:left="2736" w:hanging="936"/>
+      </w:pPr>
+      <w:rPr>
+        <w:rFonts w:hint="default"/>
+      </w:rPr>
+    </w:lvl>
+    <w:lvl w:ilvl="6">
+      <w:start w:val="1"/>
+      <w:numFmt w:val="decimal"/>
+      <w:lvlText w:val="%1.%2.%3.%4.%5.%6.%7."/>
+      <w:lvlJc w:val="left"/>
+      <w:pPr>
+        <w:ind w:left="3240" w:hanging="1080"/>
+      </w:pPr>
+      <w:rPr>
+        <w:rFonts w:hint="default"/>
+      </w:rPr>
+    </w:lvl>
+    <w:lvl w:ilvl="7">
+      <w:start w:val="1"/>
+      <w:numFmt w:val="decimal"/>
+      <w:lvlText w:val="%1.%2.%3.%4.%5.%6.%7.%8."/>
+      <w:lvlJc w:val="left"/>
+      <w:pPr>
+        <w:ind w:left="3744" w:hanging="1224"/>
+      </w:pPr>
+      <w:rPr>
+        <w:rFonts w:hint="default"/>
+      </w:rPr>
+    </w:lvl>
+    <w:lvl w:ilvl="8">
+      <w:start w:val="1"/>
+      <w:numFmt w:val="decimal"/>
+      <w:lvlText w:val="%1.%2.%3.%4.%5.%6.%7.%8.%9."/>
+      <w:lvlJc w:val="left"/>
+      <w:pPr>
+        <w:ind w:left="4320" w:hanging="1440"/>
+      </w:pPr>
+      <w:rPr>
+        <w:rFonts w:hint="default"/>
+      </w:rPr>
+    </w:lvl>
+  </w:abstractNum>
+  <w:abstractNum w:abstractNumId="3" w15:restartNumberingAfterBreak="0">
+    <w:nsid w:val="295A1AA8"/>
+    <w:multiLevelType w:val="multilevel"/>
+    <w:tmpl w:val="040C001F"/>
+    <w:lvl w:ilvl="0">
+      <w:start w:val="1"/>
+      <w:numFmt w:val="decimal"/>
+      <w:lvlText w:val="%1."/>
+      <w:lvlJc w:val="left"/>
+      <w:pPr>
+        <w:ind w:left="360" w:hanging="360"/>
+      </w:pPr>
+    </w:lvl>
+    <w:lvl w:ilvl="1">
+      <w:start w:val="1"/>
+      <w:numFmt w:val="decimal"/>
+      <w:lvlText w:val="%1.%2."/>
+      <w:lvlJc w:val="left"/>
+      <w:pPr>
+        <w:ind w:left="716" w:hanging="432"/>
+      </w:pPr>
+    </w:lvl>
+    <w:lvl w:ilvl="2">
+      <w:start w:val="1"/>
+      <w:numFmt w:val="decimal"/>
+      <w:lvlText w:val="%1.%2.%3."/>
+      <w:lvlJc w:val="left"/>
+      <w:pPr>
+        <w:ind w:left="1366" w:hanging="504"/>
+      </w:pPr>
+    </w:lvl>
+    <w:lvl w:ilvl="3">
+      <w:start w:val="1"/>
+      <w:numFmt w:val="decimal"/>
+      <w:lvlText w:val="%1.%2.%3.%4."/>
+      <w:lvlJc w:val="left"/>
+      <w:pPr>
+        <w:ind w:left="1870" w:hanging="648"/>
+      </w:pPr>
+    </w:lvl>
+    <w:lvl w:ilvl="4">
+      <w:start w:val="1"/>
+      <w:numFmt w:val="decimal"/>
+      <w:lvlText w:val="%1.%2.%3.%4.%5."/>
+      <w:lvlJc w:val="left"/>
+      <w:pPr>
+        <w:ind w:left="2374" w:hanging="792"/>
+      </w:pPr>
+    </w:lvl>
+    <w:lvl w:ilvl="5">
+      <w:start w:val="1"/>
+      <w:numFmt w:val="decimal"/>
+      <w:lvlText w:val="%1.%2.%3.%4.%5.%6."/>
+      <w:lvlJc w:val="left"/>
+      <w:pPr>
+        <w:ind w:left="2878" w:hanging="936"/>
+      </w:pPr>
+    </w:lvl>
+    <w:lvl w:ilvl="6">
+      <w:start w:val="1"/>
+      <w:numFmt w:val="decimal"/>
+      <w:lvlText w:val="%1.%2.%3.%4.%5.%6.%7."/>
+      <w:lvlJc w:val="left"/>
+      <w:pPr>
+        <w:ind w:left="3382" w:hanging="1080"/>
+      </w:pPr>
+    </w:lvl>
+    <w:lvl w:ilvl="7">
+      <w:start w:val="1"/>
+      <w:numFmt w:val="decimal"/>
+      <w:lvlText w:val="%1.%2.%3.%4.%5.%6.%7.%8."/>
+      <w:lvlJc w:val="left"/>
+      <w:pPr>
+        <w:ind w:left="3886" w:hanging="1224"/>
+      </w:pPr>
+    </w:lvl>
+    <w:lvl w:ilvl="8">
+      <w:start w:val="1"/>
+      <w:numFmt w:val="decimal"/>
+      <w:lvlText w:val="%1.%2.%3.%4.%5.%6.%7.%8.%9."/>
+      <w:lvlJc w:val="left"/>
+      <w:pPr>
+        <w:ind w:left="4462" w:hanging="1440"/>
+      </w:pPr>
+    </w:lvl>
+  </w:abstractNum>
+  <w:abstractNum w:abstractNumId="4" w15:restartNumberingAfterBreak="0">
+    <w:nsid w:val="3408570F"/>
+    <w:multiLevelType w:val="multilevel"/>
+    <w:tmpl w:val="63B806FA"/>
+    <w:lvl w:ilvl="0">
+      <w:start w:val="2"/>
+      <w:numFmt w:val="decimal"/>
+      <w:lvlText w:val="%1."/>
+      <w:lvlJc w:val="left"/>
+      <w:pPr>
+        <w:ind w:left="360" w:hanging="360"/>
+      </w:pPr>
+      <w:rPr>
+        <w:rFonts w:hint="default"/>
+      </w:rPr>
+    </w:lvl>
+    <w:lvl w:ilvl="1">
+      <w:start w:val="1"/>
+      <w:numFmt w:val="decimal"/>
+      <w:lvlText w:val="%1.%2."/>
+      <w:lvlJc w:val="left"/>
+      <w:pPr>
+        <w:ind w:left="574" w:hanging="432"/>
+      </w:pPr>
+      <w:rPr>
+        <w:rFonts w:hint="default"/>
+      </w:rPr>
+    </w:lvl>
+    <w:lvl w:ilvl="2">
+      <w:start w:val="1"/>
+      <w:numFmt w:val="decimal"/>
+      <w:lvlText w:val="%1.%2.%3."/>
+      <w:lvlJc w:val="left"/>
+      <w:pPr>
+        <w:ind w:left="1224" w:hanging="504"/>
+      </w:pPr>
+      <w:rPr>
+        <w:rFonts w:hint="default"/>
+      </w:rPr>
+    </w:lvl>
+    <w:lvl w:ilvl="3">
+      <w:start w:val="1"/>
+      <w:numFmt w:val="decimal"/>
+      <w:lvlText w:val="%1.%2.%3.%4."/>
+      <w:lvlJc w:val="left"/>
+      <w:pPr>
+        <w:ind w:left="1728" w:hanging="648"/>
+      </w:pPr>
+      <w:rPr>
+        <w:rFonts w:hint="default"/>
+      </w:rPr>
+    </w:lvl>
+    <w:lvl w:ilvl="4">
+      <w:start w:val="1"/>
+      <w:numFmt w:val="decimal"/>
+      <w:lvlText w:val="%1.%2.%3.%4.%5."/>
+      <w:lvlJc w:val="left"/>
+      <w:pPr>
+        <w:ind w:left="2232" w:hanging="792"/>
+      </w:pPr>
+      <w:rPr>
+        <w:rFonts w:hint="default"/>
+      </w:rPr>
+    </w:lvl>
+    <w:lvl w:ilvl="5">
+      <w:start w:val="1"/>
+      <w:numFmt w:val="decimal"/>
+      <w:lvlText w:val="%1.%2.%3.%4.%5.%6."/>
+      <w:lvlJc w:val="left"/>
+      <w:pPr>
+        <w:ind w:left="2736" w:hanging="936"/>
+      </w:pPr>
+      <w:rPr>
+        <w:rFonts w:hint="default"/>
+      </w:rPr>
+    </w:lvl>
+    <w:lvl w:ilvl="6">
+      <w:start w:val="1"/>
+      <w:numFmt w:val="decimal"/>
+      <w:lvlText w:val="%1.%2.%3.%4.%5.%6.%7."/>
+      <w:lvlJc w:val="left"/>
+      <w:pPr>
+        <w:ind w:left="3240" w:hanging="1080"/>
+      </w:pPr>
+      <w:rPr>
+        <w:rFonts w:hint="default"/>
+      </w:rPr>
+    </w:lvl>
+    <w:lvl w:ilvl="7">
+      <w:start w:val="1"/>
+      <w:numFmt w:val="decimal"/>
+      <w:lvlText w:val="%1.%2.%3.%4.%5.%6.%7.%8."/>
+      <w:lvlJc w:val="left"/>
+      <w:pPr>
+        <w:ind w:left="3744" w:hanging="1224"/>
+      </w:pPr>
+      <w:rPr>
+        <w:rFonts w:hint="default"/>
+      </w:rPr>
+    </w:lvl>
+    <w:lvl w:ilvl="8">
+      <w:start w:val="1"/>
+      <w:numFmt w:val="decimal"/>
+      <w:lvlText w:val="%1.%2.%3.%4.%5.%6.%7.%8.%9."/>
+      <w:lvlJc w:val="left"/>
+      <w:pPr>
+        <w:ind w:left="4320" w:hanging="1440"/>
+      </w:pPr>
+      <w:rPr>
+        <w:rFonts w:hint="default"/>
+      </w:rPr>
+    </w:lvl>
+  </w:abstractNum>
+  <w:abstractNum w:abstractNumId="5" w15:restartNumberingAfterBreak="0">
+    <w:nsid w:val="36AC2301"/>
+    <w:multiLevelType w:val="multilevel"/>
+    <w:tmpl w:val="3976BA86"/>
+    <w:numStyleLink w:val="Style1"/>
+  </w:abstractNum>
+  <w:abstractNum w:abstractNumId="6" w15:restartNumberingAfterBreak="0">
+    <w:nsid w:val="376E283D"/>
+    <w:multiLevelType w:val="multilevel"/>
+    <w:tmpl w:val="4D147F1E"/>
+    <w:lvl w:ilvl="0">
+      <w:start w:val="2"/>
+      <w:numFmt w:val="decimal"/>
+      <w:lvlText w:val="%1."/>
+      <w:lvlJc w:val="left"/>
+      <w:pPr>
+        <w:ind w:left="360" w:hanging="360"/>
+      </w:pPr>
+      <w:rPr>
+        <w:rFonts w:hint="default"/>
+      </w:rPr>
+    </w:lvl>
+    <w:lvl w:ilvl="1">
+      <w:start w:val="3"/>
+      <w:numFmt w:val="decimal"/>
+      <w:lvlText w:val="%1.%2."/>
+      <w:lvlJc w:val="left"/>
+      <w:pPr>
+        <w:ind w:left="574" w:hanging="432"/>
+      </w:pPr>
+      <w:rPr>
+        <w:rFonts w:hint="default"/>
+      </w:rPr>
+    </w:lvl>
+    <w:lvl w:ilvl="2">
+      <w:start w:val="1"/>
+      <w:numFmt w:val="decimal"/>
+      <w:lvlText w:val="%1.%2.%3."/>
+      <w:lvlJc w:val="left"/>
+      <w:pPr>
+        <w:ind w:left="1224" w:hanging="504"/>
+      </w:pPr>
+      <w:rPr>
+        <w:rFonts w:hint="default"/>
+      </w:rPr>
+    </w:lvl>
+    <w:lvl w:ilvl="3">
+      <w:start w:val="1"/>
+      <w:numFmt w:val="decimal"/>
+      <w:lvlText w:val="%1.%2.%3.%4."/>
+      <w:lvlJc w:val="left"/>
+      <w:pPr>
+        <w:ind w:left="1728" w:hanging="648"/>
+      </w:pPr>
+      <w:rPr>
+        <w:rFonts w:hint="default"/>
+      </w:rPr>
+    </w:lvl>
+    <w:lvl w:ilvl="4">
+      <w:start w:val="1"/>
+      <w:numFmt w:val="decimal"/>
+      <w:lvlText w:val="%1.%2.%3.%4.%5."/>
+      <w:lvlJc w:val="left"/>
+      <w:pPr>
+        <w:ind w:left="2232" w:hanging="792"/>
+      </w:pPr>
+      <w:rPr>
+        <w:rFonts w:hint="default"/>
+      </w:rPr>
+    </w:lvl>
+    <w:lvl w:ilvl="5">
+      <w:start w:val="1"/>
+      <w:numFmt w:val="decimal"/>
+      <w:lvlText w:val="%1.%2.%3.%4.%5.%6."/>
+      <w:lvlJc w:val="left"/>
+      <w:pPr>
+        <w:ind w:left="2736" w:hanging="936"/>
+      </w:pPr>
+      <w:rPr>
+        <w:rFonts w:hint="default"/>
+      </w:rPr>
+    </w:lvl>
+    <w:lvl w:ilvl="6">
+      <w:start w:val="1"/>
+      <w:numFmt w:val="decimal"/>
+      <w:lvlText w:val="%1.%2.%3.%4.%5.%6.%7."/>
+      <w:lvlJc w:val="left"/>
+      <w:pPr>
+        <w:ind w:left="3240" w:hanging="1080"/>
+      </w:pPr>
+      <w:rPr>
+        <w:rFonts w:hint="default"/>
+      </w:rPr>
+    </w:lvl>
+    <w:lvl w:ilvl="7">
+      <w:start w:val="1"/>
+      <w:numFmt w:val="decimal"/>
+      <w:lvlText w:val="%1.%2.%3.%4.%5.%6.%7.%8."/>
+      <w:lvlJc w:val="left"/>
+      <w:pPr>
+        <w:ind w:left="3744" w:hanging="1224"/>
+      </w:pPr>
+      <w:rPr>
+        <w:rFonts w:hint="default"/>
+      </w:rPr>
+    </w:lvl>
+    <w:lvl w:ilvl="8">
+      <w:start w:val="1"/>
+      <w:numFmt w:val="decimal"/>
+      <w:lvlText w:val="%1.%2.%3.%4.%5.%6.%7.%8.%9."/>
+      <w:lvlJc w:val="left"/>
+      <w:pPr>
+        <w:ind w:left="4320" w:hanging="1440"/>
+      </w:pPr>
+      <w:rPr>
+        <w:rFonts w:hint="default"/>
+      </w:rPr>
+    </w:lvl>
+  </w:abstractNum>
+  <w:abstractNum w:abstractNumId="7" w15:restartNumberingAfterBreak="0">
+    <w:nsid w:val="3CEB56A1"/>
+    <w:multiLevelType w:val="multilevel"/>
+    <w:tmpl w:val="F4F27C20"/>
+    <w:styleLink w:val="Style2"/>
+    <w:lvl w:ilvl="0">
+      <w:start w:val="3"/>
+      <w:numFmt w:val="decimal"/>
+      <w:lvlText w:val="%1."/>
+      <w:lvlJc w:val="left"/>
+      <w:pPr>
+        <w:ind w:left="360" w:hanging="360"/>
+      </w:pPr>
+      <w:rPr>
+        <w:rFonts w:hint="default"/>
+      </w:rPr>
+    </w:lvl>
+    <w:lvl w:ilvl="1">
+      <w:start w:val="1"/>
+      <w:numFmt w:val="decimal"/>
+      <w:lvlText w:val="%1.%2."/>
+      <w:lvlJc w:val="left"/>
+      <w:pPr>
+        <w:ind w:left="574" w:hanging="432"/>
+      </w:pPr>
+      <w:rPr>
+        <w:rFonts w:hint="default"/>
+      </w:rPr>
+    </w:lvl>
+    <w:lvl w:ilvl="2">
+      <w:start w:val="1"/>
+      <w:numFmt w:val="decimal"/>
+      <w:lvlText w:val="%1.%2.%3."/>
+      <w:lvlJc w:val="left"/>
+      <w:pPr>
+        <w:ind w:left="1224" w:hanging="504"/>
+      </w:pPr>
+      <w:rPr>
+        <w:rFonts w:hint="default"/>
+      </w:rPr>
+    </w:lvl>
+    <w:lvl w:ilvl="3">
+      <w:start w:val="1"/>
+      <w:numFmt w:val="decimal"/>
+      <w:lvlText w:val="%1.%2.%3.%4."/>
+      <w:lvlJc w:val="left"/>
+      <w:pPr>
+        <w:ind w:left="1728" w:hanging="648"/>
+      </w:pPr>
+      <w:rPr>
+        <w:rFonts w:hint="default"/>
+      </w:rPr>
+    </w:lvl>
+    <w:lvl w:ilvl="4">
+      <w:start w:val="1"/>
+      <w:numFmt w:val="decimal"/>
+      <w:lvlText w:val="%1.%2.%3.%4.%5."/>
+      <w:lvlJc w:val="left"/>
+      <w:pPr>
+        <w:ind w:left="2232" w:hanging="792"/>
+      </w:pPr>
+      <w:rPr>
+        <w:rFonts w:hint="default"/>
+      </w:rPr>
+    </w:lvl>
+    <w:lvl w:ilvl="5">
+      <w:start w:val="1"/>
+      <w:numFmt w:val="decimal"/>
+      <w:lvlText w:val="%1.%2.%3.%4.%5.%6."/>
+      <w:lvlJc w:val="left"/>
+      <w:pPr>
+        <w:ind w:left="2736" w:hanging="936"/>
+      </w:pPr>
+      <w:rPr>
+        <w:rFonts w:hint="default"/>
+      </w:rPr>
+    </w:lvl>
+    <w:lvl w:ilvl="6">
+      <w:start w:val="1"/>
+      <w:numFmt w:val="decimal"/>
+      <w:lvlText w:val="%1.%2.%3.%4.%5.%6.%7."/>
+      <w:lvlJc w:val="left"/>
+      <w:pPr>
+        <w:ind w:left="3240" w:hanging="1080"/>
+      </w:pPr>
+      <w:rPr>
+        <w:rFonts w:hint="default"/>
+      </w:rPr>
+    </w:lvl>
+    <w:lvl w:ilvl="7">
+      <w:start w:val="1"/>
+      <w:numFmt w:val="decimal"/>
+      <w:lvlText w:val="%1.%2.%3.%4.%5.%6.%7.%8."/>
+      <w:lvlJc w:val="left"/>
+      <w:pPr>
+        <w:ind w:left="3744" w:hanging="1224"/>
+      </w:pPr>
+      <w:rPr>
+        <w:rFonts w:hint="default"/>
+      </w:rPr>
+    </w:lvl>
+    <w:lvl w:ilvl="8">
+      <w:start w:val="1"/>
+      <w:numFmt w:val="decimal"/>
+      <w:lvlText w:val="%1.%2.%3.%4.%5.%6.%7.%8.%9."/>
+      <w:lvlJc w:val="left"/>
+      <w:pPr>
+        <w:ind w:left="4320" w:hanging="1440"/>
+      </w:pPr>
+      <w:rPr>
+        <w:rFonts w:hint="default"/>
+      </w:rPr>
+    </w:lvl>
+  </w:abstractNum>
+  <w:abstractNum w:abstractNumId="8" w15:restartNumberingAfterBreak="0">
+    <w:nsid w:val="457D0A69"/>
+    <w:multiLevelType w:val="multilevel"/>
+    <w:tmpl w:val="BB0AF6C4"/>
+    <w:lvl w:ilvl="0">
+      <w:start w:val="2"/>
+      <w:numFmt w:val="decimal"/>
+      <w:lvlText w:val="%1."/>
+      <w:lvlJc w:val="left"/>
+      <w:pPr>
+        <w:ind w:left="360" w:hanging="360"/>
+      </w:pPr>
+      <w:rPr>
+        <w:rFonts w:hint="default"/>
+      </w:rPr>
+    </w:lvl>
+    <w:lvl w:ilvl="1">
+      <w:start w:val="2"/>
+      <w:numFmt w:val="decimal"/>
+      <w:lvlText w:val="3%2."/>
+      <w:lvlJc w:val="left"/>
+      <w:pPr>
+        <w:ind w:left="502" w:hanging="360"/>
+      </w:pPr>
+      <w:rPr>
+        <w:rFonts w:hint="default"/>
+      </w:rPr>
+    </w:lvl>
+    <w:lvl w:ilvl="2">
+      <w:start w:val="1"/>
+      <w:numFmt w:val="decimal"/>
+      <w:lvlText w:val="%1.%2.%3."/>
+      <w:lvlJc w:val="left"/>
+      <w:pPr>
+        <w:ind w:left="1224" w:hanging="504"/>
+      </w:pPr>
+      <w:rPr>
+        <w:rFonts w:hint="default"/>
+      </w:rPr>
+    </w:lvl>
+    <w:lvl w:ilvl="3">
+      <w:start w:val="1"/>
+      <w:numFmt w:val="decimal"/>
+      <w:lvlText w:val="%1.%2.%3.%4."/>
+      <w:lvlJc w:val="left"/>
+      <w:pPr>
+        <w:ind w:left="1728" w:hanging="648"/>
+      </w:pPr>
+      <w:rPr>
+        <w:rFonts w:hint="default"/>
+      </w:rPr>
+    </w:lvl>
+    <w:lvl w:ilvl="4">
+      <w:start w:val="1"/>
+      <w:numFmt w:val="decimal"/>
+      <w:lvlText w:val="%1.%2.%3.%4.%5."/>
+      <w:lvlJc w:val="left"/>
+      <w:pPr>
+        <w:ind w:left="2232" w:hanging="792"/>
+      </w:pPr>
+      <w:rPr>
+        <w:rFonts w:hint="default"/>
+      </w:rPr>
+    </w:lvl>
+    <w:lvl w:ilvl="5">
+      <w:start w:val="1"/>
+      <w:numFmt w:val="decimal"/>
+      <w:lvlText w:val="%1.%2.%3.%4.%5.%6."/>
+      <w:lvlJc w:val="left"/>
+      <w:pPr>
+        <w:ind w:left="2736" w:hanging="936"/>
+      </w:pPr>
+      <w:rPr>
+        <w:rFonts w:hint="default"/>
+      </w:rPr>
+    </w:lvl>
+    <w:lvl w:ilvl="6">
+      <w:start w:val="1"/>
+      <w:numFmt w:val="decimal"/>
+      <w:lvlText w:val="%1.%2.%3.%4.%5.%6.%7."/>
+      <w:lvlJc w:val="left"/>
+      <w:pPr>
+        <w:ind w:left="3240" w:hanging="1080"/>
+      </w:pPr>
+      <w:rPr>
+        <w:rFonts w:hint="default"/>
+      </w:rPr>
+    </w:lvl>
+    <w:lvl w:ilvl="7">
+      <w:start w:val="1"/>
+      <w:numFmt w:val="decimal"/>
+      <w:lvlText w:val="%1.%2.%3.%4.%5.%6.%7.%8."/>
+      <w:lvlJc w:val="left"/>
+      <w:pPr>
+        <w:ind w:left="3744" w:hanging="1224"/>
+      </w:pPr>
+      <w:rPr>
+        <w:rFonts w:hint="default"/>
+      </w:rPr>
+    </w:lvl>
+    <w:lvl w:ilvl="8">
+      <w:start w:val="1"/>
+      <w:numFmt w:val="decimal"/>
+      <w:lvlText w:val="%1.%2.%3.%4.%5.%6.%7.%8.%9."/>
+      <w:lvlJc w:val="left"/>
+      <w:pPr>
+        <w:ind w:left="4320" w:hanging="1440"/>
+      </w:pPr>
+      <w:rPr>
+        <w:rFonts w:hint="default"/>
+      </w:rPr>
+    </w:lvl>
+  </w:abstractNum>
+  <w:abstractNum w:abstractNumId="9" w15:restartNumberingAfterBreak="0">
+    <w:nsid w:val="63E47731"/>
+    <w:multiLevelType w:val="multilevel"/>
+    <w:tmpl w:val="F4F27C20"/>
+    <w:numStyleLink w:val="Style2"/>
+  </w:abstractNum>
+  <w:abstractNum w:abstractNumId="10" w15:restartNumberingAfterBreak="0">
+    <w:nsid w:val="6A93672A"/>
+    <w:multiLevelType w:val="hybridMultilevel"/>
+    <w:tmpl w:val="1E5AAE60"/>
+    <w:lvl w:ilvl="0" w:tplc="040C0011">
+      <w:start w:val="1"/>
+      <w:numFmt w:val="decimal"/>
+      <w:lvlText w:val="%1)"/>
+      <w:lvlJc w:val="left"/>
+      <w:pPr>
+        <w:ind w:left="720" w:hanging="360"/>
+      </w:pPr>
+    </w:lvl>
+    <w:lvl w:ilvl="1" w:tplc="040C0019" w:tentative="1">
+      <w:start w:val="1"/>
+      <w:numFmt w:val="lowerLetter"/>
+      <w:lvlText w:val="%2."/>
+      <w:lvlJc w:val="left"/>
+      <w:pPr>
+        <w:ind w:left="1440" w:hanging="360"/>
+      </w:pPr>
+    </w:lvl>
+    <w:lvl w:ilvl="2" w:tplc="040C001B" w:tentative="1">
+      <w:start w:val="1"/>
+      <w:numFmt w:val="lowerRoman"/>
+      <w:lvlText w:val="%3."/>
+      <w:lvlJc w:val="right"/>
+      <w:pPr>
+        <w:ind w:left="2160" w:hanging="180"/>
+      </w:pPr>
+    </w:lvl>
+    <w:lvl w:ilvl="3" w:tplc="040C000F" w:tentative="1">
+      <w:start w:val="1"/>
+      <w:numFmt w:val="decimal"/>
+      <w:lvlText w:val="%4."/>
+      <w:lvlJc w:val="left"/>
+      <w:pPr>
+        <w:ind w:left="2880" w:hanging="360"/>
+      </w:pPr>
+    </w:lvl>
+    <w:lvl w:ilvl="4" w:tplc="040C0019" w:tentative="1">
+      <w:start w:val="1"/>
+      <w:numFmt w:val="lowerLetter"/>
+      <w:lvlText w:val="%5."/>
+      <w:lvlJc w:val="left"/>
+      <w:pPr>
+        <w:ind w:left="3600" w:hanging="360"/>
+      </w:pPr>
+    </w:lvl>
+    <w:lvl w:ilvl="5" w:tplc="040C001B" w:tentative="1">
+      <w:start w:val="1"/>
+      <w:numFmt w:val="lowerRoman"/>
+      <w:lvlText w:val="%6."/>
+      <w:lvlJc w:val="right"/>
+      <w:pPr>
+        <w:ind w:left="4320" w:hanging="180"/>
+      </w:pPr>
+    </w:lvl>
+    <w:lvl w:ilvl="6" w:tplc="040C000F" w:tentative="1">
+      <w:start w:val="1"/>
+      <w:numFmt w:val="decimal"/>
+      <w:lvlText w:val="%7."/>
+      <w:lvlJc w:val="left"/>
+      <w:pPr>
+        <w:ind w:left="5040" w:hanging="360"/>
+      </w:pPr>
+    </w:lvl>
+    <w:lvl w:ilvl="7" w:tplc="040C0019" w:tentative="1">
+      <w:start w:val="1"/>
+      <w:numFmt w:val="lowerLetter"/>
+      <w:lvlText w:val="%8."/>
+      <w:lvlJc w:val="left"/>
+      <w:pPr>
+        <w:ind w:left="5760" w:hanging="360"/>
+      </w:pPr>
+    </w:lvl>
+    <w:lvl w:ilvl="8" w:tplc="040C001B" w:tentative="1">
+      <w:start w:val="1"/>
+      <w:numFmt w:val="lowerRoman"/>
+      <w:lvlText w:val="%9."/>
+      <w:lvlJc w:val="right"/>
+      <w:pPr>
+        <w:ind w:left="6480" w:hanging="180"/>
+      </w:pPr>
+    </w:lvl>
+  </w:abstractNum>
+  <w:num w:numId="1" w16cid:durableId="568879482">
+    <w:abstractNumId w:val="3"/>
+  </w:num>
+  <w:num w:numId="2" w16cid:durableId="249196013">
+    <w:abstractNumId w:val="10"/>
+  </w:num>
+  <w:num w:numId="3" w16cid:durableId="1899976712">
+    <w:abstractNumId w:val="3"/>
+    <w:lvlOverride w:ilvl="0">
+      <w:lvl w:ilvl="0">
+        <w:start w:val="1"/>
+        <w:numFmt w:val="decimal"/>
+        <w:lvlText w:val="%1."/>
+        <w:lvlJc w:val="left"/>
+        <w:pPr>
+          <w:ind w:left="502" w:hanging="360"/>
+        </w:pPr>
+        <w:rPr>
+          <w:rFonts w:hint="default"/>
+        </w:rPr>
+      </w:lvl>
+    </w:lvlOverride>
+    <w:lvlOverride w:ilvl="1">
+      <w:lvl w:ilvl="1">
+        <w:start w:val="1"/>
+        <w:numFmt w:val="decimal"/>
+        <w:lvlText w:val="%1.%2."/>
+        <w:lvlJc w:val="left"/>
+        <w:pPr>
+          <w:ind w:left="716" w:hanging="432"/>
+        </w:pPr>
+        <w:rPr>
+          <w:rFonts w:hint="default"/>
+        </w:rPr>
+      </w:lvl>
+    </w:lvlOverride>
+    <w:lvlOverride w:ilvl="2">
+      <w:lvl w:ilvl="2">
+        <w:start w:val="1"/>
+        <w:numFmt w:val="decimal"/>
+        <w:lvlText w:val="%1.%2.%3."/>
+        <w:lvlJc w:val="left"/>
+        <w:pPr>
+          <w:ind w:left="1366" w:hanging="504"/>
+        </w:pPr>
+        <w:rPr>
+          <w:rFonts w:hint="default"/>
+        </w:rPr>
+      </w:lvl>
+    </w:lvlOverride>
+    <w:lvlOverride w:ilvl="3">
+      <w:lvl w:ilvl="3">
+        <w:start w:val="1"/>
+        <w:numFmt w:val="decimal"/>
+        <w:lvlText w:val="%1.%2.%3.%4."/>
+        <w:lvlJc w:val="left"/>
+        <w:pPr>
+          <w:ind w:left="1870" w:hanging="648"/>
+        </w:pPr>
+        <w:rPr>
+          <w:rFonts w:hint="default"/>
+        </w:rPr>
+      </w:lvl>
+    </w:lvlOverride>
+    <w:lvlOverride w:ilvl="4">
+      <w:lvl w:ilvl="4">
+        <w:start w:val="1"/>
+        <w:numFmt w:val="decimal"/>
+        <w:lvlText w:val="%1.%2.%3.%4.%5."/>
+        <w:lvlJc w:val="left"/>
+        <w:pPr>
+          <w:ind w:left="2374" w:hanging="792"/>
+        </w:pPr>
+        <w:rPr>
+          <w:rFonts w:hint="default"/>
+        </w:rPr>
+      </w:lvl>
+    </w:lvlOverride>
+    <w:lvlOverride w:ilvl="5">
+      <w:lvl w:ilvl="5">
+        <w:start w:val="1"/>
+        <w:numFmt w:val="decimal"/>
+        <w:lvlText w:val="%1.%2.%3.%4.%5.%6."/>
+        <w:lvlJc w:val="left"/>
+        <w:pPr>
+          <w:ind w:left="2878" w:hanging="936"/>
+        </w:pPr>
+        <w:rPr>
+          <w:rFonts w:hint="default"/>
+        </w:rPr>
+      </w:lvl>
+    </w:lvlOverride>
+    <w:lvlOverride w:ilvl="6">
+      <w:lvl w:ilvl="6">
+        <w:start w:val="1"/>
+        <w:numFmt w:val="decimal"/>
+        <w:lvlText w:val="%1.%2.%3.%4.%5.%6.%7."/>
+        <w:lvlJc w:val="left"/>
+        <w:pPr>
+          <w:ind w:left="3382" w:hanging="1080"/>
+        </w:pPr>
+        <w:rPr>
+          <w:rFonts w:hint="default"/>
+        </w:rPr>
+      </w:lvl>
+    </w:lvlOverride>
+    <w:lvlOverride w:ilvl="7">
+      <w:lvl w:ilvl="7">
+        <w:start w:val="1"/>
+        <w:numFmt w:val="decimal"/>
+        <w:lvlText w:val="%1.%2.%3.%4.%5.%6.%7.%8."/>
+        <w:lvlJc w:val="left"/>
+        <w:pPr>
+          <w:ind w:left="3886" w:hanging="1224"/>
+        </w:pPr>
+        <w:rPr>
+          <w:rFonts w:hint="default"/>
+        </w:rPr>
+      </w:lvl>
+    </w:lvlOverride>
+    <w:lvlOverride w:ilvl="8">
+      <w:lvl w:ilvl="8">
+        <w:start w:val="1"/>
+        <w:numFmt w:val="decimal"/>
+        <w:lvlText w:val="%1.%2.%3.%4.%5.%6.%7.%8.%9."/>
+        <w:lvlJc w:val="left"/>
+        <w:pPr>
+          <w:ind w:left="4462" w:hanging="1440"/>
+        </w:pPr>
+        <w:rPr>
+          <w:rFonts w:hint="default"/>
+        </w:rPr>
+      </w:lvl>
+    </w:lvlOverride>
+  </w:num>
+  <w:num w:numId="4" w16cid:durableId="385884238">
+    <w:abstractNumId w:val="0"/>
+  </w:num>
+  <w:num w:numId="5" w16cid:durableId="867568875">
+    <w:abstractNumId w:val="8"/>
+  </w:num>
+  <w:num w:numId="6" w16cid:durableId="1170174362">
+    <w:abstractNumId w:val="2"/>
+  </w:num>
+  <w:num w:numId="7" w16cid:durableId="251624812">
+    <w:abstractNumId w:val="1"/>
+  </w:num>
+  <w:num w:numId="8" w16cid:durableId="1164707547">
+    <w:abstractNumId w:val="4"/>
+  </w:num>
+  <w:num w:numId="9" w16cid:durableId="60297347">
+    <w:abstractNumId w:val="5"/>
+  </w:num>
+  <w:num w:numId="10" w16cid:durableId="252589640">
+    <w:abstractNumId w:val="6"/>
+  </w:num>
+  <w:num w:numId="11" w16cid:durableId="1023937825">
+    <w:abstractNumId w:val="9"/>
+  </w:num>
+  <w:num w:numId="12" w16cid:durableId="465049814">
+    <w:abstractNumId w:val="7"/>
+  </w:num>
+</w:numbering>
+</file>
+
 <file path=word/styles.xml><?xml version="1.0" encoding="utf-8"?>
-<w:styles xmlns:mc="http://schemas.openxmlformats.org/markup-compatibility/2006" xmlns:r="http://schemas.openxmlformats.org/officeDocument/2006/relationships" xmlns:w="http://schemas.openxmlformats.org/wordprocessingml/2006/main" xmlns:w14="http://schemas.microsoft.com/office/word/2010/wordml" xmlns:w15="http://schemas.microsoft.com/office/word/2012/wordml" xmlns:w16cid="http://schemas.microsoft.com/office/word/2016/wordml/cid" xmlns:w16se="http://schemas.microsoft.com/office/word/2015/wordml/symex" mc:Ignorable="w14 w15 w16se w16cid">
+<w:styles xmlns:mc="http://schemas.openxmlformats.org/markup-compatibility/2006" xmlns:r="http://schemas.openxmlformats.org/officeDocument/2006/relationships" xmlns:w="http://schemas.openxmlformats.org/wordprocessingml/2006/main" xmlns:w14="http://schemas.microsoft.com/office/word/2010/wordml" xmlns:w15="http://schemas.microsoft.com/office/word/2012/wordml" xmlns:w16cex="http://schemas.microsoft.com/office/word/2018/wordml/cex" xmlns:w16cid="http://schemas.microsoft.com/office/word/2016/wordml/cid" xmlns:w16="http://schemas.microsoft.com/office/word/2018/wordml" xmlns:w16du="http://schemas.microsoft.com/office/word/2023/wordml/word16du" xmlns:w16sdtdh="http://schemas.microsoft.com/office/word/2020/wordml/sdtdatahash" xmlns:w16sdtfl="http://schemas.microsoft.com/office/word/2024/wordml/sdtformatlock" xmlns:w16se="http://schemas.microsoft.com/office/word/2015/wordml/symex" mc:Ignorable="w14 w15 w16se w16cid w16 w16cex w16sdtdh w16sdtfl w16du">
   <w:docDefaults>
     <w:rPrDefault>
       <w:rPr>
@@ -2587,7 +4935,7 @@
       </w:pPr>
     </w:pPrDefault>
   </w:docDefaults>
-  <w:latentStyles w:defLockedState="0" w:defUIPriority="99" w:defSemiHidden="0" w:defUnhideWhenUsed="0" w:defQFormat="0" w:count="377">
+  <w:latentStyles w:defLockedState="0" w:defUIPriority="99" w:defSemiHidden="0" w:defUnhideWhenUsed="0" w:defQFormat="0" w:count="376">
     <w:lsdException w:name="Normal" w:uiPriority="0" w:qFormat="1"/>
     <w:lsdException w:name="heading 1" w:uiPriority="9" w:qFormat="1"/>
     <w:lsdException w:name="heading 2" w:semiHidden="1" w:uiPriority="9" w:unhideWhenUsed="1" w:qFormat="1"/>
@@ -2735,8 +5083,11 @@
     <w:lsdException w:name="Table 3D effects 3" w:semiHidden="1" w:unhideWhenUsed="1"/>
     <w:lsdException w:name="Table Contemporary" w:semiHidden="1" w:unhideWhenUsed="1"/>
     <w:lsdException w:name="Table Elegant" w:semiHidden="1" w:unhideWhenUsed="1"/>
+    <w:lsdException w:name="Table Professional" w:semiHidden="1" w:unhideWhenUsed="1"/>
     <w:lsdException w:name="Table Subtle 1" w:semiHidden="1" w:unhideWhenUsed="1"/>
     <w:lsdException w:name="Table Subtle 2" w:semiHidden="1" w:unhideWhenUsed="1"/>
+    <w:lsdException w:name="Table Web 1" w:semiHidden="1" w:unhideWhenUsed="1"/>
+    <w:lsdException w:name="Table Web 2" w:semiHidden="1" w:unhideWhenUsed="1"/>
     <w:lsdException w:name="Table Web 3" w:semiHidden="1" w:unhideWhenUsed="1"/>
     <w:lsdException w:name="Balloon Text" w:semiHidden="1" w:unhideWhenUsed="1"/>
     <w:lsdException w:name="Table Grid" w:uiPriority="39"/>
@@ -2961,7 +5312,6 @@
     <w:lsdException w:name="Hashtag" w:semiHidden="1" w:unhideWhenUsed="1"/>
     <w:lsdException w:name="Unresolved Mention" w:semiHidden="1" w:unhideWhenUsed="1"/>
     <w:lsdException w:name="Smart Link" w:semiHidden="1" w:unhideWhenUsed="1"/>
-    <w:lsdException w:name="Smart Link Error" w:semiHidden="1" w:unhideWhenUsed="1"/>
   </w:latentStyles>
   <w:style w:type="paragraph" w:default="1" w:styleId="Normal">
     <w:name w:val="Normal"/>
@@ -3044,6 +5394,37 @@
       <w:b/>
       <w:bCs/>
     </w:rPr>
+  </w:style>
+  <w:style w:type="paragraph" w:styleId="Paragraphedeliste">
+    <w:name w:val="List Paragraph"/>
+    <w:basedOn w:val="Normal"/>
+    <w:uiPriority w:val="34"/>
+    <w:qFormat/>
+    <w:rsid w:val="001331D9"/>
+    <w:pPr>
+      <w:ind w:left="720"/>
+      <w:contextualSpacing/>
+    </w:pPr>
+  </w:style>
+  <w:style w:type="numbering" w:customStyle="1" w:styleId="Style1">
+    <w:name w:val="Style1"/>
+    <w:uiPriority w:val="99"/>
+    <w:rsid w:val="00F07B99"/>
+    <w:pPr>
+      <w:numPr>
+        <w:numId w:val="7"/>
+      </w:numPr>
+    </w:pPr>
+  </w:style>
+  <w:style w:type="numbering" w:customStyle="1" w:styleId="Style2">
+    <w:name w:val="Style2"/>
+    <w:uiPriority w:val="99"/>
+    <w:rsid w:val="00C14903"/>
+    <w:pPr>
+      <w:numPr>
+        <w:numId w:val="12"/>
+      </w:numPr>
+    </w:pPr>
   </w:style>
 </w:styles>
 </file>

</xml_diff>

<commit_message>
insertion du progress ...
</commit_message>
<xml_diff>
--- a/Projet_TAHIENDRAZA Ravilimita  Zidane/Présentation Word.docx
+++ b/Projet_TAHIENDRAZA Ravilimita  Zidane/Présentation Word.docx
@@ -1747,23 +1747,39 @@
         </w:rPr>
         <w:t xml:space="preserve">État de </w:t>
       </w:r>
+      <w:proofErr w:type="spellStart"/>
       <w:r>
         <w:rPr>
           <w:rFonts w:ascii="Times New Roman" w:eastAsia="Times New Roman" w:hAnsi="Times New Roman" w:cs="Times New Roman"/>
         </w:rPr>
-        <w:t>lard</w:t>
+        <w:t>l</w:t>
       </w:r>
       <w:r>
         <w:rPr>
           <w:rFonts w:ascii="Times New Roman" w:eastAsia="Times New Roman" w:hAnsi="Times New Roman" w:cs="Times New Roman"/>
         </w:rPr>
+        <w:t>’art</w:t>
+      </w:r>
+      <w:proofErr w:type="spellEnd"/>
+      <w:r>
+        <w:rPr>
+          <w:rFonts w:ascii="Times New Roman" w:eastAsia="Times New Roman" w:hAnsi="Times New Roman" w:cs="Times New Roman"/>
+        </w:rPr>
         <w:t xml:space="preserve"> des solutions </w:t>
       </w:r>
+      <w:proofErr w:type="spellStart"/>
       <w:r>
         <w:rPr>
           <w:rFonts w:ascii="Times New Roman" w:eastAsia="Times New Roman" w:hAnsi="Times New Roman" w:cs="Times New Roman"/>
         </w:rPr>
-        <w:t>existantes:</w:t>
+        <w:t>existantes</w:t>
+      </w:r>
+      <w:proofErr w:type="spellEnd"/>
+      <w:r>
+        <w:rPr>
+          <w:rFonts w:ascii="Times New Roman" w:eastAsia="Times New Roman" w:hAnsi="Times New Roman" w:cs="Times New Roman"/>
+        </w:rPr>
+        <w:t>:</w:t>
       </w:r>
       <w:r>
         <w:rPr>
@@ -2557,55 +2573,7 @@
           <w:szCs w:val="24"/>
           <w:lang w:val="fr-FR"/>
         </w:rPr>
-        <w:t>C</w:t>
-      </w:r>
-      <w:r>
-        <w:rPr>
-          <w:rFonts w:ascii="Times New Roman" w:hAnsi="Times New Roman" w:cs="Times New Roman"/>
-          <w:b w:val="0"/>
-          <w:i w:val="0"/>
-          <w:color w:val="000000" w:themeColor="text1"/>
-          <w:sz w:val="24"/>
-          <w:szCs w:val="24"/>
-          <w:lang w:val="fr-FR"/>
-        </w:rPr>
-        <w:t>hapitre</w:t>
-      </w:r>
-      <w:r>
-        <w:rPr>
-          <w:rFonts w:ascii="Times New Roman" w:hAnsi="Times New Roman" w:cs="Times New Roman"/>
-          <w:b w:val="0"/>
-          <w:i w:val="0"/>
-          <w:color w:val="000000" w:themeColor="text1"/>
-          <w:sz w:val="24"/>
-          <w:szCs w:val="24"/>
-          <w:lang w:val="fr-FR"/>
-        </w:rPr>
-        <w:t xml:space="preserve"> </w:t>
-      </w:r>
-      <w:r>
-        <w:rPr>
-          <w:rFonts w:ascii="Times New Roman" w:hAnsi="Times New Roman" w:cs="Times New Roman"/>
-          <w:b w:val="0"/>
-          <w:i w:val="0"/>
-          <w:color w:val="000000" w:themeColor="text1"/>
-          <w:sz w:val="24"/>
-          <w:szCs w:val="24"/>
-          <w:lang w:val="fr-FR"/>
-        </w:rPr>
-        <w:t>3</w:t>
-      </w:r>
-      <w:r>
-        <w:rPr>
-          <w:rFonts w:ascii="Times New Roman" w:hAnsi="Times New Roman" w:cs="Times New Roman"/>
-          <w:b w:val="0"/>
-          <w:i w:val="0"/>
-          <w:color w:val="000000" w:themeColor="text1"/>
-          <w:sz w:val="24"/>
-          <w:szCs w:val="24"/>
-          <w:lang w:val="fr-FR"/>
-        </w:rPr>
-        <w:t xml:space="preserve"> : </w:t>
+        <w:t xml:space="preserve">Chapitre 3 : </w:t>
       </w:r>
       <w:r>
         <w:rPr>
@@ -3227,13 +3195,13 @@
         <mc:AlternateContent>
           <mc:Choice Requires="wps">
             <w:drawing>
-              <wp:anchor distT="0" distB="0" distL="114300" distR="114300" simplePos="0" relativeHeight="251671552" behindDoc="1" locked="0" layoutInCell="1" allowOverlap="1" wp14:anchorId="7D99349B" wp14:editId="5880D5CE">
+              <wp:anchor distT="0" distB="0" distL="114300" distR="114300" simplePos="0" relativeHeight="251671552" behindDoc="1" locked="0" layoutInCell="1" allowOverlap="1" wp14:anchorId="7D99349B" wp14:editId="1D5E0A5E">
                 <wp:simplePos x="0" y="0"/>
                 <wp:positionH relativeFrom="column">
-                  <wp:posOffset>2696078</wp:posOffset>
+                  <wp:posOffset>2564947</wp:posOffset>
                 </wp:positionH>
                 <wp:positionV relativeFrom="paragraph">
-                  <wp:posOffset>7738531</wp:posOffset>
+                  <wp:posOffset>7417476</wp:posOffset>
                 </wp:positionV>
                 <wp:extent cx="588723" cy="413359"/>
                 <wp:effectExtent l="0" t="0" r="20955" b="25400"/>
@@ -3318,7 +3286,7 @@
           </mc:Choice>
           <mc:Fallback>
             <w:pict>
-              <v:shape w14:anchorId="7D99349B" id="Vague 2" o:spid="_x0000_s1027" type="#_x0000_t64" style="position:absolute;margin-left:212.3pt;margin-top:609.35pt;width:46.35pt;height:32.55pt;z-index:-251644928;visibility:visible;mso-wrap-style:square;mso-width-percent:0;mso-height-percent:0;mso-wrap-distance-left:9pt;mso-wrap-distance-top:0;mso-wrap-distance-right:9pt;mso-wrap-distance-bottom:0;mso-position-horizontal:absolute;mso-position-horizontal-relative:text;mso-position-vertical:absolute;mso-position-vertical-relative:text;mso-width-percent:0;mso-height-percent:0;mso-width-relative:margin;mso-height-relative:margin;v-text-anchor:middle" o:gfxdata="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" adj="883,10669" filled="f" strokecolor="#1f4d78 [1604]" strokeweight="1.5pt">
+              <v:shape w14:anchorId="7D99349B" id="Vague 2" o:spid="_x0000_s1027" type="#_x0000_t64" style="position:absolute;margin-left:201.95pt;margin-top:584.05pt;width:46.35pt;height:32.55pt;z-index:-251644928;visibility:visible;mso-wrap-style:square;mso-width-percent:0;mso-height-percent:0;mso-wrap-distance-left:9pt;mso-wrap-distance-top:0;mso-wrap-distance-right:9pt;mso-wrap-distance-bottom:0;mso-position-horizontal:absolute;mso-position-horizontal-relative:text;mso-position-vertical:absolute;mso-position-vertical-relative:text;mso-width-percent:0;mso-height-percent:0;mso-width-relative:margin;mso-height-relative:margin;v-text-anchor:middle" o:gfxdata="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" adj="883,10669" filled="f" strokecolor="#1f4d78 [1604]" strokeweight="1.5pt">
                 <v:stroke joinstyle="miter"/>
                 <v:textbox>
                   <w:txbxContent>
@@ -3547,12 +3515,173 @@
     </w:p>
     <w:p>
       <w:pPr>
+        <w:jc w:val="center"/>
         <w:rPr>
           <w:rFonts w:ascii="Times New Roman" w:hAnsi="Times New Roman" w:cs="Times New Roman"/>
           <w:sz w:val="28"/>
           <w:szCs w:val="28"/>
         </w:rPr>
       </w:pPr>
+    </w:p>
+    <w:p>
+      <w:pPr>
+        <w:rPr>
+          <w:rFonts w:ascii="Times New Roman" w:hAnsi="Times New Roman" w:cs="Times New Roman"/>
+          <w:sz w:val="28"/>
+          <w:szCs w:val="28"/>
+          <w:lang w:val="fr-FR"/>
+        </w:rPr>
+      </w:pPr>
+      <w:r>
+        <w:rPr>
+          <w:rFonts w:ascii="Times New Roman" w:hAnsi="Times New Roman" w:cs="Times New Roman"/>
+          <w:sz w:val="28"/>
+          <w:szCs w:val="28"/>
+          <w:lang w:val="fr-FR"/>
+        </w:rPr>
+        <w:t>Dans le contexte professionnel actuel, la gestion efficace des projets est un facteur clé de succès pour les entreprises. Avec l'augmentation des tâches à organiser et des personnes à coordonner, il devient essentiel d'utiliser des outils adaptés. Ce projet consiste à développer une application web qui permet de planifier, suivre et gérer les projets au sein d’une entreprise. L’outil est conçu pour être simple, intuitif et adapté aux besoins des petites et moyennes entreprises malgaches. Il vise à améliorer la communication, la productivité et le suivi des activités en temps réel. Ce travail s’inscrit dans une démarche de modernisation des méthodes de travail à travers la digitalisation.</w:t>
+      </w:r>
+    </w:p>
+    <w:p>
+      <w:pPr>
+        <w:rPr>
+          <w:rFonts w:ascii="Times New Roman" w:hAnsi="Times New Roman" w:cs="Times New Roman"/>
+          <w:sz w:val="28"/>
+          <w:szCs w:val="28"/>
+        </w:rPr>
+      </w:pPr>
+      <w:r>
+        <w:rPr>
+          <w:rFonts w:ascii="Times New Roman" w:hAnsi="Times New Roman" w:cs="Times New Roman"/>
+          <w:noProof/>
+          <w:sz w:val="24"/>
+          <w:szCs w:val="24"/>
+        </w:rPr>
+        <mc:AlternateContent>
+          <mc:Choice Requires="wps">
+            <w:drawing>
+              <wp:anchor distT="0" distB="0" distL="114300" distR="114300" simplePos="0" relativeHeight="251677696" behindDoc="1" locked="0" layoutInCell="1" allowOverlap="1" wp14:anchorId="265DAEF5" wp14:editId="274E4310">
+                <wp:simplePos x="0" y="0"/>
+                <wp:positionH relativeFrom="column">
+                  <wp:posOffset>2724225</wp:posOffset>
+                </wp:positionH>
+                <wp:positionV relativeFrom="paragraph">
+                  <wp:posOffset>5820674</wp:posOffset>
+                </wp:positionV>
+                <wp:extent cx="588723" cy="413359"/>
+                <wp:effectExtent l="0" t="0" r="20955" b="25400"/>
+                <wp:wrapNone/>
+                <wp:docPr id="492611681" name="Vague 492611681"/>
+                <wp:cNvGraphicFramePr/>
+                <a:graphic xmlns:a="http://schemas.openxmlformats.org/drawingml/2006/main">
+                  <a:graphicData uri="http://schemas.microsoft.com/office/word/2010/wordprocessingShape">
+                    <wps:wsp>
+                      <wps:cNvSpPr/>
+                      <wps:spPr>
+                        <a:xfrm>
+                          <a:off x="0" y="0"/>
+                          <a:ext cx="588723" cy="413359"/>
+                        </a:xfrm>
+                        <a:prstGeom prst="wave">
+                          <a:avLst>
+                            <a:gd name="adj1" fmla="val 4087"/>
+                            <a:gd name="adj2" fmla="val -607"/>
+                          </a:avLst>
+                        </a:prstGeom>
+                        <a:noFill/>
+                        <a:ln w="19050"/>
+                      </wps:spPr>
+                      <wps:style>
+                        <a:lnRef idx="2">
+                          <a:schemeClr val="accent1">
+                            <a:shade val="50000"/>
+                          </a:schemeClr>
+                        </a:lnRef>
+                        <a:fillRef idx="1">
+                          <a:schemeClr val="accent1"/>
+                        </a:fillRef>
+                        <a:effectRef idx="0">
+                          <a:schemeClr val="accent1"/>
+                        </a:effectRef>
+                        <a:fontRef idx="minor">
+                          <a:schemeClr val="lt1"/>
+                        </a:fontRef>
+                      </wps:style>
+                      <wps:txbx>
+                        <w:txbxContent>
+                          <w:p>
+                            <w:pPr>
+                              <w:jc w:val="center"/>
+                              <w:rPr>
+                                <w:rFonts w:ascii="Times New Roman" w:hAnsi="Times New Roman" w:cs="Times New Roman"/>
+                                <w:color w:val="000000" w:themeColor="text1"/>
+                                <w:sz w:val="40"/>
+                                <w:szCs w:val="40"/>
+                              </w:rPr>
+                            </w:pPr>
+                            <w:r>
+                              <w:rPr>
+                                <w:rFonts w:ascii="Times New Roman" w:hAnsi="Times New Roman" w:cs="Times New Roman"/>
+                                <w:color w:val="000000" w:themeColor="text1"/>
+                                <w:sz w:val="40"/>
+                                <w:szCs w:val="40"/>
+                              </w:rPr>
+                              <w:t>4</w:t>
+                            </w:r>
+                          </w:p>
+                        </w:txbxContent>
+                      </wps:txbx>
+                      <wps:bodyPr rot="0" spcFirstLastPara="0" vertOverflow="overflow" horzOverflow="overflow" vert="horz" wrap="square" lIns="91440" tIns="45720" rIns="91440" bIns="45720" numCol="1" spcCol="0" rtlCol="0" fromWordArt="0" anchor="ctr" anchorCtr="0" forceAA="0" compatLnSpc="1">
+                        <a:prstTxWarp prst="textNoShape">
+                          <a:avLst/>
+                        </a:prstTxWarp>
+                        <a:noAutofit/>
+                      </wps:bodyPr>
+                    </wps:wsp>
+                  </a:graphicData>
+                </a:graphic>
+                <wp14:sizeRelH relativeFrom="margin">
+                  <wp14:pctWidth>0</wp14:pctWidth>
+                </wp14:sizeRelH>
+                <wp14:sizeRelV relativeFrom="margin">
+                  <wp14:pctHeight>0</wp14:pctHeight>
+                </wp14:sizeRelV>
+              </wp:anchor>
+            </w:drawing>
+          </mc:Choice>
+          <mc:Fallback>
+            <w:pict>
+              <v:shape w14:anchorId="265DAEF5" id="Vague 492611681" o:spid="_x0000_s1029" type="#_x0000_t64" style="position:absolute;margin-left:214.5pt;margin-top:458.3pt;width:46.35pt;height:32.55pt;z-index:-251638784;visibility:visible;mso-wrap-style:square;mso-width-percent:0;mso-height-percent:0;mso-wrap-distance-left:9pt;mso-wrap-distance-top:0;mso-wrap-distance-right:9pt;mso-wrap-distance-bottom:0;mso-position-horizontal:absolute;mso-position-horizontal-relative:text;mso-position-vertical:absolute;mso-position-vertical-relative:text;mso-width-percent:0;mso-height-percent:0;mso-width-relative:margin;mso-height-relative:margin;v-text-anchor:middle" o:gfxdata="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" adj="883,10669" filled="f" strokecolor="#1f4d78 [1604]" strokeweight="1.5pt">
+                <v:stroke joinstyle="miter"/>
+                <v:textbox>
+                  <w:txbxContent>
+                    <w:p>
+                      <w:pPr>
+                        <w:jc w:val="center"/>
+                        <w:rPr>
+                          <w:rFonts w:ascii="Times New Roman" w:hAnsi="Times New Roman" w:cs="Times New Roman"/>
+                          <w:color w:val="000000" w:themeColor="text1"/>
+                          <w:sz w:val="40"/>
+                          <w:szCs w:val="40"/>
+                        </w:rPr>
+                      </w:pPr>
+                      <w:r>
+                        <w:rPr>
+                          <w:rFonts w:ascii="Times New Roman" w:hAnsi="Times New Roman" w:cs="Times New Roman"/>
+                          <w:color w:val="000000" w:themeColor="text1"/>
+                          <w:sz w:val="40"/>
+                          <w:szCs w:val="40"/>
+                        </w:rPr>
+                        <w:t>4</w:t>
+                      </w:r>
+                    </w:p>
+                  </w:txbxContent>
+                </v:textbox>
+              </v:shape>
+            </w:pict>
+          </mc:Fallback>
+        </mc:AlternateContent>
+      </w:r>
       <w:r>
         <w:rPr>
           <w:rFonts w:ascii="Times New Roman" w:hAnsi="Times New Roman" w:cs="Times New Roman"/>
@@ -3654,7 +3783,7 @@
           </mc:Choice>
           <mc:Fallback>
             <w:pict>
-              <v:shape w14:anchorId="26013A52" id="Vague 5" o:spid="_x0000_s1029" type="#_x0000_t64" style="position:absolute;margin-left:220.9pt;margin-top:637pt;width:46.35pt;height:32.55pt;z-index:-251640832;visibility:visible;mso-wrap-style:square;mso-width-percent:0;mso-height-percent:0;mso-wrap-distance-left:9pt;mso-wrap-distance-top:0;mso-wrap-distance-right:9pt;mso-wrap-distance-bottom:0;mso-position-horizontal:absolute;mso-position-horizontal-relative:text;mso-position-vertical:absolute;mso-position-vertical-relative:text;mso-width-percent:0;mso-height-percent:0;mso-width-relative:margin;mso-height-relative:margin;v-text-anchor:middle" o:gfxdata="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" adj="883,10669" filled="f" strokecolor="#1f4d78 [1604]" strokeweight="1.5pt">
+              <v:shape w14:anchorId="26013A52" id="Vague 5" o:spid="_x0000_s1030" type="#_x0000_t64" style="position:absolute;margin-left:220.9pt;margin-top:637pt;width:46.35pt;height:32.55pt;z-index:-251640832;visibility:visible;mso-wrap-style:square;mso-width-percent:0;mso-height-percent:0;mso-wrap-distance-left:9pt;mso-wrap-distance-top:0;mso-wrap-distance-right:9pt;mso-wrap-distance-bottom:0;mso-position-horizontal:absolute;mso-position-horizontal-relative:text;mso-position-vertical:absolute;mso-position-vertical-relative:text;mso-width-percent:0;mso-height-percent:0;mso-width-relative:margin;mso-height-relative:margin;v-text-anchor:middle" o:gfxdata="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" adj="883,10669" filled="f" strokecolor="#1f4d78 [1604]" strokeweight="1.5pt">
                 <v:stroke joinstyle="miter"/>
                 <v:textbox>
                   <w:txbxContent>
@@ -3696,7 +3825,6 @@
     </w:p>
     <w:p>
       <w:pPr>
-        <w:jc w:val="center"/>
         <w:rPr>
           <w:rFonts w:ascii="Times New Roman" w:hAnsi="Times New Roman" w:cs="Times New Roman"/>
           <w:sz w:val="28"/>
@@ -5345,7 +5473,6 @@
   <w:style w:type="character" w:default="1" w:styleId="Policepardfaut">
     <w:name w:val="Default Paragraph Font"/>
     <w:uiPriority w:val="1"/>
-    <w:semiHidden/>
     <w:unhideWhenUsed/>
   </w:style>
   <w:style w:type="table" w:default="1" w:styleId="TableauNormal">

</xml_diff>